<commit_message>
Documento: 4 gráficas (EDA y hubs), correcciones de redacción y próximos pasos actualizados
- Figuras 1-3 en el EDA (bandas por subgénero, Zipf con pendiente ajustada, libros por categoría)
- Figura 4 en 7.5 (concentración de hubs antes vs. después)
- "se definió a mano por y" / "Se curó" corregidos; próximo paso de la interfaz (ya hecho) reemplazado

Co-Authored-By: Claude Opus 5.5 <noreply@anthropic.com>
Claude-Session: https://claude.ai/code/session_01As5H2gX3kVScebKcYi5MV9
</commit_message>
<xml_diff>
--- a/docs/Inkriff_Metodologia_y_Resultados.docx
+++ b/docs/Inkriff_Metodologia_y_Resultados.docx
@@ -284,6 +284,7 @@
           </w:tcPr>
           <w:p>
             <w:pPr>
+              <w:keepNext/>
               <w:jc w:val="center"/>
             </w:pPr>
             <w:r>
@@ -312,6 +313,7 @@
           </w:tcPr>
           <w:p>
             <w:pPr>
+              <w:keepNext/>
               <w:jc w:val="center"/>
             </w:pPr>
             <w:r>
@@ -340,6 +342,7 @@
           </w:tcPr>
           <w:p>
             <w:pPr>
+              <w:keepNext/>
               <w:jc w:val="center"/>
             </w:pPr>
             <w:r>
@@ -368,6 +371,7 @@
           </w:tcPr>
           <w:p>
             <w:pPr>
+              <w:keepNext/>
               <w:jc w:val="center"/>
             </w:pPr>
             <w:r>
@@ -404,6 +408,9 @@
             </w:tcMar>
           </w:tcPr>
           <w:p>
+            <w:pPr>
+              <w:keepNext/>
+            </w:pPr>
             <w:r>
               <w:rPr>
                 <w:color w:val="000000"/>
@@ -425,6 +432,9 @@
             </w:tcMar>
           </w:tcPr>
           <w:p>
+            <w:pPr>
+              <w:keepNext/>
+            </w:pPr>
             <w:r>
               <w:rPr>
                 <w:color w:val="000000"/>
@@ -464,6 +474,9 @@
             </w:tcMar>
           </w:tcPr>
           <w:p>
+            <w:pPr>
+              <w:keepNext/>
+            </w:pPr>
             <w:r>
               <w:rPr>
                 <w:color w:val="000000"/>
@@ -485,6 +498,9 @@
             </w:tcMar>
           </w:tcPr>
           <w:p>
+            <w:pPr>
+              <w:keepNext/>
+            </w:pPr>
             <w:r>
               <w:rPr>
                 <w:color w:val="000000"/>
@@ -517,6 +533,9 @@
             </w:tcMar>
           </w:tcPr>
           <w:p>
+            <w:pPr>
+              <w:keepNext/>
+            </w:pPr>
             <w:r>
               <w:rPr>
                 <w:color w:val="000000"/>
@@ -538,6 +557,9 @@
             </w:tcMar>
           </w:tcPr>
           <w:p>
+            <w:pPr>
+              <w:keepNext/>
+            </w:pPr>
             <w:r>
               <w:rPr>
                 <w:color w:val="000000"/>
@@ -559,6 +581,9 @@
             </w:tcMar>
           </w:tcPr>
           <w:p>
+            <w:pPr>
+              <w:keepNext/>
+            </w:pPr>
             <w:r>
               <w:rPr>
                 <w:color w:val="000000"/>
@@ -580,6 +605,9 @@
             </w:tcMar>
           </w:tcPr>
           <w:p>
+            <w:pPr>
+              <w:keepNext/>
+            </w:pPr>
             <w:r>
               <w:rPr>
                 <w:color w:val="000000"/>
@@ -612,6 +640,9 @@
             </w:tcMar>
           </w:tcPr>
           <w:p>
+            <w:pPr>
+              <w:keepNext/>
+            </w:pPr>
             <w:r>
               <w:rPr>
                 <w:color w:val="000000"/>
@@ -633,6 +664,9 @@
             </w:tcMar>
           </w:tcPr>
           <w:p>
+            <w:pPr>
+              <w:keepNext/>
+            </w:pPr>
             <w:r>
               <w:rPr>
                 <w:color w:val="000000"/>
@@ -654,6 +688,9 @@
             </w:tcMar>
           </w:tcPr>
           <w:p>
+            <w:pPr>
+              <w:keepNext/>
+            </w:pPr>
             <w:r>
               <w:rPr>
                 <w:color w:val="000000"/>
@@ -675,6 +712,9 @@
             </w:tcMar>
           </w:tcPr>
           <w:p>
+            <w:pPr>
+              <w:keepNext/>
+            </w:pPr>
             <w:r>
               <w:rPr>
                 <w:color w:val="000000"/>
@@ -707,6 +747,9 @@
             </w:tcMar>
           </w:tcPr>
           <w:p>
+            <w:pPr>
+              <w:keepNext/>
+            </w:pPr>
             <w:r>
               <w:rPr>
                 <w:color w:val="000000"/>
@@ -728,6 +771,9 @@
             </w:tcMar>
           </w:tcPr>
           <w:p>
+            <w:pPr>
+              <w:keepNext/>
+            </w:pPr>
             <w:r>
               <w:rPr>
                 <w:color w:val="000000"/>
@@ -749,6 +795,9 @@
             </w:tcMar>
           </w:tcPr>
           <w:p>
+            <w:pPr>
+              <w:keepNext/>
+            </w:pPr>
             <w:r>
               <w:rPr>
                 <w:color w:val="000000"/>
@@ -770,6 +819,9 @@
             </w:tcMar>
           </w:tcPr>
           <w:p>
+            <w:pPr>
+              <w:keepNext/>
+            </w:pPr>
             <w:r>
               <w:rPr>
                 <w:color w:val="000000"/>
@@ -1220,7 +1272,7 @@
         <w:jc w:val="both"/>
       </w:pPr>
       <w:r>
-        <w:t xml:space="preserve">El universo semilla se definió a mano por y se amplió iterativamente hasta cubrir también las bandas y libros mencionados en los 105 pares de evaluación, verificando programáticamente que no quedara ningún nombre fuera de cobertura:</w:t>
+        <w:t xml:space="preserve">El universo semilla se definió a mano y se amplió iterativamente hasta cubrir también las bandas y libros mencionados en los 105 pares de evaluación, verificando programáticamente que no quedara ningún nombre fuera de cobertura:</w:t>
       </w:r>
     </w:p>
     <w:tbl>
@@ -1580,7 +1632,7 @@
         <w:jc w:val="both"/>
       </w:pPr>
       <w:r>
-        <w:t xml:space="preserve">Se curó a mano 105 pares libro↔banda/subgénero a partir de su propio criterio de fandom (qué banda “le queda” a qué libro y por qué), un proceso independiente de cualquier API o dataset. Estos pares cubren 45 categorías de libro distintas y 37 subgéneros de banda descritos en texto libre, y se usan exclusivamente para evaluar el recomendador — nunca para entrenarlo.</w:t>
+        <w:t xml:space="preserve">Se curaron a mano 105 pares libro↔banda/subgénero a partir de su propio criterio de fandom (qué banda “le queda” a qué libro y por qué), un proceso independiente de cualquier API o dataset. Estos pares cubren 45 categorías de libro distintas y 37 subgéneros de banda descritos en texto libre, y se usan exclusivamente para evaluar el recomendador — nunca para entrenarlo.</w:t>
       </w:r>
     </w:p>
     <w:p>
@@ -1704,6 +1756,7 @@
           </w:tcPr>
           <w:p>
             <w:pPr>
+              <w:keepNext/>
               <w:jc w:val="center"/>
             </w:pPr>
             <w:r>
@@ -1732,6 +1785,7 @@
           </w:tcPr>
           <w:p>
             <w:pPr>
+              <w:keepNext/>
               <w:jc w:val="center"/>
             </w:pPr>
             <w:r>
@@ -1760,6 +1814,7 @@
           </w:tcPr>
           <w:p>
             <w:pPr>
+              <w:keepNext/>
               <w:jc w:val="center"/>
             </w:pPr>
             <w:r>
@@ -1788,6 +1843,7 @@
           </w:tcPr>
           <w:p>
             <w:pPr>
+              <w:keepNext/>
               <w:jc w:val="center"/>
             </w:pPr>
             <w:r>
@@ -1824,6 +1880,9 @@
             </w:tcMar>
           </w:tcPr>
           <w:p>
+            <w:pPr>
+              <w:keepNext/>
+            </w:pPr>
             <w:r>
               <w:rPr>
                 <w:color w:val="000000"/>
@@ -1845,6 +1904,9 @@
             </w:tcMar>
           </w:tcPr>
           <w:p>
+            <w:pPr>
+              <w:keepNext/>
+            </w:pPr>
             <w:r>
               <w:rPr>
                 <w:color w:val="000000"/>
@@ -1866,6 +1928,9 @@
             </w:tcMar>
           </w:tcPr>
           <w:p>
+            <w:pPr>
+              <w:keepNext/>
+            </w:pPr>
             <w:r>
               <w:rPr>
                 <w:color w:val="000000"/>
@@ -1887,6 +1952,9 @@
             </w:tcMar>
           </w:tcPr>
           <w:p>
+            <w:pPr>
+              <w:keepNext/>
+            </w:pPr>
             <w:r>
               <w:rPr>
                 <w:color w:val="000000"/>
@@ -1919,6 +1987,9 @@
             </w:tcMar>
           </w:tcPr>
           <w:p>
+            <w:pPr>
+              <w:keepNext/>
+            </w:pPr>
             <w:r>
               <w:rPr>
                 <w:color w:val="000000"/>
@@ -1940,6 +2011,9 @@
             </w:tcMar>
           </w:tcPr>
           <w:p>
+            <w:pPr>
+              <w:keepNext/>
+            </w:pPr>
             <w:r>
               <w:rPr>
                 <w:color w:val="000000"/>
@@ -1961,6 +2035,9 @@
             </w:tcMar>
           </w:tcPr>
           <w:p>
+            <w:pPr>
+              <w:keepNext/>
+            </w:pPr>
             <w:r>
               <w:rPr>
                 <w:color w:val="000000"/>
@@ -1982,6 +2059,9 @@
             </w:tcMar>
           </w:tcPr>
           <w:p>
+            <w:pPr>
+              <w:keepNext/>
+            </w:pPr>
             <w:r>
               <w:rPr>
                 <w:color w:val="000000"/>
@@ -2014,6 +2094,9 @@
             </w:tcMar>
           </w:tcPr>
           <w:p>
+            <w:pPr>
+              <w:keepNext/>
+            </w:pPr>
             <w:r>
               <w:rPr>
                 <w:color w:val="000000"/>
@@ -2035,6 +2118,9 @@
             </w:tcMar>
           </w:tcPr>
           <w:p>
+            <w:pPr>
+              <w:keepNext/>
+            </w:pPr>
             <w:r>
               <w:rPr>
                 <w:color w:val="000000"/>
@@ -2056,6 +2142,9 @@
             </w:tcMar>
           </w:tcPr>
           <w:p>
+            <w:pPr>
+              <w:keepNext/>
+            </w:pPr>
             <w:r>
               <w:rPr>
                 <w:color w:val="000000"/>
@@ -2077,6 +2166,9 @@
             </w:tcMar>
           </w:tcPr>
           <w:p>
+            <w:pPr>
+              <w:keepNext/>
+            </w:pPr>
             <w:r>
               <w:rPr>
                 <w:color w:val="000000"/>
@@ -2109,6 +2201,9 @@
             </w:tcMar>
           </w:tcPr>
           <w:p>
+            <w:pPr>
+              <w:keepNext/>
+            </w:pPr>
             <w:r>
               <w:rPr>
                 <w:color w:val="000000"/>
@@ -2130,6 +2225,9 @@
             </w:tcMar>
           </w:tcPr>
           <w:p>
+            <w:pPr>
+              <w:keepNext/>
+            </w:pPr>
             <w:r>
               <w:rPr>
                 <w:color w:val="000000"/>
@@ -2151,6 +2249,9 @@
             </w:tcMar>
           </w:tcPr>
           <w:p>
+            <w:pPr>
+              <w:keepNext/>
+            </w:pPr>
             <w:r>
               <w:rPr>
                 <w:color w:val="000000"/>
@@ -2172,6 +2273,9 @@
             </w:tcMar>
           </w:tcPr>
           <w:p>
+            <w:pPr>
+              <w:keepNext/>
+            </w:pPr>
             <w:r>
               <w:rPr>
                 <w:color w:val="000000"/>
@@ -2204,6 +2308,9 @@
             </w:tcMar>
           </w:tcPr>
           <w:p>
+            <w:pPr>
+              <w:keepNext/>
+            </w:pPr>
             <w:r>
               <w:rPr>
                 <w:color w:val="000000"/>
@@ -2225,6 +2332,9 @@
             </w:tcMar>
           </w:tcPr>
           <w:p>
+            <w:pPr>
+              <w:keepNext/>
+            </w:pPr>
             <w:r>
               <w:rPr>
                 <w:color w:val="000000"/>
@@ -2246,6 +2356,9 @@
             </w:tcMar>
           </w:tcPr>
           <w:p>
+            <w:pPr>
+              <w:keepNext/>
+            </w:pPr>
             <w:r>
               <w:rPr>
                 <w:color w:val="000000"/>
@@ -2267,6 +2380,9 @@
             </w:tcMar>
           </w:tcPr>
           <w:p>
+            <w:pPr>
+              <w:keepNext/>
+            </w:pPr>
             <w:r>
               <w:rPr>
                 <w:color w:val="000000"/>
@@ -2299,6 +2415,9 @@
             </w:tcMar>
           </w:tcPr>
           <w:p>
+            <w:pPr>
+              <w:keepNext/>
+            </w:pPr>
             <w:r>
               <w:rPr>
                 <w:color w:val="000000"/>
@@ -2320,6 +2439,9 @@
             </w:tcMar>
           </w:tcPr>
           <w:p>
+            <w:pPr>
+              <w:keepNext/>
+            </w:pPr>
             <w:r>
               <w:rPr>
                 <w:color w:val="000000"/>
@@ -2341,6 +2463,9 @@
             </w:tcMar>
           </w:tcPr>
           <w:p>
+            <w:pPr>
+              <w:keepNext/>
+            </w:pPr>
             <w:r>
               <w:rPr>
                 <w:color w:val="000000"/>
@@ -2362,6 +2487,9 @@
             </w:tcMar>
           </w:tcPr>
           <w:p>
+            <w:pPr>
+              <w:keepNext/>
+            </w:pPr>
             <w:r>
               <w:rPr>
                 <w:color w:val="000000"/>
@@ -3387,6 +3515,136 @@
     </w:p>
     <w:p>
       <w:pPr>
+        <w:spacing w:after="160"/>
+        <w:jc w:val="both"/>
+      </w:pPr>
+      <w:r>
+        <w:t xml:space="preserve">La Figura 1 muestra cómo se reparten las 81 bandas entre los 24 subgéneros semilla: el pop punk (9), el rock alternativo (7) y el metal alternativo (6) son los más representados, mientras que cinco subgéneros tienen una sola banda. Esta distribución desigual importa para el modelado: los subgéneros con pocas bandas tienen menos representantes que puedan aparecer como recomendación.</w:t>
+      </w:r>
+    </w:p>
+    <w:p xmlns:a="http://schemas.openxmlformats.org/drawingml/2006/main" xmlns:pic="http://schemas.openxmlformats.org/drawingml/2006/picture">
+      <w:pPr>
+        <w:keepLines/>
+        <w:spacing w:before="120" w:after="240"/>
+        <w:jc w:val="center"/>
+      </w:pPr>
+      <w:r>
+        <w:drawing>
+          <wp:inline distT="0" distB="0" distL="0" distR="0">
+            <wp:extent cx="5120640" cy="4064000"/>
+            <wp:docPr id="102" name="fig_subgeneros.png" descr="Bandas por subgénero"/>
+            <wp:cNvGraphicFramePr>
+              <a:graphicFrameLocks noChangeAspect="1"/>
+            </wp:cNvGraphicFramePr>
+            <a:graphic>
+              <a:graphicData uri="http://schemas.openxmlformats.org/drawingml/2006/picture">
+                <pic:pic>
+                  <pic:nvPicPr>
+                    <pic:cNvPr id="102" name="fig_subgeneros.png"/>
+                    <pic:cNvPicPr/>
+                  </pic:nvPicPr>
+                  <pic:blipFill>
+                    <a:blip r:embed="rIdImg2"/>
+                    <a:stretch>
+                      <a:fillRect/>
+                    </a:stretch>
+                  </pic:blipFill>
+                  <pic:spPr>
+                    <a:xfrm>
+                      <a:off x="0" y="0"/>
+                      <a:ext cx="5120640" cy="4064000"/>
+                    </a:xfrm>
+                    <a:prstGeom prst="rect">
+                      <a:avLst/>
+                    </a:prstGeom>
+                  </pic:spPr>
+                </pic:pic>
+              </a:graphicData>
+            </a:graphic>
+          </wp:inline>
+        </w:drawing>
+      </w:r>
+      <w:r>
+        <w:br/>
+      </w:r>
+      <w:r>
+        <w:rPr>
+          <w:i/>
+          <w:iCs/>
+          <w:color w:val="555555"/>
+          <w:sz w:val="18"/>
+          <w:szCs w:val="18"/>
+        </w:rPr>
+        <w:t xml:space="preserve">Figura 1. Número de bandas por subgénero semilla (81 bandas, 24 subgéneros).</w:t>
+      </w:r>
+    </w:p>
+    <w:p>
+      <w:pPr>
+        <w:spacing w:after="160"/>
+        <w:jc w:val="both"/>
+      </w:pPr>
+      <w:r>
+        <w:t xml:space="preserve">La Figura 2 contrasta la Ley de Zipf con los datos: en escala logarítmica, la frecuencia cae casi en línea recta conforme aumenta el rango. Para los tags, la pendiente ajustada (−0.93) es muy cercana al −1 de la Ley de Zipf (Zipf, 1949); para las palabras de sinopsis es menos pronunciada (−0.62) y tiene una cola larga: el 64% de las palabras aparece una sola vez. Esa cola de términos raros es la que justifica filtrar el vocabulario con min_df = 2 (sección 6.1).</w:t>
+      </w:r>
+    </w:p>
+    <w:p xmlns:a="http://schemas.openxmlformats.org/drawingml/2006/main" xmlns:pic="http://schemas.openxmlformats.org/drawingml/2006/picture">
+      <w:pPr>
+        <w:keepLines/>
+        <w:spacing w:before="120" w:after="240"/>
+        <w:jc w:val="center"/>
+      </w:pPr>
+      <w:r>
+        <w:drawing>
+          <wp:inline distT="0" distB="0" distL="0" distR="0">
+            <wp:extent cx="5760720" cy="2651760"/>
+            <wp:docPr id="103" name="fig_zipf.png" descr="Ley de Zipf en tags y sinopsis"/>
+            <wp:cNvGraphicFramePr>
+              <a:graphicFrameLocks noChangeAspect="1"/>
+            </wp:cNvGraphicFramePr>
+            <a:graphic>
+              <a:graphicData uri="http://schemas.openxmlformats.org/drawingml/2006/picture">
+                <pic:pic>
+                  <pic:nvPicPr>
+                    <pic:cNvPr id="103" name="fig_zipf.png"/>
+                    <pic:cNvPicPr/>
+                  </pic:nvPicPr>
+                  <pic:blipFill>
+                    <a:blip r:embed="rIdImg3"/>
+                    <a:stretch>
+                      <a:fillRect/>
+                    </a:stretch>
+                  </pic:blipFill>
+                  <pic:spPr>
+                    <a:xfrm>
+                      <a:off x="0" y="0"/>
+                      <a:ext cx="5760720" cy="2651760"/>
+                    </a:xfrm>
+                    <a:prstGeom prst="rect">
+                      <a:avLst/>
+                    </a:prstGeom>
+                  </pic:spPr>
+                </pic:pic>
+              </a:graphicData>
+            </a:graphic>
+          </wp:inline>
+        </w:drawing>
+      </w:r>
+      <w:r>
+        <w:br/>
+      </w:r>
+      <w:r>
+        <w:rPr>
+          <w:i/>
+          <w:iCs/>
+          <w:color w:val="555555"/>
+          <w:sz w:val="18"/>
+          <w:szCs w:val="18"/>
+        </w:rPr>
+        <w:t xml:space="preserve">Figura 2. Frecuencia contra rango en escala log-log para los tags de MusicBrainz y las palabras de sinopsis, con la recta ajustada por mínimos cuadrados.</w:t>
+      </w:r>
+    </w:p>
+    <w:p>
+      <w:pPr>
         <w:pStyle w:val="Heading2"/>
       </w:pPr>
       <w:r>
@@ -3400,6 +3658,71 @@
       </w:pPr>
       <w:r>
         <w:t xml:space="preserve">Sobre los 112 libros, 111 (99.1%) tienen ficha bibliográfica completa (título, autor, año). En esta fase todavía no se contaba con la sinopsis de cada libro — un vacío que se resolvió en la siguiente sección, necesario para poder construir características de texto (TF-IDF, y más adelante embeddings) del lado de los libros.</w:t>
+      </w:r>
+    </w:p>
+    <w:p>
+      <w:pPr>
+        <w:spacing w:after="160"/>
+        <w:jc w:val="both"/>
+      </w:pPr>
+      <w:r>
+        <w:t xml:space="preserve">Del lado de los libros (Figura 3), tres categorías reúnen casi la mitad del catálogo — fantasía oscura/gótica (19), romantasy (18) y alta fantasía/épica (15), 52 de 112 libros (46%) —, lo que refleja el énfasis del universo semilla en la fantasía oscura, romántica y épica.</w:t>
+      </w:r>
+    </w:p>
+    <w:p xmlns:a="http://schemas.openxmlformats.org/drawingml/2006/main" xmlns:pic="http://schemas.openxmlformats.org/drawingml/2006/picture">
+      <w:pPr>
+        <w:keepLines/>
+        <w:spacing w:before="120" w:after="240"/>
+        <w:jc w:val="center"/>
+      </w:pPr>
+      <w:r>
+        <w:drawing>
+          <wp:inline distT="0" distB="0" distL="0" distR="0">
+            <wp:extent cx="5120640" cy="2926080"/>
+            <wp:docPr id="104" name="fig_categorias.png" descr="Libros por categoría"/>
+            <wp:cNvGraphicFramePr>
+              <a:graphicFrameLocks noChangeAspect="1"/>
+            </wp:cNvGraphicFramePr>
+            <a:graphic>
+              <a:graphicData uri="http://schemas.openxmlformats.org/drawingml/2006/picture">
+                <pic:pic>
+                  <pic:nvPicPr>
+                    <pic:cNvPr id="104" name="fig_categorias.png"/>
+                    <pic:cNvPicPr/>
+                  </pic:nvPicPr>
+                  <pic:blipFill>
+                    <a:blip r:embed="rIdImg4"/>
+                    <a:stretch>
+                      <a:fillRect/>
+                    </a:stretch>
+                  </pic:blipFill>
+                  <pic:spPr>
+                    <a:xfrm>
+                      <a:off x="0" y="0"/>
+                      <a:ext cx="5120640" cy="2926080"/>
+                    </a:xfrm>
+                    <a:prstGeom prst="rect">
+                      <a:avLst/>
+                    </a:prstGeom>
+                  </pic:spPr>
+                </pic:pic>
+              </a:graphicData>
+            </a:graphic>
+          </wp:inline>
+        </w:drawing>
+      </w:r>
+      <w:r>
+        <w:br/>
+      </w:r>
+      <w:r>
+        <w:rPr>
+          <w:i/>
+          <w:iCs/>
+          <w:color w:val="555555"/>
+          <w:sz w:val="18"/>
+          <w:szCs w:val="18"/>
+        </w:rPr>
+        <w:t xml:space="preserve">Figura 3. Número de libros por categoría semilla (112 libros, 15 categorías).</w:t>
       </w:r>
     </w:p>
     <w:p>
@@ -3907,6 +4230,7 @@
           </w:tcPr>
           <w:p>
             <w:pPr>
+              <w:keepNext/>
               <w:jc w:val="center"/>
             </w:pPr>
             <w:r>
@@ -3935,6 +4259,7 @@
           </w:tcPr>
           <w:p>
             <w:pPr>
+              <w:keepNext/>
               <w:jc w:val="center"/>
             </w:pPr>
             <w:r>
@@ -3963,6 +4288,7 @@
           </w:tcPr>
           <w:p>
             <w:pPr>
+              <w:keepNext/>
               <w:jc w:val="center"/>
             </w:pPr>
             <w:r>
@@ -3999,6 +4325,9 @@
             </w:tcMar>
           </w:tcPr>
           <w:p>
+            <w:pPr>
+              <w:keepNext/>
+            </w:pPr>
             <w:r>
               <w:rPr>
                 <w:color w:val="000000"/>
@@ -4020,6 +4349,9 @@
             </w:tcMar>
           </w:tcPr>
           <w:p>
+            <w:pPr>
+              <w:keepNext/>
+            </w:pPr>
             <w:r>
               <w:rPr>
                 <w:color w:val="000000"/>
@@ -4041,6 +4373,9 @@
             </w:tcMar>
           </w:tcPr>
           <w:p>
+            <w:pPr>
+              <w:keepNext/>
+            </w:pPr>
             <w:r>
               <w:rPr>
                 <w:color w:val="000000"/>
@@ -4073,6 +4408,9 @@
             </w:tcMar>
           </w:tcPr>
           <w:p>
+            <w:pPr>
+              <w:keepNext/>
+            </w:pPr>
             <w:r>
               <w:rPr>
                 <w:color w:val="000000"/>
@@ -4094,6 +4432,9 @@
             </w:tcMar>
           </w:tcPr>
           <w:p>
+            <w:pPr>
+              <w:keepNext/>
+            </w:pPr>
             <w:r>
               <w:rPr>
                 <w:color w:val="000000"/>
@@ -4115,6 +4456,9 @@
             </w:tcMar>
           </w:tcPr>
           <w:p>
+            <w:pPr>
+              <w:keepNext/>
+            </w:pPr>
             <w:r>
               <w:rPr>
                 <w:color w:val="000000"/>
@@ -4147,6 +4491,9 @@
             </w:tcMar>
           </w:tcPr>
           <w:p>
+            <w:pPr>
+              <w:keepNext/>
+            </w:pPr>
             <w:r>
               <w:rPr>
                 <w:color w:val="000000"/>
@@ -4168,6 +4515,9 @@
             </w:tcMar>
           </w:tcPr>
           <w:p>
+            <w:pPr>
+              <w:keepNext/>
+            </w:pPr>
             <w:r>
               <w:rPr>
                 <w:color w:val="000000"/>
@@ -4189,6 +4539,9 @@
             </w:tcMar>
           </w:tcPr>
           <w:p>
+            <w:pPr>
+              <w:keepNext/>
+            </w:pPr>
             <w:r>
               <w:rPr>
                 <w:color w:val="000000"/>
@@ -4221,6 +4574,9 @@
             </w:tcMar>
           </w:tcPr>
           <w:p>
+            <w:pPr>
+              <w:keepNext/>
+            </w:pPr>
             <w:r>
               <w:rPr>
                 <w:color w:val="000000"/>
@@ -4242,6 +4598,9 @@
             </w:tcMar>
           </w:tcPr>
           <w:p>
+            <w:pPr>
+              <w:keepNext/>
+            </w:pPr>
             <w:r>
               <w:rPr>
                 <w:color w:val="000000"/>
@@ -4263,6 +4622,9 @@
             </w:tcMar>
           </w:tcPr>
           <w:p>
+            <w:pPr>
+              <w:keepNext/>
+            </w:pPr>
             <w:r>
               <w:rPr>
                 <w:color w:val="000000"/>
@@ -4295,6 +4657,9 @@
             </w:tcMar>
           </w:tcPr>
           <w:p>
+            <w:pPr>
+              <w:keepNext/>
+            </w:pPr>
             <w:r>
               <w:rPr>
                 <w:color w:val="000000"/>
@@ -4316,6 +4681,9 @@
             </w:tcMar>
           </w:tcPr>
           <w:p>
+            <w:pPr>
+              <w:keepNext/>
+            </w:pPr>
             <w:r>
               <w:rPr>
                 <w:color w:val="000000"/>
@@ -4337,6 +4705,9 @@
             </w:tcMar>
           </w:tcPr>
           <w:p>
+            <w:pPr>
+              <w:keepNext/>
+            </w:pPr>
             <w:r>
               <w:rPr>
                 <w:color w:val="000000"/>
@@ -4369,6 +4740,9 @@
             </w:tcMar>
           </w:tcPr>
           <w:p>
+            <w:pPr>
+              <w:keepNext/>
+            </w:pPr>
             <w:r>
               <w:rPr>
                 <w:color w:val="000000"/>
@@ -4390,6 +4764,9 @@
             </w:tcMar>
           </w:tcPr>
           <w:p>
+            <w:pPr>
+              <w:keepNext/>
+            </w:pPr>
             <w:r>
               <w:rPr>
                 <w:color w:val="000000"/>
@@ -4411,6 +4788,9 @@
             </w:tcMar>
           </w:tcPr>
           <w:p>
+            <w:pPr>
+              <w:keepNext/>
+            </w:pPr>
             <w:r>
               <w:rPr>
                 <w:color w:val="000000"/>
@@ -4443,6 +4823,9 @@
             </w:tcMar>
           </w:tcPr>
           <w:p>
+            <w:pPr>
+              <w:keepNext/>
+            </w:pPr>
             <w:r>
               <w:rPr>
                 <w:color w:val="000000"/>
@@ -4464,6 +4847,9 @@
             </w:tcMar>
           </w:tcPr>
           <w:p>
+            <w:pPr>
+              <w:keepNext/>
+            </w:pPr>
             <w:r>
               <w:rPr>
                 <w:color w:val="000000"/>
@@ -4485,6 +4871,9 @@
             </w:tcMar>
           </w:tcPr>
           <w:p>
+            <w:pPr>
+              <w:keepNext/>
+            </w:pPr>
             <w:r>
               <w:rPr>
                 <w:color w:val="000000"/>
@@ -4517,6 +4906,9 @@
             </w:tcMar>
           </w:tcPr>
           <w:p>
+            <w:pPr>
+              <w:keepNext/>
+            </w:pPr>
             <w:r>
               <w:rPr>
                 <w:color w:val="000000"/>
@@ -4538,6 +4930,9 @@
             </w:tcMar>
           </w:tcPr>
           <w:p>
+            <w:pPr>
+              <w:keepNext/>
+            </w:pPr>
             <w:r>
               <w:rPr>
                 <w:color w:val="000000"/>
@@ -4559,6 +4954,9 @@
             </w:tcMar>
           </w:tcPr>
           <w:p>
+            <w:pPr>
+              <w:keepNext/>
+            </w:pPr>
             <w:r>
               <w:rPr>
                 <w:color w:val="000000"/>
@@ -4591,6 +4989,9 @@
             </w:tcMar>
           </w:tcPr>
           <w:p>
+            <w:pPr>
+              <w:keepNext/>
+            </w:pPr>
             <w:r>
               <w:rPr>
                 <w:color w:val="000000"/>
@@ -4612,6 +5013,9 @@
             </w:tcMar>
           </w:tcPr>
           <w:p>
+            <w:pPr>
+              <w:keepNext/>
+            </w:pPr>
             <w:r>
               <w:rPr>
                 <w:color w:val="000000"/>
@@ -4633,6 +5037,9 @@
             </w:tcMar>
           </w:tcPr>
           <w:p>
+            <w:pPr>
+              <w:keepNext/>
+            </w:pPr>
             <w:r>
               <w:rPr>
                 <w:color w:val="000000"/>
@@ -6721,6 +7128,71 @@
         <w:jc w:val="both"/>
       </w:pPr>
       <w:r>
+        <w:t xml:space="preserve">La Figura 4 hace visible ese cambio en los libros más repetidos. Con los embeddings sin corregir, El Señor de los Anillos aparecía en el top-5 de 41 bandas; tras la corrección, en 12. La guerra de la amapola y El priorato del naranjo bajan a cero porque no tienen sinopsis y se excluyeron como candidatos. Al mismo tiempo, libros que antes casi no aparecían, como Babel (6 → 14) o Heartstopper (0 → 14), ganan presencia: la corrección reparte las recomendaciones en lugar de concentrarlas.</w:t>
+      </w:r>
+    </w:p>
+    <w:p xmlns:a="http://schemas.openxmlformats.org/drawingml/2006/main" xmlns:pic="http://schemas.openxmlformats.org/drawingml/2006/picture">
+      <w:pPr>
+        <w:keepLines/>
+        <w:spacing w:before="120" w:after="240"/>
+        <w:jc w:val="center"/>
+      </w:pPr>
+      <w:r>
+        <w:drawing>
+          <wp:inline distT="0" distB="0" distL="0" distR="0">
+            <wp:extent cx="5486400" cy="3135085"/>
+            <wp:docPr id="105" name="fig_hubs.png" descr="Concentración de hubs antes y después"/>
+            <wp:cNvGraphicFramePr>
+              <a:graphicFrameLocks noChangeAspect="1"/>
+            </wp:cNvGraphicFramePr>
+            <a:graphic>
+              <a:graphicData uri="http://schemas.openxmlformats.org/drawingml/2006/picture">
+                <pic:pic>
+                  <pic:nvPicPr>
+                    <pic:cNvPr id="105" name="fig_hubs.png"/>
+                    <pic:cNvPicPr/>
+                  </pic:nvPicPr>
+                  <pic:blipFill>
+                    <a:blip r:embed="rIdImg5"/>
+                    <a:stretch>
+                      <a:fillRect/>
+                    </a:stretch>
+                  </pic:blipFill>
+                  <pic:spPr>
+                    <a:xfrm>
+                      <a:off x="0" y="0"/>
+                      <a:ext cx="5486400" cy="3135085"/>
+                    </a:xfrm>
+                    <a:prstGeom prst="rect">
+                      <a:avLst/>
+                    </a:prstGeom>
+                  </pic:spPr>
+                </pic:pic>
+              </a:graphicData>
+            </a:graphic>
+          </wp:inline>
+        </w:drawing>
+      </w:r>
+      <w:r>
+        <w:br/>
+      </w:r>
+      <w:r>
+        <w:rPr>
+          <w:i/>
+          <w:iCs/>
+          <w:color w:val="555555"/>
+          <w:sz w:val="18"/>
+          <w:szCs w:val="18"/>
+        </w:rPr>
+        <w:t xml:space="preserve">Figura 4. Número de bandas (de 81) que incluyen cada libro en su top-5, antes y después de la corrección de hubness. Se muestran los libros con mayor presencia en alguno de los dos escenarios.</w:t>
+      </w:r>
+    </w:p>
+    <w:p>
+      <w:pPr>
+        <w:spacing w:after="160"/>
+        <w:jc w:val="both"/>
+      </w:pPr>
+      <w:r>
         <w:t xml:space="preserve">El notebook elige automáticamente el enfoque final comparando el MRR combinado de banda y libro entre los tres enfoques; en la corrida real, el enfoque con corrección de hubness ganó también por esta métrica (MRR combinado 0.160 vs. 0.133 sin corregir), por lo que es el que se usó para generar las recomendaciones finales.</w:t>
       </w:r>
     </w:p>
@@ -7213,19 +7685,20 @@
         <w:jc w:val="both"/>
       </w:pPr>
       <w:r>
-        <w:t xml:space="preserve">La Figura 1 muestra qué ocurre desde que el usuario escribe un mensaje hasta que recibe sus recomendaciones. La rama “Sí” usa las recomendaciones precalculadas y evaluadas en la sección 7; la rama “No” busca los datos del ítem en vivo en MusicBrainz u Open Library, calcula su embedding con el mismo modelo y aplica la misma corrección de hubness, de modo que una búsqueda en vivo es comparable con el catálogo.</w:t>
+        <w:t xml:space="preserve">La Figura 5 muestra qué ocurre desde que el usuario escribe un mensaje hasta que recibe sus recomendaciones. La rama “Sí” usa las recomendaciones precalculadas y evaluadas en la sección 7; la rama “No” busca los datos del ítem en vivo en MusicBrainz u Open Library, calcula su embedding con el mismo modelo y aplica la misma corrección de hubness, de modo que una búsqueda en vivo es comparable con el catálogo.</w:t>
       </w:r>
     </w:p>
     <w:p xmlns:a="http://schemas.openxmlformats.org/drawingml/2006/main" xmlns:pic="http://schemas.openxmlformats.org/drawingml/2006/picture">
       <w:pPr>
-        <w:spacing w:before="120" w:after="60"/>
+        <w:keepLines/>
+        <w:spacing w:before="120" w:after="240"/>
         <w:jc w:val="center"/>
       </w:pPr>
       <w:r>
         <w:drawing>
           <wp:inline distT="0" distB="0" distL="0" distR="0">
             <wp:extent cx="5760720" cy="3157190"/>
-            <wp:docPr id="101" name="flujo_inferencia.png" descr="Flujo de inferencia de Inkriff"/>
+            <wp:docPr id="101" name="flujo_inferencia.png" descr="Flujo de inferencia"/>
             <wp:cNvGraphicFramePr>
               <a:graphicFrameLocks noChangeAspect="1"/>
             </wp:cNvGraphicFramePr>
@@ -7257,11 +7730,9 @@
           </wp:inline>
         </w:drawing>
       </w:r>
-    </w:p>
-    <w:p>
-      <w:pPr>
-        <w:spacing w:after="240"/>
-      </w:pPr>
+      <w:r>
+        <w:br/>
+      </w:r>
       <w:r>
         <w:rPr>
           <w:i/>
@@ -7270,7 +7741,7 @@
           <w:sz w:val="18"/>
           <w:szCs w:val="18"/>
         </w:rPr>
-        <w:t xml:space="preserve">Figura 1. Flujo de inferencia de Inkriff, del mensaje del usuario a las tarjetas de recomendación.</w:t>
+        <w:t xml:space="preserve">Figura 5. Flujo de inferencia de Inkriff, del mensaje del usuario a las tarjetas de recomendación.</w:t>
       </w:r>
     </w:p>
     <w:p>
@@ -7336,6 +7807,7 @@
           </w:tcPr>
           <w:p>
             <w:pPr>
+              <w:keepNext/>
               <w:jc w:val="center"/>
             </w:pPr>
             <w:r>
@@ -7364,6 +7836,7 @@
           </w:tcPr>
           <w:p>
             <w:pPr>
+              <w:keepNext/>
               <w:jc w:val="center"/>
             </w:pPr>
             <w:r>
@@ -7400,6 +7873,9 @@
             </w:tcMar>
           </w:tcPr>
           <w:p>
+            <w:pPr>
+              <w:keepNext/>
+            </w:pPr>
             <w:r>
               <w:rPr>
                 <w:color w:val="000000"/>
@@ -7421,6 +7897,9 @@
             </w:tcMar>
           </w:tcPr>
           <w:p>
+            <w:pPr>
+              <w:keepNext/>
+            </w:pPr>
             <w:r>
               <w:rPr>
                 <w:color w:val="000000"/>
@@ -7453,6 +7932,9 @@
             </w:tcMar>
           </w:tcPr>
           <w:p>
+            <w:pPr>
+              <w:keepNext/>
+            </w:pPr>
             <w:r>
               <w:rPr>
                 <w:color w:val="000000"/>
@@ -7474,6 +7956,9 @@
             </w:tcMar>
           </w:tcPr>
           <w:p>
+            <w:pPr>
+              <w:keepNext/>
+            </w:pPr>
             <w:r>
               <w:rPr>
                 <w:color w:val="000000"/>
@@ -7506,6 +7991,9 @@
             </w:tcMar>
           </w:tcPr>
           <w:p>
+            <w:pPr>
+              <w:keepNext/>
+            </w:pPr>
             <w:r>
               <w:rPr>
                 <w:color w:val="000000"/>
@@ -7527,6 +8015,9 @@
             </w:tcMar>
           </w:tcPr>
           <w:p>
+            <w:pPr>
+              <w:keepNext/>
+            </w:pPr>
             <w:r>
               <w:rPr>
                 <w:color w:val="000000"/>
@@ -7559,6 +8050,9 @@
             </w:tcMar>
           </w:tcPr>
           <w:p>
+            <w:pPr>
+              <w:keepNext/>
+            </w:pPr>
             <w:r>
               <w:rPr>
                 <w:color w:val="000000"/>
@@ -7580,6 +8074,9 @@
             </w:tcMar>
           </w:tcPr>
           <w:p>
+            <w:pPr>
+              <w:keepNext/>
+            </w:pPr>
             <w:r>
               <w:rPr>
                 <w:color w:val="000000"/>
@@ -7974,7 +8471,14 @@
         <w:jc w:val="both"/>
       </w:pPr>
       <w:r>
-        <w:t xml:space="preserve">Pipeline/interfaz de uso: una interfaz (Gradio) que reciba un libro o una banda y muestre las recomendaciones del lado contrario, consumiendo directamente los CSVs del modelo ya generados.</w:t>
+        <w:rPr>
+          <w:b/>
+          <w:bCs/>
+        </w:rPr>
+        <w:t xml:space="preserve">Alojamiento permanente de la interfaz:</w:t>
+      </w:r>
+      <w:r>
+        <w:t xml:space="preserve"> hoy corre en Google Colab con un enlace temporal de Gradio; un servidor propio permitiría que el enlace no caduque y que las sugerencias de la comunidad se conserven entre sesiones.</w:t>
       </w:r>
     </w:p>
     <w:p>

</xml_diff>

<commit_message>
Notebook de figuras del documento: genera las Figuras 1-5 y verifica las cifras citadas
- scripts/build_notebook_figuras.py -> notebooks/inkriff_figuras_documento.ipynb
  (corre en Colab sin subir archivos: lee los datos de GitHub o del repo local)
- 13 asserts con las cifras que cita el documento (81/24, 3,593 palabras, 41 -> 12, etc.)
- docs/figuras/: PNG generados por el notebook; el .docx usa exactamente esos archivos
- make figuras; README, AGENTS (trampa 4.19) y .gitignore

Co-Authored-By: Claude Opus 5.5 <noreply@anthropic.com>
Claude-Session: https://claude.ai/code/session_01As5H2gX3kVScebKcYi5MV9
</commit_message>
<xml_diff>
--- a/docs/Inkriff_Metodologia_y_Resultados.docx
+++ b/docs/Inkriff_Metodologia_y_Resultados.docx
@@ -3531,7 +3531,7 @@
       <w:r>
         <w:drawing>
           <wp:inline distT="0" distB="0" distL="0" distR="0">
-            <wp:extent cx="5120640" cy="4064000"/>
+            <wp:extent cx="5120640" cy="4044969"/>
             <wp:docPr id="102" name="fig_subgeneros.png" descr="Bandas por subgénero"/>
             <wp:cNvGraphicFramePr>
               <a:graphicFrameLocks noChangeAspect="1"/>
@@ -3552,7 +3552,7 @@
                   <pic:spPr>
                     <a:xfrm>
                       <a:off x="0" y="0"/>
-                      <a:ext cx="5120640" cy="4064000"/>
+                      <a:ext cx="5120640" cy="4044969"/>
                     </a:xfrm>
                     <a:prstGeom prst="rect">
                       <a:avLst/>
@@ -3596,7 +3596,7 @@
       <w:r>
         <w:drawing>
           <wp:inline distT="0" distB="0" distL="0" distR="0">
-            <wp:extent cx="5760720" cy="2651760"/>
+            <wp:extent cx="5760720" cy="2570621"/>
             <wp:docPr id="103" name="fig_zipf.png" descr="Ley de Zipf en tags y sinopsis"/>
             <wp:cNvGraphicFramePr>
               <a:graphicFrameLocks noChangeAspect="1"/>
@@ -3617,7 +3617,7 @@
                   <pic:spPr>
                     <a:xfrm>
                       <a:off x="0" y="0"/>
-                      <a:ext cx="5760720" cy="2651760"/>
+                      <a:ext cx="5760720" cy="2570621"/>
                     </a:xfrm>
                     <a:prstGeom prst="rect">
                       <a:avLst/>
@@ -3678,7 +3678,7 @@
       <w:r>
         <w:drawing>
           <wp:inline distT="0" distB="0" distL="0" distR="0">
-            <wp:extent cx="5120640" cy="2926080"/>
+            <wp:extent cx="5120640" cy="2898828"/>
             <wp:docPr id="104" name="fig_categorias.png" descr="Libros por categoría"/>
             <wp:cNvGraphicFramePr>
               <a:graphicFrameLocks noChangeAspect="1"/>
@@ -3699,7 +3699,7 @@
                   <pic:spPr>
                     <a:xfrm>
                       <a:off x="0" y="0"/>
-                      <a:ext cx="5120640" cy="2926080"/>
+                      <a:ext cx="5120640" cy="2898828"/>
                     </a:xfrm>
                     <a:prstGeom prst="rect">
                       <a:avLst/>
@@ -7140,7 +7140,7 @@
       <w:r>
         <w:drawing>
           <wp:inline distT="0" distB="0" distL="0" distR="0">
-            <wp:extent cx="5486400" cy="3135085"/>
+            <wp:extent cx="5486400" cy="3105887"/>
             <wp:docPr id="105" name="fig_hubs.png" descr="Concentración de hubs antes y después"/>
             <wp:cNvGraphicFramePr>
               <a:graphicFrameLocks noChangeAspect="1"/>
@@ -7161,7 +7161,7 @@
                   <pic:spPr>
                     <a:xfrm>
                       <a:off x="0" y="0"/>
-                      <a:ext cx="5486400" cy="3135085"/>
+                      <a:ext cx="5486400" cy="3105887"/>
                     </a:xfrm>
                     <a:prstGeom prst="rect">
                       <a:avLst/>

</xml_diff>

<commit_message>
Documento: sección 8.5 con pies (Figuras 6-11), explicación de cada captura y capturas reales del chat
Co-Authored-By: Claude Opus 5.5 <noreply@anthropic.com>
Claude-Session: https://claude.ai/code/session_01As5H2gX3kVScebKcYi5MV9
</commit_message>
<xml_diff>
--- a/docs/Inkriff_Metodologia_y_Resultados.docx
+++ b/docs/Inkriff_Metodologia_y_Resultados.docx
@@ -8341,48 +8341,49 @@
     </w:p>
     <w:p>
       <w:pPr>
-        <w:spacing w:after="80"/>
-        <w:jc w:val="both"/>
+        <w:spacing w:after="160"/>
+        <w:jc w:val="both"/>
+      </w:pPr>
+      <w:r>
+        <w:t xml:space="preserve">Las Figuras 6 a 11 muestran la aplicación final en funcionamiento (Gradio, ejecutada desde Google Colab), en el orden de sus pestañas.</w:t>
+      </w:r>
+    </w:p>
+    <w:p>
+      <w:pPr>
+        <w:keepNext/>
+        <w:spacing w:after="160"/>
+        <w:jc w:val="both"/>
+      </w:pPr>
+      <w:r>
         <w:rPr>
           <w:b/>
           <w:bCs/>
         </w:rPr>
-      </w:pPr>
-      <w:r>
-        <w:rPr>
-          <w:b/>
-          <w:bCs/>
-        </w:rPr>
-        <w:t>Inicio</w:t>
-      </w:r>
-    </w:p>
-    <w:p>
-      <w:pPr>
-        <w:spacing w:after="80"/>
+        <w:t xml:space="preserve">Inicio.</w:t>
+      </w:r>
+      <w:r>
+        <w:t xml:space="preserve"> Presenta el proyecto con las cifras del catálogo (81 bandas, 112 libros, 24 subgéneros y 15 categorías), las “Parejas destacadas” — cada una con botones para comprar el libro y escuchar la banda — y un resumen de cómo funciona el sistema.</w:t>
+      </w:r>
+    </w:p>
+    <w:p xmlns:a="http://schemas.openxmlformats.org/drawingml/2006/main" xmlns:pic="http://schemas.openxmlformats.org/drawingml/2006/picture">
+      <w:pPr>
+        <w:keepLines/>
+        <w:spacing w:before="120" w:after="240"/>
         <w:jc w:val="center"/>
-        <w:rPr>
-          <w:b/>
-          <w:bCs/>
-        </w:rPr>
-      </w:pPr>
-      <w:r>
-        <w:rPr>
-          <w:b/>
-          <w:bCs/>
-        </w:rPr>
+      </w:pPr>
+      <w:r>
         <w:drawing>
-          <wp:inline distT="0" distB="0" distL="0" distR="0" wp14:anchorId="3706F637" wp14:editId="21206317">
+          <wp:inline distT="0" distB="0" distL="0" distR="0">
             <wp:extent cx="5982218" cy="6919560"/>
-            <wp:effectExtent l="0" t="0" r="0" b="0"/>
-            <wp:docPr id="1898598739" name="Picture 1"/>
+            <wp:docPr id="2123414802" name="inicio.png" descr="Figura 6. Pestaña Inicio: cifras del catálogo, “Parejas destacadas” y resumen de cómo funciona Inkriff."/>
             <wp:cNvGraphicFramePr>
-              <a:graphicFrameLocks xmlns:a="http://schemas.openxmlformats.org/drawingml/2006/main" noChangeAspect="1"/>
+              <a:graphicFrameLocks noChangeAspect="1"/>
             </wp:cNvGraphicFramePr>
-            <a:graphic xmlns:a="http://schemas.openxmlformats.org/drawingml/2006/main">
+            <a:graphic>
               <a:graphicData uri="http://schemas.openxmlformats.org/drawingml/2006/picture">
-                <pic:pic xmlns:pic="http://schemas.openxmlformats.org/drawingml/2006/picture">
+                <pic:pic>
                   <pic:nvPicPr>
-                    <pic:cNvPr id="1898598739" name=""/>
+                    <pic:cNvPr id="2123414802" name="inicio.png"/>
                     <pic:cNvPicPr/>
                   </pic:nvPicPr>
                   <pic:blipFill>
@@ -8406,109 +8407,80 @@
           </wp:inline>
         </w:drawing>
       </w:r>
-    </w:p>
-    <w:p>
-      <w:pPr>
-        <w:spacing w:after="80"/>
+      <w:r>
+        <w:br/>
+      </w:r>
+      <w:r>
+        <w:rPr>
+          <w:i/>
+          <w:iCs/>
+          <w:color w:val="555555"/>
+          <w:sz w:val="18"/>
+          <w:szCs w:val="18"/>
+        </w:rPr>
+        <w:t xml:space="preserve">Figura 6. Pestaña Inicio: cifras del catálogo, “Parejas destacadas” y resumen de cómo funciona Inkriff.</w:t>
+      </w:r>
+    </w:p>
+    <w:p>
+      <w:pPr>
+        <w:keepNext/>
+        <w:spacing w:after="160"/>
+        <w:jc w:val="both"/>
+      </w:pPr>
+      <w:r>
         <w:rPr>
           <w:b/>
           <w:bCs/>
         </w:rPr>
-      </w:pPr>
-    </w:p>
-    <w:p>
-      <w:pPr>
-        <w:spacing w:after="80"/>
+        <w:t xml:space="preserve">Chat: de un libro a bandas.</w:t>
+      </w:r>
+      <w:r>
+        <w:t xml:space="preserve"> Tras un saludo, la usuaria pregunta qué escuchar mientras lee </w:t>
+      </w:r>
+      <w:r>
+        <w:rPr>
+          <w:i/>
+          <w:iCs/>
+        </w:rPr>
+        <w:t xml:space="preserve">Novia</w:t>
+      </w:r>
+      <w:r>
+        <w:t xml:space="preserve"> de Ali Hazelwood, un libro que </w:t>
+      </w:r>
+      <w:r>
         <w:rPr>
           <w:b/>
           <w:bCs/>
         </w:rPr>
-      </w:pPr>
-    </w:p>
-    <w:p>
-      <w:pPr>
-        <w:spacing w:after="80"/>
-        <w:rPr>
-          <w:b/>
-          <w:bCs/>
-        </w:rPr>
-      </w:pPr>
-    </w:p>
-    <w:p>
-      <w:pPr>
-        <w:spacing w:after="80"/>
-        <w:rPr>
-          <w:b/>
-          <w:bCs/>
-        </w:rPr>
-      </w:pPr>
-    </w:p>
-    <w:p>
-      <w:pPr>
-        <w:spacing w:after="80"/>
-        <w:rPr>
-          <w:b/>
-          <w:bCs/>
-        </w:rPr>
-      </w:pPr>
-    </w:p>
-    <w:p>
-      <w:pPr>
-        <w:spacing w:after="80"/>
-        <w:rPr>
-          <w:b/>
-          <w:bCs/>
-        </w:rPr>
-      </w:pPr>
-      <w:r>
-        <w:rPr>
-          <w:b/>
-          <w:bCs/>
-        </w:rPr>
-        <w:lastRenderedPageBreak/>
-        <w:t>Chat</w:t>
-      </w:r>
-    </w:p>
-    <w:p>
-      <w:pPr>
-        <w:spacing w:after="80"/>
-        <w:rPr>
-          <w:b/>
-          <w:bCs/>
-        </w:rPr>
-      </w:pPr>
-    </w:p>
-    <w:p>
-      <w:pPr>
-        <w:spacing w:after="80"/>
+        <w:t xml:space="preserve">no está en el catálogo</w:t>
+      </w:r>
+      <w:r>
+        <w:t xml:space="preserve">. La app lo buscó en vivo y devolvió cinco bandas (The Pretty Reckless, Lacuna Coil, Epica, Korpiklaani y Nightwish), con una explicación en lenguaje natural y el botón “Escucha la banda” en cada tarjeta. Corresponde a la rama “No” del flujo de la Figura 5.</w:t>
+      </w:r>
+    </w:p>
+    <w:p xmlns:a="http://schemas.openxmlformats.org/drawingml/2006/main" xmlns:pic="http://schemas.openxmlformats.org/drawingml/2006/picture">
+      <w:pPr>
+        <w:keepLines/>
+        <w:spacing w:before="120" w:after="240"/>
         <w:jc w:val="center"/>
-        <w:rPr>
-          <w:b/>
-          <w:bCs/>
-        </w:rPr>
-      </w:pPr>
-      <w:r>
-        <w:rPr>
-          <w:b/>
-          <w:bCs/>
-        </w:rPr>
+      </w:pPr>
+      <w:r>
         <w:drawing>
-          <wp:inline distT="0" distB="0" distL="0" distR="0" wp14:anchorId="3017E254" wp14:editId="2188959F">
-            <wp:extent cx="5077066" cy="4140000"/>
-            <wp:effectExtent l="0" t="0" r="0" b="0"/>
-            <wp:docPr id="359768138" name="Picture 1"/>
+          <wp:inline distT="0" distB="0" distL="0" distR="0">
+            <wp:extent cx="5120640" cy="4104042"/>
+            <wp:docPr id="2123414803" name="chat_libro_a_bandas.png" descr="Figura 7. Chat: recomendación de bandas para un libro fuera del catálogo (búsqueda en vivo)."/>
             <wp:cNvGraphicFramePr>
-              <a:graphicFrameLocks xmlns:a="http://schemas.openxmlformats.org/drawingml/2006/main" noChangeAspect="1"/>
+              <a:graphicFrameLocks noChangeAspect="1"/>
             </wp:cNvGraphicFramePr>
-            <a:graphic xmlns:a="http://schemas.openxmlformats.org/drawingml/2006/main">
+            <a:graphic>
               <a:graphicData uri="http://schemas.openxmlformats.org/drawingml/2006/picture">
-                <pic:pic xmlns:pic="http://schemas.openxmlformats.org/drawingml/2006/picture">
+                <pic:pic>
                   <pic:nvPicPr>
-                    <pic:cNvPr id="359768138" name=""/>
+                    <pic:cNvPr id="2123414803" name="chat_libro_a_bandas.png"/>
                     <pic:cNvPicPr/>
                   </pic:nvPicPr>
                   <pic:blipFill>
-                    <a:blip r:embed="rId11"/>
+                    <a:blip r:embed="rIdChat1"/>
                     <a:stretch>
                       <a:fillRect/>
                     </a:stretch>
@@ -8516,7 +8488,7 @@
                   <pic:spPr>
                     <a:xfrm>
                       <a:off x="0" y="0"/>
-                      <a:ext cx="5077066" cy="4140000"/>
+                      <a:ext cx="5120640" cy="4104042"/>
                     </a:xfrm>
                     <a:prstGeom prst="rect">
                       <a:avLst/>
@@ -8528,56 +8500,275 @@
           </wp:inline>
         </w:drawing>
       </w:r>
-    </w:p>
-    <w:p>
-      <w:pPr>
+      <w:r>
+        <w:br/>
+      </w:r>
+      <w:r>
+        <w:rPr>
+          <w:i/>
+          <w:iCs/>
+          <w:color w:val="555555"/>
+          <w:sz w:val="18"/>
+          <w:szCs w:val="18"/>
+        </w:rPr>
+        <w:t xml:space="preserve">Figura 7. Chat: recomendación de bandas para un libro fuera del catálogo (búsqueda en vivo).</w:t>
+      </w:r>
+    </w:p>
+    <w:p>
+      <w:pPr>
+        <w:keepNext/>
+        <w:spacing w:after="160"/>
+        <w:jc w:val="both"/>
+      </w:pPr>
+      <w:r>
         <w:rPr>
           <w:b/>
           <w:bCs/>
         </w:rPr>
+        <w:t xml:space="preserve">Chat: pregunta de seguimiento.</w:t>
+      </w:r>
+      <w:r>
+        <w:t xml:space="preserve"> La usuaria pide “otros libros” para Epica sin repetir el contexto. El chat interpreta la petición como la siguiente página de recomendaciones y muestra el top 6–10 de Epica (Percy Jackson, The Hazel Wood, The Once and Future Witches, El castillo ambulante…), que coincide con la matriz corregida por hubness. Cada libro trae portada, autor, año, categoría, sinopsis desplegable y enlaces de compra en cinco tiendas.</w:t>
+      </w:r>
+    </w:p>
+    <w:p xmlns:a="http://schemas.openxmlformats.org/drawingml/2006/main" xmlns:pic="http://schemas.openxmlformats.org/drawingml/2006/picture">
+      <w:pPr>
+        <w:keepLines/>
+        <w:spacing w:before="120" w:after="240"/>
+        <w:jc w:val="center"/>
+      </w:pPr>
+      <w:r>
+        <w:drawing>
+          <wp:inline distT="0" distB="0" distL="0" distR="0">
+            <wp:extent cx="5120640" cy="4117145"/>
+            <wp:docPr id="2123414804" name="chat_seguimiento.png" descr="Figura 8. Chat: pregunta de seguimiento con memoria de la conversación y paginación (top 6–10)."/>
+            <wp:cNvGraphicFramePr>
+              <a:graphicFrameLocks noChangeAspect="1"/>
+            </wp:cNvGraphicFramePr>
+            <a:graphic>
+              <a:graphicData uri="http://schemas.openxmlformats.org/drawingml/2006/picture">
+                <pic:pic>
+                  <pic:nvPicPr>
+                    <pic:cNvPr id="2123414804" name="chat_seguimiento.png"/>
+                    <pic:cNvPicPr/>
+                  </pic:nvPicPr>
+                  <pic:blipFill>
+                    <a:blip r:embed="rIdChat2"/>
+                    <a:stretch>
+                      <a:fillRect/>
+                    </a:stretch>
+                  </pic:blipFill>
+                  <pic:spPr>
+                    <a:xfrm>
+                      <a:off x="0" y="0"/>
+                      <a:ext cx="5120640" cy="4117145"/>
+                    </a:xfrm>
+                    <a:prstGeom prst="rect">
+                      <a:avLst/>
+                    </a:prstGeom>
+                  </pic:spPr>
+                </pic:pic>
+              </a:graphicData>
+            </a:graphic>
+          </wp:inline>
+        </w:drawing>
+      </w:r>
+      <w:r>
+        <w:br/>
+      </w:r>
+      <w:r>
+        <w:rPr>
+          <w:i/>
+          <w:iCs/>
+          <w:color w:val="555555"/>
+          <w:sz w:val="18"/>
+          <w:szCs w:val="18"/>
+        </w:rPr>
+        <w:t xml:space="preserve">Figura 8. Chat: pregunta de seguimiento con memoria de la conversación y paginación (top 6–10).</w:t>
+      </w:r>
+    </w:p>
+    <w:p>
+      <w:pPr>
+        <w:keepNext/>
+        <w:spacing w:after="160"/>
+        <w:jc w:val="both"/>
       </w:pPr>
       <w:r>
         <w:rPr>
           <w:b/>
           <w:bCs/>
         </w:rPr>
-        <w:t>Sugerir</w:t>
-      </w:r>
-    </w:p>
-    <w:p>
-      <w:pPr>
+        <w:t xml:space="preserve">Catálogo de bandas.</w:t>
+      </w:r>
+      <w:r>
+        <w:t xml:space="preserve"> Mosaico de las 50 bandas más populares, con foto, país, subgénero, el libro con el que mejor combinan y el reproductor de Spotify desplegable. Los filtros de la parte superior permiten elegir un subgénero o buscar por nombre o estilo.</w:t>
+      </w:r>
+    </w:p>
+    <w:p xmlns:a="http://schemas.openxmlformats.org/drawingml/2006/main" xmlns:pic="http://schemas.openxmlformats.org/drawingml/2006/picture">
+      <w:pPr>
+        <w:keepLines/>
+        <w:spacing w:before="120" w:after="240"/>
+        <w:jc w:val="center"/>
+      </w:pPr>
+      <w:r>
+        <w:drawing>
+          <wp:inline distT="0" distB="0" distL="0" distR="0">
+            <wp:extent cx="5220000" cy="7487635"/>
+            <wp:docPr id="2123414805" name="catalogo_bandas.png" descr="Figura 9. Pestaña Catálogo, vista de bandas."/>
+            <wp:cNvGraphicFramePr>
+              <a:graphicFrameLocks noChangeAspect="1"/>
+            </wp:cNvGraphicFramePr>
+            <a:graphic>
+              <a:graphicData uri="http://schemas.openxmlformats.org/drawingml/2006/picture">
+                <pic:pic>
+                  <pic:nvPicPr>
+                    <pic:cNvPr id="2123414805" name="catalogo_bandas.png"/>
+                    <pic:cNvPicPr/>
+                  </pic:nvPicPr>
+                  <pic:blipFill>
+                    <a:blip r:embed="rId13"/>
+                    <a:stretch>
+                      <a:fillRect/>
+                    </a:stretch>
+                  </pic:blipFill>
+                  <pic:spPr>
+                    <a:xfrm>
+                      <a:off x="0" y="0"/>
+                      <a:ext cx="5220000" cy="7487635"/>
+                    </a:xfrm>
+                    <a:prstGeom prst="rect">
+                      <a:avLst/>
+                    </a:prstGeom>
+                  </pic:spPr>
+                </pic:pic>
+              </a:graphicData>
+            </a:graphic>
+          </wp:inline>
+        </w:drawing>
+      </w:r>
+      <w:r>
+        <w:br/>
+      </w:r>
+      <w:r>
+        <w:rPr>
+          <w:i/>
+          <w:iCs/>
+          <w:color w:val="555555"/>
+          <w:sz w:val="18"/>
+          <w:szCs w:val="18"/>
+        </w:rPr>
+        <w:t xml:space="preserve">Figura 9. Pestaña Catálogo, vista de bandas.</w:t>
+      </w:r>
+    </w:p>
+    <w:p>
+      <w:pPr>
+        <w:keepNext/>
+        <w:spacing w:after="160"/>
+        <w:jc w:val="both"/>
+      </w:pPr>
+      <w:r>
         <w:rPr>
           <w:b/>
           <w:bCs/>
         </w:rPr>
-      </w:pPr>
-    </w:p>
-    <w:p>
-      <w:pPr>
+        <w:t xml:space="preserve">Catálogo de libros.</w:t>
+      </w:r>
+      <w:r>
+        <w:t xml:space="preserve"> Mosaico de libros con portada, autor, año, categoría, las bandas con las que combinan y enlaces de compra, con filtro por categoría y búsqueda por título o autor.</w:t>
+      </w:r>
+    </w:p>
+    <w:p xmlns:a="http://schemas.openxmlformats.org/drawingml/2006/main" xmlns:pic="http://schemas.openxmlformats.org/drawingml/2006/picture">
+      <w:pPr>
+        <w:keepLines/>
+        <w:spacing w:before="120" w:after="240"/>
         <w:jc w:val="center"/>
+      </w:pPr>
+      <w:r>
+        <w:drawing>
+          <wp:inline distT="0" distB="0" distL="0" distR="0">
+            <wp:extent cx="5220000" cy="6834700"/>
+            <wp:docPr id="2123414806" name="catalogo_libros.png" descr="Figura 10. Pestaña Catálogo, vista de libros."/>
+            <wp:cNvGraphicFramePr>
+              <a:graphicFrameLocks noChangeAspect="1"/>
+            </wp:cNvGraphicFramePr>
+            <a:graphic>
+              <a:graphicData uri="http://schemas.openxmlformats.org/drawingml/2006/picture">
+                <pic:pic>
+                  <pic:nvPicPr>
+                    <pic:cNvPr id="2123414806" name="catalogo_libros.png"/>
+                    <pic:cNvPicPr/>
+                  </pic:nvPicPr>
+                  <pic:blipFill>
+                    <a:blip r:embed="rId14"/>
+                    <a:stretch>
+                      <a:fillRect/>
+                    </a:stretch>
+                  </pic:blipFill>
+                  <pic:spPr>
+                    <a:xfrm>
+                      <a:off x="0" y="0"/>
+                      <a:ext cx="5220000" cy="6834700"/>
+                    </a:xfrm>
+                    <a:prstGeom prst="rect">
+                      <a:avLst/>
+                    </a:prstGeom>
+                  </pic:spPr>
+                </pic:pic>
+              </a:graphicData>
+            </a:graphic>
+          </wp:inline>
+        </w:drawing>
+      </w:r>
+      <w:r>
+        <w:br/>
+      </w:r>
+      <w:r>
+        <w:rPr>
+          <w:i/>
+          <w:iCs/>
+          <w:color w:val="555555"/>
+          <w:sz w:val="18"/>
+          <w:szCs w:val="18"/>
+        </w:rPr>
+        <w:t xml:space="preserve">Figura 10. Pestaña Catálogo, vista de libros.</w:t>
+      </w:r>
+    </w:p>
+    <w:p>
+      <w:pPr>
+        <w:keepNext/>
+        <w:spacing w:after="160"/>
+        <w:jc w:val="both"/>
+      </w:pPr>
+      <w:r>
         <w:rPr>
           <w:b/>
           <w:bCs/>
         </w:rPr>
-      </w:pPr>
-      <w:r>
-        <w:rPr>
-          <w:b/>
-          <w:bCs/>
-        </w:rPr>
+        <w:t xml:space="preserve">Sugerir.</w:t>
+      </w:r>
+      <w:r>
+        <w:t xml:space="preserve"> Formulario sin cuenta para proponer una banda o un libro nuevo, con campos opcionales para indicar con qué combina y por qué. Es la vía para ampliar el catálogo y los pares de evaluación (sección 3.4).</w:t>
+      </w:r>
+    </w:p>
+    <w:p xmlns:a="http://schemas.openxmlformats.org/drawingml/2006/main" xmlns:pic="http://schemas.openxmlformats.org/drawingml/2006/picture">
+      <w:pPr>
+        <w:keepLines/>
+        <w:spacing w:before="120" w:after="240"/>
+        <w:jc w:val="center"/>
+      </w:pPr>
+      <w:r>
         <w:drawing>
-          <wp:inline distT="0" distB="0" distL="0" distR="0" wp14:anchorId="1F4FF034" wp14:editId="0EFC195D">
+          <wp:inline distT="0" distB="0" distL="0" distR="0">
             <wp:extent cx="5881009" cy="3600000"/>
-            <wp:effectExtent l="0" t="0" r="5715" b="635"/>
-            <wp:docPr id="2123414801" name="Picture 1"/>
+            <wp:docPr id="2123414807" name="sugerir.png" descr="Figura 11. Pestaña Sugerir: formulario para que la comunidad proponga bandas o libros."/>
             <wp:cNvGraphicFramePr>
-              <a:graphicFrameLocks xmlns:a="http://schemas.openxmlformats.org/drawingml/2006/main" noChangeAspect="1"/>
+              <a:graphicFrameLocks noChangeAspect="1"/>
             </wp:cNvGraphicFramePr>
-            <a:graphic xmlns:a="http://schemas.openxmlformats.org/drawingml/2006/main">
+            <a:graphic>
               <a:graphicData uri="http://schemas.openxmlformats.org/drawingml/2006/picture">
-                <pic:pic xmlns:pic="http://schemas.openxmlformats.org/drawingml/2006/picture">
+                <pic:pic>
                   <pic:nvPicPr>
-                    <pic:cNvPr id="2123414801" name=""/>
+                    <pic:cNvPr id="2123414807" name="sugerir.png"/>
                     <pic:cNvPicPr/>
                   </pic:nvPicPr>
                   <pic:blipFill>
@@ -8601,180 +8792,27 @@
           </wp:inline>
         </w:drawing>
       </w:r>
-    </w:p>
-    <w:p>
-      <w:pPr>
-        <w:jc w:val="center"/>
-        <w:rPr>
-          <w:b/>
-          <w:bCs/>
-        </w:rPr>
-      </w:pPr>
-    </w:p>
-    <w:p>
-      <w:pPr>
-        <w:rPr>
-          <w:b/>
-          <w:bCs/>
-        </w:rPr>
-      </w:pPr>
-      <w:r>
-        <w:rPr>
-          <w:b/>
-          <w:bCs/>
-        </w:rPr>
-        <w:t>Catálogo Bandas</w:t>
-      </w:r>
-    </w:p>
-    <w:p>
-      <w:pPr>
-        <w:rPr>
-          <w:b/>
-          <w:bCs/>
-        </w:rPr>
-      </w:pPr>
-    </w:p>
-    <w:p>
-      <w:pPr>
-        <w:spacing w:after="80"/>
-        <w:jc w:val="center"/>
-        <w:rPr>
-          <w:b/>
-          <w:bCs/>
-        </w:rPr>
-      </w:pPr>
-      <w:r>
-        <w:rPr>
-          <w:b/>
-          <w:bCs/>
-        </w:rPr>
-        <w:drawing>
-          <wp:inline distT="0" distB="0" distL="0" distR="0" wp14:anchorId="6A93CF7C" wp14:editId="36463E68">
-            <wp:extent cx="5220000" cy="7487635"/>
-            <wp:effectExtent l="0" t="0" r="0" b="0"/>
-            <wp:docPr id="885169082" name="Picture 1"/>
-            <wp:cNvGraphicFramePr>
-              <a:graphicFrameLocks xmlns:a="http://schemas.openxmlformats.org/drawingml/2006/main" noChangeAspect="1"/>
-            </wp:cNvGraphicFramePr>
-            <a:graphic xmlns:a="http://schemas.openxmlformats.org/drawingml/2006/main">
-              <a:graphicData uri="http://schemas.openxmlformats.org/drawingml/2006/picture">
-                <pic:pic xmlns:pic="http://schemas.openxmlformats.org/drawingml/2006/picture">
-                  <pic:nvPicPr>
-                    <pic:cNvPr id="885169082" name=""/>
-                    <pic:cNvPicPr/>
-                  </pic:nvPicPr>
-                  <pic:blipFill>
-                    <a:blip r:embed="rId13"/>
-                    <a:stretch>
-                      <a:fillRect/>
-                    </a:stretch>
-                  </pic:blipFill>
-                  <pic:spPr>
-                    <a:xfrm>
-                      <a:off x="0" y="0"/>
-                      <a:ext cx="5220000" cy="7487635"/>
-                    </a:xfrm>
-                    <a:prstGeom prst="rect">
-                      <a:avLst/>
-                    </a:prstGeom>
-                  </pic:spPr>
-                </pic:pic>
-              </a:graphicData>
-            </a:graphic>
-          </wp:inline>
-        </w:drawing>
-      </w:r>
-    </w:p>
-    <w:p>
-      <w:pPr>
-        <w:rPr>
-          <w:b/>
-          <w:bCs/>
-        </w:rPr>
-      </w:pPr>
-      <w:r>
-        <w:rPr>
-          <w:b/>
-          <w:bCs/>
-        </w:rPr>
-        <w:br w:type="page"/>
-      </w:r>
-    </w:p>
-    <w:p>
-      <w:pPr>
-        <w:spacing w:after="80"/>
-        <w:rPr>
-          <w:b/>
-          <w:bCs/>
-        </w:rPr>
-      </w:pPr>
-      <w:r>
-        <w:rPr>
-          <w:b/>
-          <w:bCs/>
-        </w:rPr>
-        <w:lastRenderedPageBreak/>
-        <w:t>Catálogo Libros</w:t>
-      </w:r>
-    </w:p>
-    <w:p>
-      <w:pPr>
-        <w:spacing w:after="80"/>
-        <w:rPr>
-          <w:b/>
-          <w:bCs/>
-        </w:rPr>
-      </w:pPr>
-    </w:p>
-    <w:p>
-      <w:pPr>
-        <w:spacing w:after="80"/>
-        <w:jc w:val="center"/>
-        <w:rPr>
-          <w:b/>
-          <w:bCs/>
-        </w:rPr>
-      </w:pPr>
-      <w:r>
-        <w:rPr>
-          <w:b/>
-          <w:bCs/>
-        </w:rPr>
-        <w:drawing>
-          <wp:inline distT="0" distB="0" distL="0" distR="0" wp14:anchorId="45ABE35A" wp14:editId="3760D457">
-            <wp:extent cx="5220000" cy="6834700"/>
-            <wp:effectExtent l="0" t="0" r="0" b="4445"/>
-            <wp:docPr id="1421381306" name="Picture 1"/>
-            <wp:cNvGraphicFramePr>
-              <a:graphicFrameLocks xmlns:a="http://schemas.openxmlformats.org/drawingml/2006/main" noChangeAspect="1"/>
-            </wp:cNvGraphicFramePr>
-            <a:graphic xmlns:a="http://schemas.openxmlformats.org/drawingml/2006/main">
-              <a:graphicData uri="http://schemas.openxmlformats.org/drawingml/2006/picture">
-                <pic:pic xmlns:pic="http://schemas.openxmlformats.org/drawingml/2006/picture">
-                  <pic:nvPicPr>
-                    <pic:cNvPr id="1421381306" name=""/>
-                    <pic:cNvPicPr/>
-                  </pic:nvPicPr>
-                  <pic:blipFill>
-                    <a:blip r:embed="rId14"/>
-                    <a:stretch>
-                      <a:fillRect/>
-                    </a:stretch>
-                  </pic:blipFill>
-                  <pic:spPr>
-                    <a:xfrm>
-                      <a:off x="0" y="0"/>
-                      <a:ext cx="5220000" cy="6834700"/>
-                    </a:xfrm>
-                    <a:prstGeom prst="rect">
-                      <a:avLst/>
-                    </a:prstGeom>
-                  </pic:spPr>
-                </pic:pic>
-              </a:graphicData>
-            </a:graphic>
-          </wp:inline>
-        </w:drawing>
+      <w:r>
+        <w:br/>
+      </w:r>
+      <w:r>
+        <w:rPr>
+          <w:i/>
+          <w:iCs/>
+          <w:color w:val="555555"/>
+          <w:sz w:val="18"/>
+          <w:szCs w:val="18"/>
+        </w:rPr>
+        <w:t xml:space="preserve">Figura 11. Pestaña Sugerir: formulario para que la comunidad proponga bandas o libros.</w:t>
+      </w:r>
+    </w:p>
+    <w:p>
+      <w:pPr>
+        <w:spacing w:after="160"/>
+        <w:jc w:val="both"/>
+      </w:pPr>
+      <w:r>
+        <w:t xml:space="preserve">En conjunto, las capturas muestran los tres elementos de la propuesta de valor (sección 3.2): recomendación en ambos sentidos, una explicación de cada recomendación y la posibilidad de escuchar o comprar sin salir de la aplicación.</w:t>
       </w:r>
     </w:p>
     <w:p>

</xml_diff>

<commit_message>
Documento: 3.5 Estrategia de negocio (segmentos, fuentes de ingreso, fases, costos, ventaja y riesgos)
Tablas renumeradas (nuevas Tablas 2-4); la mención a la tabla de ejemplos pasa de Tabla 10 a Tabla 13.

Co-Authored-By: Claude Opus 5.5 <noreply@anthropic.com>
Claude-Session: https://claude.ai/code/session_01As5H2gX3kVScebKcYi5MV9
</commit_message>
<xml_diff>
--- a/docs/Inkriff_Metodologia_y_Resultados.docx
+++ b/docs/Inkriff_Metodologia_y_Resultados.docx
@@ -70,10 +70,7 @@
         <w:jc w:val="center"/>
       </w:pPr>
       <w:r>
-        <w:t xml:space="preserve">Por </w:t>
-      </w:r>
-      <w:r>
-        <w:t>Viridiana Cassales</w:t>
+        <w:t xml:space="preserve">Por Viridiana Cassales</w:t>
       </w:r>
     </w:p>
     <w:p>
@@ -99,13 +96,8 @@
         <w:spacing w:after="160"/>
         <w:jc w:val="both"/>
       </w:pPr>
-      <w:proofErr w:type="spellStart"/>
-      <w:r>
-        <w:t>Inkriff</w:t>
-      </w:r>
-      <w:proofErr w:type="spellEnd"/>
-      <w:r>
-        <w:t xml:space="preserve"> es una empresa ficticia que propone un recomendador bidireccional entre música de rock/metal (y sus subgéneros) y literatura de fantasía/romance: dado un libro, recomendar bandas afines; dado una banda, recomendar libros afines. Este documento resume la metodología completa del proyecto — desde la extracción de datos vía APIs públicas hasta el modelo final — y reporta los resultados obtenidos, incluyendo un problema real detectado durante la validación (concentración de recomendaciones en unos pocos libros, o “hubs”) y la corrección aplicada.</w:t>
+      <w:r>
+        <w:t xml:space="preserve">Inkriff es una empresa ficticia que propone un recomendador bidireccional entre música de rock/metal (y sus subgéneros) y literatura de fantasía/romance: dado un libro, recomendar bandas afines; dado una banda, recomendar libros afines. Este documento resume la metodología completa del proyecto — desde la extracción de datos vía APIs públicas hasta el modelo final — y reporta los resultados obtenidos, incluyendo un problema real detectado durante la validación (concentración de recomendaciones en unos pocos libros, o “hubs”) y la corrección aplicada.</w:t>
       </w:r>
     </w:p>
     <w:p>
@@ -141,8 +133,6 @@
       </w:pPr>
       <w:r>
         <w:t xml:space="preserve">¿Qué banda sonaría de fondo en la batalla final de tu saga favorita? ¿Qué novela tiene la misma atmósfera que el disco que no dejas de escuchar? Quienes leen fantasía y romance y quienes escuchan rock y metal comparten más de lo que parece: dragones, mitología nórdica, vampiros, reinos en guerra, amores imposibles y una estética oscura y épica que aparece tanto en las portadas de los libros como en las letras y los álbumes. </w:t>
-      </w:r>
-      <w:r>
         <w:lastRenderedPageBreak/>
         <w:t xml:space="preserve">Hay bandas que han dedicado discos completos a sagas literarias — Blind Guardian, por ejemplo, basó </w:t>
       </w:r>
@@ -215,13 +205,7 @@
         <w:jc w:val="both"/>
       </w:pPr>
       <w:r>
-        <w:t xml:space="preserve">El proyecto se restringió deliberadamente a dos condiciones específicas: los datos deben venir de APIs o scraping, y el proyecto debe poder correr con recursos gratuitos (Google Colab, APIs sin costo). Estas dos restricciones determinaron gran parte de las decisiones metodológicas descritas </w:t>
-      </w:r>
-      <w:r>
-        <w:t>a continuación</w:t>
-      </w:r>
-      <w:r>
-        <w:t>.</w:t>
+        <w:t xml:space="preserve">El proyecto se restringió deliberadamente a dos condiciones específicas: los datos deben venir de APIs o scraping, y el proyecto debe poder correr con recursos gratuitos (Google Colab, APIs sin costo). Estas dos restricciones determinaron gran parte de las decisiones metodológicas descritas a continuación.</w:t>
       </w:r>
     </w:p>
     <w:p>
@@ -1251,6 +1235,2136 @@
     </w:p>
     <w:p>
       <w:pPr>
+        <w:pStyle w:val="Heading2"/>
+      </w:pPr>
+      <w:r>
+        <w:t xml:space="preserve">3.5 Estrategia de negocio</w:t>
+      </w:r>
+    </w:p>
+    <w:p>
+      <w:pPr>
+        <w:spacing w:after="160"/>
+        <w:jc w:val="both"/>
+      </w:pPr>
+      <w:r>
+        <w:t xml:space="preserve">Esta subsección desarrolla el modelo de negocio esbozado en la sección 3.2. Inkriff es una empresa ficticia, así que lo que sigue es una propuesta: no se reportan ingresos ni cifras de mercado, solo cómo se generaría valor a partir de lo que la aplicación ya hace.</w:t>
+      </w:r>
+    </w:p>
+    <w:p>
+      <w:pPr>
+        <w:keepNext/>
+        <w:spacing w:after="160"/>
+        <w:jc w:val="both"/>
+      </w:pPr>
+      <w:r>
+        <w:rPr>
+          <w:b/>
+          <w:bCs/>
+        </w:rPr>
+        <w:t xml:space="preserve">Modelo general.</w:t>
+      </w:r>
+      <w:r>
+        <w:t xml:space="preserve"> La aplicación es gratuita para quien la usa. Los ingresos vienen de quienes se benefician del tráfico que genera: tiendas de libros y, en una fase posterior, editoriales y sellos discográficos. La Tabla 2 resume qué obtiene y qué aporta cada segmento.</w:t>
+      </w:r>
+    </w:p>
+    <w:tbl>
+      <w:tblPr>
+        <w:tblW w:w="10000" w:type="dxa"/>
+        <w:jc w:val="center"/>
+        <w:tblBorders>
+          <w:top w:val="single" w:sz="4" w:space="0" w:color="auto"/>
+          <w:left w:val="single" w:sz="4" w:space="0" w:color="auto"/>
+          <w:bottom w:val="single" w:sz="4" w:space="0" w:color="auto"/>
+          <w:right w:val="single" w:sz="4" w:space="0" w:color="auto"/>
+          <w:insideH w:val="single" w:sz="4" w:space="0" w:color="auto"/>
+          <w:insideV w:val="single" w:sz="4" w:space="0" w:color="auto"/>
+        </w:tblBorders>
+        <w:tblCellMar>
+          <w:left w:w="10" w:type="dxa"/>
+          <w:right w:w="10" w:type="dxa"/>
+        </w:tblCellMar>
+        <w:tblLook w:val="04A0" w:firstRow="1" w:lastRow="0" w:firstColumn="1" w:lastColumn="0" w:noHBand="0" w:noVBand="1"/>
+      </w:tblPr>
+      <w:tblGrid>
+        <w:gridCol w:w="2300"/>
+        <w:gridCol w:w="2700"/>
+        <w:gridCol w:w="2600"/>
+        <w:gridCol w:w="2400"/>
+      </w:tblGrid>
+      <w:tr>
+        <w:tblPrEx>
+          <w:tblCellMar>
+            <w:top w:w="0" w:type="dxa"/>
+            <w:bottom w:w="0" w:type="dxa"/>
+          </w:tblCellMar>
+        </w:tblPrEx>
+        <w:trPr>
+          <w:cantSplit/>
+          <w:tblHeader/>
+          <w:jc w:val="center"/>
+        </w:trPr>
+        <w:tc>
+          <w:tcPr>
+            <w:tcW w:w="2300" w:type="dxa"/>
+            <w:shd w:val="clear" w:color="auto" w:fill="6B2D5C"/>
+            <w:tcMar>
+              <w:top w:w="80" w:type="dxa"/>
+              <w:left w:w="100" w:type="dxa"/>
+              <w:bottom w:w="80" w:type="dxa"/>
+              <w:right w:w="100" w:type="dxa"/>
+            </w:tcMar>
+            <w:vAlign w:val="center"/>
+          </w:tcPr>
+          <w:p>
+            <w:pPr>
+              <w:keepNext/>
+              <w:jc w:val="center"/>
+            </w:pPr>
+            <w:r>
+              <w:rPr>
+                <w:b/>
+                <w:bCs/>
+                <w:color w:val="FFFFFF"/>
+                <w:sz w:val="20"/>
+                <w:szCs w:val="20"/>
+              </w:rPr>
+              <w:t xml:space="preserve">Segmento</w:t>
+            </w:r>
+          </w:p>
+        </w:tc>
+        <w:tc>
+          <w:tcPr>
+            <w:tcW w:w="2700" w:type="dxa"/>
+            <w:shd w:val="clear" w:color="auto" w:fill="6B2D5C"/>
+            <w:tcMar>
+              <w:top w:w="80" w:type="dxa"/>
+              <w:left w:w="100" w:type="dxa"/>
+              <w:bottom w:w="80" w:type="dxa"/>
+              <w:right w:w="100" w:type="dxa"/>
+            </w:tcMar>
+            <w:vAlign w:val="center"/>
+          </w:tcPr>
+          <w:p>
+            <w:pPr>
+              <w:keepNext/>
+              <w:jc w:val="center"/>
+            </w:pPr>
+            <w:r>
+              <w:rPr>
+                <w:b/>
+                <w:bCs/>
+                <w:color w:val="FFFFFF"/>
+                <w:sz w:val="20"/>
+                <w:szCs w:val="20"/>
+              </w:rPr>
+              <w:t xml:space="preserve">Qué obtiene</w:t>
+            </w:r>
+          </w:p>
+        </w:tc>
+        <w:tc>
+          <w:tcPr>
+            <w:tcW w:w="2600" w:type="dxa"/>
+            <w:shd w:val="clear" w:color="auto" w:fill="6B2D5C"/>
+            <w:tcMar>
+              <w:top w:w="80" w:type="dxa"/>
+              <w:left w:w="100" w:type="dxa"/>
+              <w:bottom w:w="80" w:type="dxa"/>
+              <w:right w:w="100" w:type="dxa"/>
+            </w:tcMar>
+            <w:vAlign w:val="center"/>
+          </w:tcPr>
+          <w:p>
+            <w:pPr>
+              <w:keepNext/>
+              <w:jc w:val="center"/>
+            </w:pPr>
+            <w:r>
+              <w:rPr>
+                <w:b/>
+                <w:bCs/>
+                <w:color w:val="FFFFFF"/>
+                <w:sz w:val="20"/>
+                <w:szCs w:val="20"/>
+              </w:rPr>
+              <w:t xml:space="preserve">Qué aporta a Inkriff</w:t>
+            </w:r>
+          </w:p>
+        </w:tc>
+        <w:tc>
+          <w:tcPr>
+            <w:tcW w:w="2400" w:type="dxa"/>
+            <w:shd w:val="clear" w:color="auto" w:fill="6B2D5C"/>
+            <w:tcMar>
+              <w:top w:w="80" w:type="dxa"/>
+              <w:left w:w="100" w:type="dxa"/>
+              <w:bottom w:w="80" w:type="dxa"/>
+              <w:right w:w="100" w:type="dxa"/>
+            </w:tcMar>
+            <w:vAlign w:val="center"/>
+          </w:tcPr>
+          <w:p>
+            <w:pPr>
+              <w:keepNext/>
+              <w:jc w:val="center"/>
+            </w:pPr>
+            <w:r>
+              <w:rPr>
+                <w:b/>
+                <w:bCs/>
+                <w:color w:val="FFFFFF"/>
+                <w:sz w:val="20"/>
+                <w:szCs w:val="20"/>
+              </w:rPr>
+              <w:t xml:space="preserve">Cómo paga</w:t>
+            </w:r>
+          </w:p>
+        </w:tc>
+      </w:tr>
+      <w:tr>
+        <w:tblPrEx>
+          <w:tblCellMar>
+            <w:top w:w="0" w:type="dxa"/>
+            <w:bottom w:w="0" w:type="dxa"/>
+          </w:tblCellMar>
+        </w:tblPrEx>
+        <w:trPr>
+          <w:cantSplit/>
+          <w:jc w:val="center"/>
+        </w:trPr>
+        <w:tc>
+          <w:tcPr>
+            <w:tcW w:w="2300" w:type="dxa"/>
+            <w:tcMar>
+              <w:top w:w="80" w:type="dxa"/>
+              <w:left w:w="100" w:type="dxa"/>
+              <w:bottom w:w="80" w:type="dxa"/>
+              <w:right w:w="100" w:type="dxa"/>
+            </w:tcMar>
+          </w:tcPr>
+          <w:p>
+            <w:pPr>
+              <w:keepNext/>
+            </w:pPr>
+            <w:r>
+              <w:rPr>
+                <w:color w:val="000000"/>
+                <w:sz w:val="20"/>
+                <w:szCs w:val="20"/>
+              </w:rPr>
+              <w:t xml:space="preserve">Lectores de fantasía y romance</w:t>
+            </w:r>
+          </w:p>
+        </w:tc>
+        <w:tc>
+          <w:tcPr>
+            <w:tcW w:w="2700" w:type="dxa"/>
+            <w:tcMar>
+              <w:top w:w="80" w:type="dxa"/>
+              <w:left w:w="100" w:type="dxa"/>
+              <w:bottom w:w="80" w:type="dxa"/>
+              <w:right w:w="100" w:type="dxa"/>
+            </w:tcMar>
+          </w:tcPr>
+          <w:p>
+            <w:pPr>
+              <w:keepNext/>
+            </w:pPr>
+            <w:r>
+              <w:rPr>
+                <w:color w:val="000000"/>
+                <w:sz w:val="20"/>
+                <w:szCs w:val="20"/>
+              </w:rPr>
+              <w:t xml:space="preserve">Música que acompaña la atmósfera de lo que leen</w:t>
+            </w:r>
+          </w:p>
+        </w:tc>
+        <w:tc>
+          <w:tcPr>
+            <w:tcW w:w="2600" w:type="dxa"/>
+            <w:tcMar>
+              <w:top w:w="80" w:type="dxa"/>
+              <w:left w:w="100" w:type="dxa"/>
+              <w:bottom w:w="80" w:type="dxa"/>
+              <w:right w:w="100" w:type="dxa"/>
+            </w:tcMar>
+          </w:tcPr>
+          <w:p>
+            <w:pPr>
+              <w:keepNext/>
+            </w:pPr>
+            <w:r>
+              <w:rPr>
+                <w:color w:val="000000"/>
+                <w:sz w:val="20"/>
+                <w:szCs w:val="20"/>
+              </w:rPr>
+              <w:t xml:space="preserve">Tráfico y clics hacia tiendas</w:t>
+            </w:r>
+          </w:p>
+        </w:tc>
+        <w:tc>
+          <w:tcPr>
+            <w:tcW w:w="2400" w:type="dxa"/>
+            <w:tcMar>
+              <w:top w:w="80" w:type="dxa"/>
+              <w:left w:w="100" w:type="dxa"/>
+              <w:bottom w:w="80" w:type="dxa"/>
+              <w:right w:w="100" w:type="dxa"/>
+            </w:tcMar>
+          </w:tcPr>
+          <w:p>
+            <w:pPr>
+              <w:keepNext/>
+            </w:pPr>
+            <w:r>
+              <w:rPr>
+                <w:color w:val="000000"/>
+                <w:sz w:val="20"/>
+                <w:szCs w:val="20"/>
+              </w:rPr>
+              <w:t xml:space="preserve">Gratis</w:t>
+            </w:r>
+          </w:p>
+        </w:tc>
+      </w:tr>
+      <w:tr>
+        <w:tblPrEx>
+          <w:tblCellMar>
+            <w:top w:w="0" w:type="dxa"/>
+            <w:bottom w:w="0" w:type="dxa"/>
+          </w:tblCellMar>
+        </w:tblPrEx>
+        <w:trPr>
+          <w:cantSplit/>
+          <w:jc w:val="center"/>
+        </w:trPr>
+        <w:tc>
+          <w:tcPr>
+            <w:tcW w:w="2300" w:type="dxa"/>
+            <w:tcMar>
+              <w:top w:w="80" w:type="dxa"/>
+              <w:left w:w="100" w:type="dxa"/>
+              <w:bottom w:w="80" w:type="dxa"/>
+              <w:right w:w="100" w:type="dxa"/>
+            </w:tcMar>
+          </w:tcPr>
+          <w:p>
+            <w:pPr>
+              <w:keepNext/>
+            </w:pPr>
+            <w:r>
+              <w:rPr>
+                <w:color w:val="000000"/>
+                <w:sz w:val="20"/>
+                <w:szCs w:val="20"/>
+              </w:rPr>
+              <w:t xml:space="preserve">Fans de rock y metal</w:t>
+            </w:r>
+          </w:p>
+        </w:tc>
+        <w:tc>
+          <w:tcPr>
+            <w:tcW w:w="2700" w:type="dxa"/>
+            <w:tcMar>
+              <w:top w:w="80" w:type="dxa"/>
+              <w:left w:w="100" w:type="dxa"/>
+              <w:bottom w:w="80" w:type="dxa"/>
+              <w:right w:w="100" w:type="dxa"/>
+            </w:tcMar>
+          </w:tcPr>
+          <w:p>
+            <w:pPr>
+              <w:keepNext/>
+            </w:pPr>
+            <w:r>
+              <w:rPr>
+                <w:color w:val="000000"/>
+                <w:sz w:val="20"/>
+                <w:szCs w:val="20"/>
+              </w:rPr>
+              <w:t xml:space="preserve">Lecturas con la estética de su música</w:t>
+            </w:r>
+          </w:p>
+        </w:tc>
+        <w:tc>
+          <w:tcPr>
+            <w:tcW w:w="2600" w:type="dxa"/>
+            <w:tcMar>
+              <w:top w:w="80" w:type="dxa"/>
+              <w:left w:w="100" w:type="dxa"/>
+              <w:bottom w:w="80" w:type="dxa"/>
+              <w:right w:w="100" w:type="dxa"/>
+            </w:tcMar>
+          </w:tcPr>
+          <w:p>
+            <w:pPr>
+              <w:keepNext/>
+            </w:pPr>
+            <w:r>
+              <w:rPr>
+                <w:color w:val="000000"/>
+                <w:sz w:val="20"/>
+                <w:szCs w:val="20"/>
+              </w:rPr>
+              <w:t xml:space="preserve">Tráfico, clics de escucha y sugerencias</w:t>
+            </w:r>
+          </w:p>
+        </w:tc>
+        <w:tc>
+          <w:tcPr>
+            <w:tcW w:w="2400" w:type="dxa"/>
+            <w:tcMar>
+              <w:top w:w="80" w:type="dxa"/>
+              <w:left w:w="100" w:type="dxa"/>
+              <w:bottom w:w="80" w:type="dxa"/>
+              <w:right w:w="100" w:type="dxa"/>
+            </w:tcMar>
+          </w:tcPr>
+          <w:p>
+            <w:pPr>
+              <w:keepNext/>
+            </w:pPr>
+            <w:r>
+              <w:rPr>
+                <w:color w:val="000000"/>
+                <w:sz w:val="20"/>
+                <w:szCs w:val="20"/>
+              </w:rPr>
+              <w:t xml:space="preserve">Gratis</w:t>
+            </w:r>
+          </w:p>
+        </w:tc>
+      </w:tr>
+      <w:tr>
+        <w:tblPrEx>
+          <w:tblCellMar>
+            <w:top w:w="0" w:type="dxa"/>
+            <w:bottom w:w="0" w:type="dxa"/>
+          </w:tblCellMar>
+        </w:tblPrEx>
+        <w:trPr>
+          <w:cantSplit/>
+          <w:jc w:val="center"/>
+        </w:trPr>
+        <w:tc>
+          <w:tcPr>
+            <w:tcW w:w="2300" w:type="dxa"/>
+            <w:tcMar>
+              <w:top w:w="80" w:type="dxa"/>
+              <w:left w:w="100" w:type="dxa"/>
+              <w:bottom w:w="80" w:type="dxa"/>
+              <w:right w:w="100" w:type="dxa"/>
+            </w:tcMar>
+          </w:tcPr>
+          <w:p>
+            <w:pPr>
+              <w:keepNext/>
+            </w:pPr>
+            <w:r>
+              <w:rPr>
+                <w:color w:val="000000"/>
+                <w:sz w:val="20"/>
+                <w:szCs w:val="20"/>
+              </w:rPr>
+              <w:t xml:space="preserve">Creadores de contenido</w:t>
+            </w:r>
+          </w:p>
+        </w:tc>
+        <w:tc>
+          <w:tcPr>
+            <w:tcW w:w="2700" w:type="dxa"/>
+            <w:tcMar>
+              <w:top w:w="80" w:type="dxa"/>
+              <w:left w:w="100" w:type="dxa"/>
+              <w:bottom w:w="80" w:type="dxa"/>
+              <w:right w:w="100" w:type="dxa"/>
+            </w:tcMar>
+          </w:tcPr>
+          <w:p>
+            <w:pPr>
+              <w:keepNext/>
+            </w:pPr>
+            <w:r>
+              <w:rPr>
+                <w:color w:val="000000"/>
+                <w:sz w:val="20"/>
+                <w:szCs w:val="20"/>
+              </w:rPr>
+              <w:t xml:space="preserve">Parejas libro–banda con argumento, listas para compartir</w:t>
+            </w:r>
+          </w:p>
+        </w:tc>
+        <w:tc>
+          <w:tcPr>
+            <w:tcW w:w="2600" w:type="dxa"/>
+            <w:tcMar>
+              <w:top w:w="80" w:type="dxa"/>
+              <w:left w:w="100" w:type="dxa"/>
+              <w:bottom w:w="80" w:type="dxa"/>
+              <w:right w:w="100" w:type="dxa"/>
+            </w:tcMar>
+          </w:tcPr>
+          <w:p>
+            <w:pPr>
+              <w:keepNext/>
+            </w:pPr>
+            <w:r>
+              <w:rPr>
+                <w:color w:val="000000"/>
+                <w:sz w:val="20"/>
+                <w:szCs w:val="20"/>
+              </w:rPr>
+              <w:t xml:space="preserve">Difusión en redes sociales</w:t>
+            </w:r>
+          </w:p>
+        </w:tc>
+        <w:tc>
+          <w:tcPr>
+            <w:tcW w:w="2400" w:type="dxa"/>
+            <w:tcMar>
+              <w:top w:w="80" w:type="dxa"/>
+              <w:left w:w="100" w:type="dxa"/>
+              <w:bottom w:w="80" w:type="dxa"/>
+              <w:right w:w="100" w:type="dxa"/>
+            </w:tcMar>
+          </w:tcPr>
+          <w:p>
+            <w:pPr>
+              <w:keepNext/>
+            </w:pPr>
+            <w:r>
+              <w:rPr>
+                <w:color w:val="000000"/>
+                <w:sz w:val="20"/>
+                <w:szCs w:val="20"/>
+              </w:rPr>
+              <w:t xml:space="preserve">Gratis</w:t>
+            </w:r>
+          </w:p>
+        </w:tc>
+      </w:tr>
+      <w:tr>
+        <w:tblPrEx>
+          <w:tblCellMar>
+            <w:top w:w="0" w:type="dxa"/>
+            <w:bottom w:w="0" w:type="dxa"/>
+          </w:tblCellMar>
+        </w:tblPrEx>
+        <w:trPr>
+          <w:cantSplit/>
+          <w:jc w:val="center"/>
+        </w:trPr>
+        <w:tc>
+          <w:tcPr>
+            <w:tcW w:w="2300" w:type="dxa"/>
+            <w:tcMar>
+              <w:top w:w="80" w:type="dxa"/>
+              <w:left w:w="100" w:type="dxa"/>
+              <w:bottom w:w="80" w:type="dxa"/>
+              <w:right w:w="100" w:type="dxa"/>
+            </w:tcMar>
+          </w:tcPr>
+          <w:p>
+            <w:pPr>
+              <w:keepNext/>
+            </w:pPr>
+            <w:r>
+              <w:rPr>
+                <w:color w:val="000000"/>
+                <w:sz w:val="20"/>
+                <w:szCs w:val="20"/>
+              </w:rPr>
+              <w:t xml:space="preserve">Librerías y tiendas</w:t>
+            </w:r>
+          </w:p>
+        </w:tc>
+        <w:tc>
+          <w:tcPr>
+            <w:tcW w:w="2700" w:type="dxa"/>
+            <w:tcMar>
+              <w:top w:w="80" w:type="dxa"/>
+              <w:left w:w="100" w:type="dxa"/>
+              <w:bottom w:w="80" w:type="dxa"/>
+              <w:right w:w="100" w:type="dxa"/>
+            </w:tcMar>
+          </w:tcPr>
+          <w:p>
+            <w:pPr>
+              <w:keepNext/>
+            </w:pPr>
+            <w:r>
+              <w:rPr>
+                <w:color w:val="000000"/>
+                <w:sz w:val="20"/>
+                <w:szCs w:val="20"/>
+              </w:rPr>
+              <w:t xml:space="preserve">Lectores que llegan con intención de compra</w:t>
+            </w:r>
+          </w:p>
+        </w:tc>
+        <w:tc>
+          <w:tcPr>
+            <w:tcW w:w="2600" w:type="dxa"/>
+            <w:tcMar>
+              <w:top w:w="80" w:type="dxa"/>
+              <w:left w:w="100" w:type="dxa"/>
+              <w:bottom w:w="80" w:type="dxa"/>
+              <w:right w:w="100" w:type="dxa"/>
+            </w:tcMar>
+          </w:tcPr>
+          <w:p>
+            <w:pPr>
+              <w:keepNext/>
+            </w:pPr>
+            <w:r>
+              <w:rPr>
+                <w:color w:val="000000"/>
+                <w:sz w:val="20"/>
+                <w:szCs w:val="20"/>
+              </w:rPr>
+              <w:t xml:space="preserve">Ingreso por cada venta</w:t>
+            </w:r>
+          </w:p>
+        </w:tc>
+        <w:tc>
+          <w:tcPr>
+            <w:tcW w:w="2400" w:type="dxa"/>
+            <w:tcMar>
+              <w:top w:w="80" w:type="dxa"/>
+              <w:left w:w="100" w:type="dxa"/>
+              <w:bottom w:w="80" w:type="dxa"/>
+              <w:right w:w="100" w:type="dxa"/>
+            </w:tcMar>
+          </w:tcPr>
+          <w:p>
+            <w:pPr>
+              <w:keepNext/>
+            </w:pPr>
+            <w:r>
+              <w:rPr>
+                <w:color w:val="000000"/>
+                <w:sz w:val="20"/>
+                <w:szCs w:val="20"/>
+              </w:rPr>
+              <w:t xml:space="preserve">Comisión de afiliación</w:t>
+            </w:r>
+          </w:p>
+        </w:tc>
+      </w:tr>
+      <w:tr>
+        <w:tblPrEx>
+          <w:tblCellMar>
+            <w:top w:w="0" w:type="dxa"/>
+            <w:bottom w:w="0" w:type="dxa"/>
+          </w:tblCellMar>
+        </w:tblPrEx>
+        <w:trPr>
+          <w:cantSplit/>
+          <w:jc w:val="center"/>
+        </w:trPr>
+        <w:tc>
+          <w:tcPr>
+            <w:tcW w:w="2300" w:type="dxa"/>
+            <w:tcMar>
+              <w:top w:w="80" w:type="dxa"/>
+              <w:left w:w="100" w:type="dxa"/>
+              <w:bottom w:w="80" w:type="dxa"/>
+              <w:right w:w="100" w:type="dxa"/>
+            </w:tcMar>
+          </w:tcPr>
+          <w:p>
+            <w:pPr>
+              <w:keepNext/>
+            </w:pPr>
+            <w:r>
+              <w:rPr>
+                <w:color w:val="000000"/>
+                <w:sz w:val="20"/>
+                <w:szCs w:val="20"/>
+              </w:rPr>
+              <w:t xml:space="preserve">Editoriales, sellos y bandas (fase 3)</w:t>
+            </w:r>
+          </w:p>
+        </w:tc>
+        <w:tc>
+          <w:tcPr>
+            <w:tcW w:w="2700" w:type="dxa"/>
+            <w:tcMar>
+              <w:top w:w="80" w:type="dxa"/>
+              <w:left w:w="100" w:type="dxa"/>
+              <w:bottom w:w="80" w:type="dxa"/>
+              <w:right w:w="100" w:type="dxa"/>
+            </w:tcMar>
+          </w:tcPr>
+          <w:p>
+            <w:pPr>
+              <w:keepNext/>
+            </w:pPr>
+            <w:r>
+              <w:rPr>
+                <w:color w:val="000000"/>
+                <w:sz w:val="20"/>
+                <w:szCs w:val="20"/>
+              </w:rPr>
+              <w:t xml:space="preserve">Exposición ante un público afín y datos agregados de afinidad</w:t>
+            </w:r>
+          </w:p>
+        </w:tc>
+        <w:tc>
+          <w:tcPr>
+            <w:tcW w:w="2600" w:type="dxa"/>
+            <w:tcMar>
+              <w:top w:w="80" w:type="dxa"/>
+              <w:left w:w="100" w:type="dxa"/>
+              <w:bottom w:w="80" w:type="dxa"/>
+              <w:right w:w="100" w:type="dxa"/>
+            </w:tcMar>
+          </w:tcPr>
+          <w:p>
+            <w:pPr>
+              <w:keepNext/>
+            </w:pPr>
+            <w:r>
+              <w:rPr>
+                <w:color w:val="000000"/>
+                <w:sz w:val="20"/>
+                <w:szCs w:val="20"/>
+              </w:rPr>
+              <w:t xml:space="preserve">Ingreso por campaña o reporte</w:t>
+            </w:r>
+          </w:p>
+        </w:tc>
+        <w:tc>
+          <w:tcPr>
+            <w:tcW w:w="2400" w:type="dxa"/>
+            <w:tcMar>
+              <w:top w:w="80" w:type="dxa"/>
+              <w:left w:w="100" w:type="dxa"/>
+              <w:bottom w:w="80" w:type="dxa"/>
+              <w:right w:w="100" w:type="dxa"/>
+            </w:tcMar>
+          </w:tcPr>
+          <w:p>
+            <w:pPr>
+              <w:keepNext/>
+            </w:pPr>
+            <w:r>
+              <w:rPr>
+                <w:color w:val="000000"/>
+                <w:sz w:val="20"/>
+                <w:szCs w:val="20"/>
+              </w:rPr>
+              <w:t xml:space="preserve">Pago por campaña o por reporte</w:t>
+            </w:r>
+          </w:p>
+        </w:tc>
+      </w:tr>
+    </w:tbl>
+    <w:p>
+      <w:pPr>
+        <w:spacing w:after="240"/>
+      </w:pPr>
+      <w:r>
+        <w:rPr>
+          <w:i/>
+          <w:iCs/>
+          <w:color w:val="555555"/>
+          <w:sz w:val="18"/>
+          <w:szCs w:val="18"/>
+        </w:rPr>
+        <w:t xml:space="preserve">Tabla 2. Segmentos de Inkriff: qué obtiene cada uno y cómo contribuye al negocio.</w:t>
+      </w:r>
+    </w:p>
+    <w:p>
+      <w:pPr>
+        <w:keepNext/>
+        <w:spacing w:after="160"/>
+        <w:jc w:val="both"/>
+      </w:pPr>
+      <w:r>
+        <w:rPr>
+          <w:b/>
+          <w:bCs/>
+        </w:rPr>
+        <w:t xml:space="preserve">Fuentes de ingreso.</w:t>
+      </w:r>
+      <w:r>
+        <w:t xml:space="preserve"> Se plantean cuatro, en orden de facilidad (Tabla 3). Combinarlas reduce la dependencia de la afiliación, cuya comisión por venta suele ser baja.</w:t>
+      </w:r>
+    </w:p>
+    <w:tbl>
+      <w:tblPr>
+        <w:tblW w:w="10000" w:type="dxa"/>
+        <w:jc w:val="center"/>
+        <w:tblBorders>
+          <w:top w:val="single" w:sz="4" w:space="0" w:color="auto"/>
+          <w:left w:val="single" w:sz="4" w:space="0" w:color="auto"/>
+          <w:bottom w:val="single" w:sz="4" w:space="0" w:color="auto"/>
+          <w:right w:val="single" w:sz="4" w:space="0" w:color="auto"/>
+          <w:insideH w:val="single" w:sz="4" w:space="0" w:color="auto"/>
+          <w:insideV w:val="single" w:sz="4" w:space="0" w:color="auto"/>
+        </w:tblBorders>
+        <w:tblCellMar>
+          <w:left w:w="10" w:type="dxa"/>
+          <w:right w:w="10" w:type="dxa"/>
+        </w:tblCellMar>
+        <w:tblLook w:val="04A0" w:firstRow="1" w:lastRow="0" w:firstColumn="1" w:lastColumn="0" w:noHBand="0" w:noVBand="1"/>
+      </w:tblPr>
+      <w:tblGrid>
+        <w:gridCol w:w="1900"/>
+        <w:gridCol w:w="4100"/>
+        <w:gridCol w:w="3000"/>
+        <w:gridCol w:w="1000"/>
+      </w:tblGrid>
+      <w:tr>
+        <w:tblPrEx>
+          <w:tblCellMar>
+            <w:top w:w="0" w:type="dxa"/>
+            <w:bottom w:w="0" w:type="dxa"/>
+          </w:tblCellMar>
+        </w:tblPrEx>
+        <w:trPr>
+          <w:cantSplit/>
+          <w:tblHeader/>
+          <w:jc w:val="center"/>
+        </w:trPr>
+        <w:tc>
+          <w:tcPr>
+            <w:tcW w:w="1900" w:type="dxa"/>
+            <w:shd w:val="clear" w:color="auto" w:fill="6B2D5C"/>
+            <w:tcMar>
+              <w:top w:w="80" w:type="dxa"/>
+              <w:left w:w="100" w:type="dxa"/>
+              <w:bottom w:w="80" w:type="dxa"/>
+              <w:right w:w="100" w:type="dxa"/>
+            </w:tcMar>
+            <w:vAlign w:val="center"/>
+          </w:tcPr>
+          <w:p>
+            <w:pPr>
+              <w:keepNext/>
+              <w:jc w:val="center"/>
+            </w:pPr>
+            <w:r>
+              <w:rPr>
+                <w:b/>
+                <w:bCs/>
+                <w:color w:val="FFFFFF"/>
+                <w:sz w:val="20"/>
+                <w:szCs w:val="20"/>
+              </w:rPr>
+              <w:t xml:space="preserve">Fuente</w:t>
+            </w:r>
+          </w:p>
+        </w:tc>
+        <w:tc>
+          <w:tcPr>
+            <w:tcW w:w="4100" w:type="dxa"/>
+            <w:shd w:val="clear" w:color="auto" w:fill="6B2D5C"/>
+            <w:tcMar>
+              <w:top w:w="80" w:type="dxa"/>
+              <w:left w:w="100" w:type="dxa"/>
+              <w:bottom w:w="80" w:type="dxa"/>
+              <w:right w:w="100" w:type="dxa"/>
+            </w:tcMar>
+            <w:vAlign w:val="center"/>
+          </w:tcPr>
+          <w:p>
+            <w:pPr>
+              <w:keepNext/>
+              <w:jc w:val="center"/>
+            </w:pPr>
+            <w:r>
+              <w:rPr>
+                <w:b/>
+                <w:bCs/>
+                <w:color w:val="FFFFFF"/>
+                <w:sz w:val="20"/>
+                <w:szCs w:val="20"/>
+              </w:rPr>
+              <w:t xml:space="preserve">Cómo funciona</w:t>
+            </w:r>
+          </w:p>
+        </w:tc>
+        <w:tc>
+          <w:tcPr>
+            <w:tcW w:w="3000" w:type="dxa"/>
+            <w:shd w:val="clear" w:color="auto" w:fill="6B2D5C"/>
+            <w:tcMar>
+              <w:top w:w="80" w:type="dxa"/>
+              <w:left w:w="100" w:type="dxa"/>
+              <w:bottom w:w="80" w:type="dxa"/>
+              <w:right w:w="100" w:type="dxa"/>
+            </w:tcMar>
+            <w:vAlign w:val="center"/>
+          </w:tcPr>
+          <w:p>
+            <w:pPr>
+              <w:keepNext/>
+              <w:jc w:val="center"/>
+            </w:pPr>
+            <w:r>
+              <w:rPr>
+                <w:b/>
+                <w:bCs/>
+                <w:color w:val="FFFFFF"/>
+                <w:sz w:val="20"/>
+                <w:szCs w:val="20"/>
+              </w:rPr>
+              <w:t xml:space="preserve">Qué existe ya en la app</w:t>
+            </w:r>
+          </w:p>
+        </w:tc>
+        <w:tc>
+          <w:tcPr>
+            <w:tcW w:w="1000" w:type="dxa"/>
+            <w:shd w:val="clear" w:color="auto" w:fill="6B2D5C"/>
+            <w:tcMar>
+              <w:top w:w="80" w:type="dxa"/>
+              <w:left w:w="100" w:type="dxa"/>
+              <w:bottom w:w="80" w:type="dxa"/>
+              <w:right w:w="100" w:type="dxa"/>
+            </w:tcMar>
+            <w:vAlign w:val="center"/>
+          </w:tcPr>
+          <w:p>
+            <w:pPr>
+              <w:keepNext/>
+              <w:jc w:val="center"/>
+            </w:pPr>
+            <w:r>
+              <w:rPr>
+                <w:b/>
+                <w:bCs/>
+                <w:color w:val="FFFFFF"/>
+                <w:sz w:val="20"/>
+                <w:szCs w:val="20"/>
+              </w:rPr>
+              <w:t xml:space="preserve">Fase</w:t>
+            </w:r>
+          </w:p>
+        </w:tc>
+      </w:tr>
+      <w:tr>
+        <w:tblPrEx>
+          <w:tblCellMar>
+            <w:top w:w="0" w:type="dxa"/>
+            <w:bottom w:w="0" w:type="dxa"/>
+          </w:tblCellMar>
+        </w:tblPrEx>
+        <w:trPr>
+          <w:cantSplit/>
+          <w:jc w:val="center"/>
+        </w:trPr>
+        <w:tc>
+          <w:tcPr>
+            <w:tcW w:w="1900" w:type="dxa"/>
+            <w:tcMar>
+              <w:top w:w="80" w:type="dxa"/>
+              <w:left w:w="100" w:type="dxa"/>
+              <w:bottom w:w="80" w:type="dxa"/>
+              <w:right w:w="100" w:type="dxa"/>
+            </w:tcMar>
+          </w:tcPr>
+          <w:p>
+            <w:pPr>
+              <w:keepNext/>
+            </w:pPr>
+            <w:r>
+              <w:rPr>
+                <w:color w:val="000000"/>
+                <w:sz w:val="20"/>
+                <w:szCs w:val="20"/>
+              </w:rPr>
+              <w:t xml:space="preserve">Afiliación</w:t>
+            </w:r>
+          </w:p>
+        </w:tc>
+        <w:tc>
+          <w:tcPr>
+            <w:tcW w:w="4100" w:type="dxa"/>
+            <w:tcMar>
+              <w:top w:w="80" w:type="dxa"/>
+              <w:left w:w="100" w:type="dxa"/>
+              <w:bottom w:w="80" w:type="dxa"/>
+              <w:right w:w="100" w:type="dxa"/>
+            </w:tcMar>
+          </w:tcPr>
+          <w:p>
+            <w:pPr>
+              <w:keepNext/>
+            </w:pPr>
+            <w:r>
+              <w:rPr>
+                <w:color w:val="000000"/>
+                <w:sz w:val="20"/>
+                <w:szCs w:val="20"/>
+              </w:rPr>
+              <w:t xml:space="preserve">Comisión por cada compra que llega desde un enlace de Inkriff</w:t>
+            </w:r>
+          </w:p>
+        </w:tc>
+        <w:tc>
+          <w:tcPr>
+            <w:tcW w:w="3000" w:type="dxa"/>
+            <w:tcMar>
+              <w:top w:w="80" w:type="dxa"/>
+              <w:left w:w="100" w:type="dxa"/>
+              <w:bottom w:w="80" w:type="dxa"/>
+              <w:right w:w="100" w:type="dxa"/>
+            </w:tcMar>
+          </w:tcPr>
+          <w:p>
+            <w:pPr>
+              <w:keepNext/>
+            </w:pPr>
+            <w:r>
+              <w:rPr>
+                <w:color w:val="000000"/>
+                <w:sz w:val="20"/>
+                <w:szCs w:val="20"/>
+              </w:rPr>
+              <w:t xml:space="preserve">Cada libro enlaza a cinco tiendas (enlaces de búsqueda)</w:t>
+            </w:r>
+          </w:p>
+        </w:tc>
+        <w:tc>
+          <w:tcPr>
+            <w:tcW w:w="1000" w:type="dxa"/>
+            <w:tcMar>
+              <w:top w:w="80" w:type="dxa"/>
+              <w:left w:w="100" w:type="dxa"/>
+              <w:bottom w:w="80" w:type="dxa"/>
+              <w:right w:w="100" w:type="dxa"/>
+            </w:tcMar>
+          </w:tcPr>
+          <w:p>
+            <w:pPr>
+              <w:keepNext/>
+            </w:pPr>
+            <w:r>
+              <w:rPr>
+                <w:color w:val="000000"/>
+                <w:sz w:val="20"/>
+                <w:szCs w:val="20"/>
+              </w:rPr>
+              <w:t xml:space="preserve">2</w:t>
+            </w:r>
+          </w:p>
+        </w:tc>
+      </w:tr>
+      <w:tr>
+        <w:tblPrEx>
+          <w:tblCellMar>
+            <w:top w:w="0" w:type="dxa"/>
+            <w:bottom w:w="0" w:type="dxa"/>
+          </w:tblCellMar>
+        </w:tblPrEx>
+        <w:trPr>
+          <w:cantSplit/>
+          <w:jc w:val="center"/>
+        </w:trPr>
+        <w:tc>
+          <w:tcPr>
+            <w:tcW w:w="1900" w:type="dxa"/>
+            <w:tcMar>
+              <w:top w:w="80" w:type="dxa"/>
+              <w:left w:w="100" w:type="dxa"/>
+              <w:bottom w:w="80" w:type="dxa"/>
+              <w:right w:w="100" w:type="dxa"/>
+            </w:tcMar>
+          </w:tcPr>
+          <w:p>
+            <w:pPr>
+              <w:keepNext/>
+            </w:pPr>
+            <w:r>
+              <w:rPr>
+                <w:color w:val="000000"/>
+                <w:sz w:val="20"/>
+                <w:szCs w:val="20"/>
+              </w:rPr>
+              <w:t xml:space="preserve">Parejas patrocinadas</w:t>
+            </w:r>
+          </w:p>
+        </w:tc>
+        <w:tc>
+          <w:tcPr>
+            <w:tcW w:w="4100" w:type="dxa"/>
+            <w:tcMar>
+              <w:top w:w="80" w:type="dxa"/>
+              <w:left w:w="100" w:type="dxa"/>
+              <w:bottom w:w="80" w:type="dxa"/>
+              <w:right w:w="100" w:type="dxa"/>
+            </w:tcMar>
+          </w:tcPr>
+          <w:p>
+            <w:pPr>
+              <w:keepNext/>
+            </w:pPr>
+            <w:r>
+              <w:rPr>
+                <w:color w:val="000000"/>
+                <w:sz w:val="20"/>
+                <w:szCs w:val="20"/>
+              </w:rPr>
+              <w:t xml:space="preserve">Una editorial o sello promueve una pareja libro–banda en Inicio, siempre etiquetada como patrocinada y sin alterar el ranking del chat</w:t>
+            </w:r>
+          </w:p>
+        </w:tc>
+        <w:tc>
+          <w:tcPr>
+            <w:tcW w:w="3000" w:type="dxa"/>
+            <w:tcMar>
+              <w:top w:w="80" w:type="dxa"/>
+              <w:left w:w="100" w:type="dxa"/>
+              <w:bottom w:w="80" w:type="dxa"/>
+              <w:right w:w="100" w:type="dxa"/>
+            </w:tcMar>
+          </w:tcPr>
+          <w:p>
+            <w:pPr>
+              <w:keepNext/>
+            </w:pPr>
+            <w:r>
+              <w:rPr>
+                <w:color w:val="000000"/>
+                <w:sz w:val="20"/>
+                <w:szCs w:val="20"/>
+              </w:rPr>
+              <w:t xml:space="preserve">Sección “Parejas destacadas”</w:t>
+            </w:r>
+          </w:p>
+        </w:tc>
+        <w:tc>
+          <w:tcPr>
+            <w:tcW w:w="1000" w:type="dxa"/>
+            <w:tcMar>
+              <w:top w:w="80" w:type="dxa"/>
+              <w:left w:w="100" w:type="dxa"/>
+              <w:bottom w:w="80" w:type="dxa"/>
+              <w:right w:w="100" w:type="dxa"/>
+            </w:tcMar>
+          </w:tcPr>
+          <w:p>
+            <w:pPr>
+              <w:keepNext/>
+            </w:pPr>
+            <w:r>
+              <w:rPr>
+                <w:color w:val="000000"/>
+                <w:sz w:val="20"/>
+                <w:szCs w:val="20"/>
+              </w:rPr>
+              <w:t xml:space="preserve">3</w:t>
+            </w:r>
+          </w:p>
+        </w:tc>
+      </w:tr>
+      <w:tr>
+        <w:tblPrEx>
+          <w:tblCellMar>
+            <w:top w:w="0" w:type="dxa"/>
+            <w:bottom w:w="0" w:type="dxa"/>
+          </w:tblCellMar>
+        </w:tblPrEx>
+        <w:trPr>
+          <w:cantSplit/>
+          <w:jc w:val="center"/>
+        </w:trPr>
+        <w:tc>
+          <w:tcPr>
+            <w:tcW w:w="1900" w:type="dxa"/>
+            <w:tcMar>
+              <w:top w:w="80" w:type="dxa"/>
+              <w:left w:w="100" w:type="dxa"/>
+              <w:bottom w:w="80" w:type="dxa"/>
+              <w:right w:w="100" w:type="dxa"/>
+            </w:tcMar>
+          </w:tcPr>
+          <w:p>
+            <w:pPr>
+              <w:keepNext/>
+            </w:pPr>
+            <w:r>
+              <w:rPr>
+                <w:color w:val="000000"/>
+                <w:sz w:val="20"/>
+                <w:szCs w:val="20"/>
+              </w:rPr>
+              <w:t xml:space="preserve">Reportes de afinidad</w:t>
+            </w:r>
+          </w:p>
+        </w:tc>
+        <w:tc>
+          <w:tcPr>
+            <w:tcW w:w="4100" w:type="dxa"/>
+            <w:tcMar>
+              <w:top w:w="80" w:type="dxa"/>
+              <w:left w:w="100" w:type="dxa"/>
+              <w:bottom w:w="80" w:type="dxa"/>
+              <w:right w:w="100" w:type="dxa"/>
+            </w:tcMar>
+          </w:tcPr>
+          <w:p>
+            <w:pPr>
+              <w:keepNext/>
+            </w:pPr>
+            <w:r>
+              <w:rPr>
+                <w:color w:val="000000"/>
+                <w:sz w:val="20"/>
+                <w:szCs w:val="20"/>
+              </w:rPr>
+              <w:t xml:space="preserve">Tendencias agregadas y anónimas (qué subgéneros combinan con qué categorías) para lanzamientos, mercancía o giras</w:t>
+            </w:r>
+          </w:p>
+        </w:tc>
+        <w:tc>
+          <w:tcPr>
+            <w:tcW w:w="3000" w:type="dxa"/>
+            <w:tcMar>
+              <w:top w:w="80" w:type="dxa"/>
+              <w:left w:w="100" w:type="dxa"/>
+              <w:bottom w:w="80" w:type="dxa"/>
+              <w:right w:w="100" w:type="dxa"/>
+            </w:tcMar>
+          </w:tcPr>
+          <w:p>
+            <w:pPr>
+              <w:keepNext/>
+            </w:pPr>
+            <w:r>
+              <w:rPr>
+                <w:color w:val="000000"/>
+                <w:sz w:val="20"/>
+                <w:szCs w:val="20"/>
+              </w:rPr>
+              <w:t xml:space="preserve">La matriz de similitud; falta registrar consultas de forma anónima</w:t>
+            </w:r>
+          </w:p>
+        </w:tc>
+        <w:tc>
+          <w:tcPr>
+            <w:tcW w:w="1000" w:type="dxa"/>
+            <w:tcMar>
+              <w:top w:w="80" w:type="dxa"/>
+              <w:left w:w="100" w:type="dxa"/>
+              <w:bottom w:w="80" w:type="dxa"/>
+              <w:right w:w="100" w:type="dxa"/>
+            </w:tcMar>
+          </w:tcPr>
+          <w:p>
+            <w:pPr>
+              <w:keepNext/>
+            </w:pPr>
+            <w:r>
+              <w:rPr>
+                <w:color w:val="000000"/>
+                <w:sz w:val="20"/>
+                <w:szCs w:val="20"/>
+              </w:rPr>
+              <w:t xml:space="preserve">3</w:t>
+            </w:r>
+          </w:p>
+        </w:tc>
+      </w:tr>
+      <w:tr>
+        <w:tblPrEx>
+          <w:tblCellMar>
+            <w:top w:w="0" w:type="dxa"/>
+            <w:bottom w:w="0" w:type="dxa"/>
+          </w:tblCellMar>
+        </w:tblPrEx>
+        <w:trPr>
+          <w:cantSplit/>
+          <w:jc w:val="center"/>
+        </w:trPr>
+        <w:tc>
+          <w:tcPr>
+            <w:tcW w:w="1900" w:type="dxa"/>
+            <w:tcMar>
+              <w:top w:w="80" w:type="dxa"/>
+              <w:left w:w="100" w:type="dxa"/>
+              <w:bottom w:w="80" w:type="dxa"/>
+              <w:right w:w="100" w:type="dxa"/>
+            </w:tcMar>
+          </w:tcPr>
+          <w:p>
+            <w:pPr>
+              <w:keepNext/>
+            </w:pPr>
+            <w:r>
+              <w:rPr>
+                <w:color w:val="000000"/>
+                <w:sz w:val="20"/>
+                <w:szCs w:val="20"/>
+              </w:rPr>
+              <w:t xml:space="preserve">Plan premium</w:t>
+            </w:r>
+          </w:p>
+        </w:tc>
+        <w:tc>
+          <w:tcPr>
+            <w:tcW w:w="4100" w:type="dxa"/>
+            <w:tcMar>
+              <w:top w:w="80" w:type="dxa"/>
+              <w:left w:w="100" w:type="dxa"/>
+              <w:bottom w:w="80" w:type="dxa"/>
+              <w:right w:w="100" w:type="dxa"/>
+            </w:tcMar>
+          </w:tcPr>
+          <w:p>
+            <w:pPr>
+              <w:keepNext/>
+            </w:pPr>
+            <w:r>
+              <w:rPr>
+                <w:color w:val="000000"/>
+                <w:sz w:val="20"/>
+                <w:szCs w:val="20"/>
+              </w:rPr>
+              <w:t xml:space="preserve">Sin publicidad, con listas de lectura y playlists guardadas</w:t>
+            </w:r>
+          </w:p>
+        </w:tc>
+        <w:tc>
+          <w:tcPr>
+            <w:tcW w:w="3000" w:type="dxa"/>
+            <w:tcMar>
+              <w:top w:w="80" w:type="dxa"/>
+              <w:left w:w="100" w:type="dxa"/>
+              <w:bottom w:w="80" w:type="dxa"/>
+              <w:right w:w="100" w:type="dxa"/>
+            </w:tcMar>
+          </w:tcPr>
+          <w:p>
+            <w:pPr>
+              <w:keepNext/>
+            </w:pPr>
+            <w:r>
+              <w:rPr>
+                <w:color w:val="000000"/>
+                <w:sz w:val="20"/>
+                <w:szCs w:val="20"/>
+              </w:rPr>
+              <w:t xml:space="preserve">La memoria de conversación</w:t>
+            </w:r>
+          </w:p>
+        </w:tc>
+        <w:tc>
+          <w:tcPr>
+            <w:tcW w:w="1000" w:type="dxa"/>
+            <w:tcMar>
+              <w:top w:w="80" w:type="dxa"/>
+              <w:left w:w="100" w:type="dxa"/>
+              <w:bottom w:w="80" w:type="dxa"/>
+              <w:right w:w="100" w:type="dxa"/>
+            </w:tcMar>
+          </w:tcPr>
+          <w:p>
+            <w:pPr>
+              <w:keepNext/>
+            </w:pPr>
+            <w:r>
+              <w:rPr>
+                <w:color w:val="000000"/>
+                <w:sz w:val="20"/>
+                <w:szCs w:val="20"/>
+              </w:rPr>
+              <w:t xml:space="preserve">4</w:t>
+            </w:r>
+          </w:p>
+        </w:tc>
+      </w:tr>
+    </w:tbl>
+    <w:p>
+      <w:pPr>
+        <w:spacing w:after="240"/>
+      </w:pPr>
+      <w:r>
+        <w:rPr>
+          <w:i/>
+          <w:iCs/>
+          <w:color w:val="555555"/>
+          <w:sz w:val="18"/>
+          <w:szCs w:val="18"/>
+        </w:rPr>
+        <w:t xml:space="preserve">Tabla 3. Fuentes de ingreso propuestas, su funcionamiento y la fase en que se activarían.</w:t>
+      </w:r>
+    </w:p>
+    <w:p>
+      <w:pPr>
+        <w:keepNext/>
+        <w:spacing w:after="160"/>
+        <w:jc w:val="both"/>
+      </w:pPr>
+      <w:r>
+        <w:rPr>
+          <w:b/>
+          <w:bCs/>
+        </w:rPr>
+        <w:t xml:space="preserve">Plan de lanzamiento.</w:t>
+      </w:r>
+      <w:r>
+        <w:t xml:space="preserve"> La Tabla 4 ordena las acciones en cuatro fases; cada una tiene una métrica que decide si se avanza a la siguiente.</w:t>
+      </w:r>
+    </w:p>
+    <w:tbl>
+      <w:tblPr>
+        <w:tblW w:w="10000" w:type="dxa"/>
+        <w:jc w:val="center"/>
+        <w:tblBorders>
+          <w:top w:val="single" w:sz="4" w:space="0" w:color="auto"/>
+          <w:left w:val="single" w:sz="4" w:space="0" w:color="auto"/>
+          <w:bottom w:val="single" w:sz="4" w:space="0" w:color="auto"/>
+          <w:right w:val="single" w:sz="4" w:space="0" w:color="auto"/>
+          <w:insideH w:val="single" w:sz="4" w:space="0" w:color="auto"/>
+          <w:insideV w:val="single" w:sz="4" w:space="0" w:color="auto"/>
+        </w:tblBorders>
+        <w:tblCellMar>
+          <w:left w:w="10" w:type="dxa"/>
+          <w:right w:w="10" w:type="dxa"/>
+        </w:tblCellMar>
+        <w:tblLook w:val="04A0" w:firstRow="1" w:lastRow="0" w:firstColumn="1" w:lastColumn="0" w:noHBand="0" w:noVBand="1"/>
+      </w:tblPr>
+      <w:tblGrid>
+        <w:gridCol w:w="1800"/>
+        <w:gridCol w:w="2200"/>
+        <w:gridCol w:w="3800"/>
+        <w:gridCol w:w="2200"/>
+      </w:tblGrid>
+      <w:tr>
+        <w:tblPrEx>
+          <w:tblCellMar>
+            <w:top w:w="0" w:type="dxa"/>
+            <w:bottom w:w="0" w:type="dxa"/>
+          </w:tblCellMar>
+        </w:tblPrEx>
+        <w:trPr>
+          <w:cantSplit/>
+          <w:tblHeader/>
+          <w:jc w:val="center"/>
+        </w:trPr>
+        <w:tc>
+          <w:tcPr>
+            <w:tcW w:w="1800" w:type="dxa"/>
+            <w:shd w:val="clear" w:color="auto" w:fill="6B2D5C"/>
+            <w:tcMar>
+              <w:top w:w="80" w:type="dxa"/>
+              <w:left w:w="100" w:type="dxa"/>
+              <w:bottom w:w="80" w:type="dxa"/>
+              <w:right w:w="100" w:type="dxa"/>
+            </w:tcMar>
+            <w:vAlign w:val="center"/>
+          </w:tcPr>
+          <w:p>
+            <w:pPr>
+              <w:keepNext/>
+              <w:jc w:val="center"/>
+            </w:pPr>
+            <w:r>
+              <w:rPr>
+                <w:b/>
+                <w:bCs/>
+                <w:color w:val="FFFFFF"/>
+                <w:sz w:val="20"/>
+                <w:szCs w:val="20"/>
+              </w:rPr>
+              <w:t xml:space="preserve">Fase</w:t>
+            </w:r>
+          </w:p>
+        </w:tc>
+        <w:tc>
+          <w:tcPr>
+            <w:tcW w:w="2200" w:type="dxa"/>
+            <w:shd w:val="clear" w:color="auto" w:fill="6B2D5C"/>
+            <w:tcMar>
+              <w:top w:w="80" w:type="dxa"/>
+              <w:left w:w="100" w:type="dxa"/>
+              <w:bottom w:w="80" w:type="dxa"/>
+              <w:right w:w="100" w:type="dxa"/>
+            </w:tcMar>
+            <w:vAlign w:val="center"/>
+          </w:tcPr>
+          <w:p>
+            <w:pPr>
+              <w:keepNext/>
+              <w:jc w:val="center"/>
+            </w:pPr>
+            <w:r>
+              <w:rPr>
+                <w:b/>
+                <w:bCs/>
+                <w:color w:val="FFFFFF"/>
+                <w:sz w:val="20"/>
+                <w:szCs w:val="20"/>
+              </w:rPr>
+              <w:t xml:space="preserve">Objetivo</w:t>
+            </w:r>
+          </w:p>
+        </w:tc>
+        <w:tc>
+          <w:tcPr>
+            <w:tcW w:w="3800" w:type="dxa"/>
+            <w:shd w:val="clear" w:color="auto" w:fill="6B2D5C"/>
+            <w:tcMar>
+              <w:top w:w="80" w:type="dxa"/>
+              <w:left w:w="100" w:type="dxa"/>
+              <w:bottom w:w="80" w:type="dxa"/>
+              <w:right w:w="100" w:type="dxa"/>
+            </w:tcMar>
+            <w:vAlign w:val="center"/>
+          </w:tcPr>
+          <w:p>
+            <w:pPr>
+              <w:keepNext/>
+              <w:jc w:val="center"/>
+            </w:pPr>
+            <w:r>
+              <w:rPr>
+                <w:b/>
+                <w:bCs/>
+                <w:color w:val="FFFFFF"/>
+                <w:sz w:val="20"/>
+                <w:szCs w:val="20"/>
+              </w:rPr>
+              <w:t xml:space="preserve">Acciones</w:t>
+            </w:r>
+          </w:p>
+        </w:tc>
+        <w:tc>
+          <w:tcPr>
+            <w:tcW w:w="2200" w:type="dxa"/>
+            <w:shd w:val="clear" w:color="auto" w:fill="6B2D5C"/>
+            <w:tcMar>
+              <w:top w:w="80" w:type="dxa"/>
+              <w:left w:w="100" w:type="dxa"/>
+              <w:bottom w:w="80" w:type="dxa"/>
+              <w:right w:w="100" w:type="dxa"/>
+            </w:tcMar>
+            <w:vAlign w:val="center"/>
+          </w:tcPr>
+          <w:p>
+            <w:pPr>
+              <w:keepNext/>
+              <w:jc w:val="center"/>
+            </w:pPr>
+            <w:r>
+              <w:rPr>
+                <w:b/>
+                <w:bCs/>
+                <w:color w:val="FFFFFF"/>
+                <w:sz w:val="20"/>
+                <w:szCs w:val="20"/>
+              </w:rPr>
+              <w:t xml:space="preserve">Métrica para avanzar</w:t>
+            </w:r>
+          </w:p>
+        </w:tc>
+      </w:tr>
+      <w:tr>
+        <w:tblPrEx>
+          <w:tblCellMar>
+            <w:top w:w="0" w:type="dxa"/>
+            <w:bottom w:w="0" w:type="dxa"/>
+          </w:tblCellMar>
+        </w:tblPrEx>
+        <w:trPr>
+          <w:cantSplit/>
+          <w:jc w:val="center"/>
+        </w:trPr>
+        <w:tc>
+          <w:tcPr>
+            <w:tcW w:w="1800" w:type="dxa"/>
+            <w:tcMar>
+              <w:top w:w="80" w:type="dxa"/>
+              <w:left w:w="100" w:type="dxa"/>
+              <w:bottom w:w="80" w:type="dxa"/>
+              <w:right w:w="100" w:type="dxa"/>
+            </w:tcMar>
+          </w:tcPr>
+          <w:p>
+            <w:pPr>
+              <w:keepNext/>
+            </w:pPr>
+            <w:r>
+              <w:rPr>
+                <w:color w:val="000000"/>
+                <w:sz w:val="20"/>
+                <w:szCs w:val="20"/>
+              </w:rPr>
+              <w:t xml:space="preserve">1. Validación (actual)</w:t>
+            </w:r>
+          </w:p>
+        </w:tc>
+        <w:tc>
+          <w:tcPr>
+            <w:tcW w:w="2200" w:type="dxa"/>
+            <w:tcMar>
+              <w:top w:w="80" w:type="dxa"/>
+              <w:left w:w="100" w:type="dxa"/>
+              <w:bottom w:w="80" w:type="dxa"/>
+              <w:right w:w="100" w:type="dxa"/>
+            </w:tcMar>
+          </w:tcPr>
+          <w:p>
+            <w:pPr>
+              <w:keepNext/>
+            </w:pPr>
+            <w:r>
+              <w:rPr>
+                <w:color w:val="000000"/>
+                <w:sz w:val="20"/>
+                <w:szCs w:val="20"/>
+              </w:rPr>
+              <w:t xml:space="preserve">Comprobar que la app se entiende y se usa</w:t>
+            </w:r>
+          </w:p>
+        </w:tc>
+        <w:tc>
+          <w:tcPr>
+            <w:tcW w:w="3800" w:type="dxa"/>
+            <w:tcMar>
+              <w:top w:w="80" w:type="dxa"/>
+              <w:left w:w="100" w:type="dxa"/>
+              <w:bottom w:w="80" w:type="dxa"/>
+              <w:right w:w="100" w:type="dxa"/>
+            </w:tcMar>
+          </w:tcPr>
+          <w:p>
+            <w:pPr>
+              <w:keepNext/>
+            </w:pPr>
+            <w:r>
+              <w:rPr>
+                <w:color w:val="000000"/>
+                <w:sz w:val="20"/>
+                <w:szCs w:val="20"/>
+              </w:rPr>
+              <w:t xml:space="preserve">Prototipo en Gradio; demostraciones en vivo</w:t>
+            </w:r>
+          </w:p>
+        </w:tc>
+        <w:tc>
+          <w:tcPr>
+            <w:tcW w:w="2200" w:type="dxa"/>
+            <w:tcMar>
+              <w:top w:w="80" w:type="dxa"/>
+              <w:left w:w="100" w:type="dxa"/>
+              <w:bottom w:w="80" w:type="dxa"/>
+              <w:right w:w="100" w:type="dxa"/>
+            </w:tcMar>
+          </w:tcPr>
+          <w:p>
+            <w:pPr>
+              <w:keepNext/>
+            </w:pPr>
+            <w:r>
+              <w:rPr>
+                <w:color w:val="000000"/>
+                <w:sz w:val="20"/>
+                <w:szCs w:val="20"/>
+              </w:rPr>
+              <w:t xml:space="preserve">Clics en “Escucha la banda” y en tiendas; sugerencias recibidas</w:t>
+            </w:r>
+          </w:p>
+        </w:tc>
+      </w:tr>
+      <w:tr>
+        <w:tblPrEx>
+          <w:tblCellMar>
+            <w:top w:w="0" w:type="dxa"/>
+            <w:bottom w:w="0" w:type="dxa"/>
+          </w:tblCellMar>
+        </w:tblPrEx>
+        <w:trPr>
+          <w:cantSplit/>
+          <w:jc w:val="center"/>
+        </w:trPr>
+        <w:tc>
+          <w:tcPr>
+            <w:tcW w:w="1800" w:type="dxa"/>
+            <w:tcMar>
+              <w:top w:w="80" w:type="dxa"/>
+              <w:left w:w="100" w:type="dxa"/>
+              <w:bottom w:w="80" w:type="dxa"/>
+              <w:right w:w="100" w:type="dxa"/>
+            </w:tcMar>
+          </w:tcPr>
+          <w:p>
+            <w:pPr>
+              <w:keepNext/>
+            </w:pPr>
+            <w:r>
+              <w:rPr>
+                <w:color w:val="000000"/>
+                <w:sz w:val="20"/>
+                <w:szCs w:val="20"/>
+              </w:rPr>
+              <w:t xml:space="preserve">2. Lanzamiento</w:t>
+            </w:r>
+          </w:p>
+        </w:tc>
+        <w:tc>
+          <w:tcPr>
+            <w:tcW w:w="2200" w:type="dxa"/>
+            <w:tcMar>
+              <w:top w:w="80" w:type="dxa"/>
+              <w:left w:w="100" w:type="dxa"/>
+              <w:bottom w:w="80" w:type="dxa"/>
+              <w:right w:w="100" w:type="dxa"/>
+            </w:tcMar>
+          </w:tcPr>
+          <w:p>
+            <w:pPr>
+              <w:keepNext/>
+            </w:pPr>
+            <w:r>
+              <w:rPr>
+                <w:color w:val="000000"/>
+                <w:sz w:val="20"/>
+                <w:szCs w:val="20"/>
+              </w:rPr>
+              <w:t xml:space="preserve">Formar una comunidad inicial</w:t>
+            </w:r>
+          </w:p>
+        </w:tc>
+        <w:tc>
+          <w:tcPr>
+            <w:tcW w:w="3800" w:type="dxa"/>
+            <w:tcMar>
+              <w:top w:w="80" w:type="dxa"/>
+              <w:left w:w="100" w:type="dxa"/>
+              <w:bottom w:w="80" w:type="dxa"/>
+              <w:right w:w="100" w:type="dxa"/>
+            </w:tcMar>
+          </w:tcPr>
+          <w:p>
+            <w:pPr>
+              <w:keepNext/>
+            </w:pPr>
+            <w:r>
+              <w:rPr>
+                <w:color w:val="000000"/>
+                <w:sz w:val="20"/>
+                <w:szCs w:val="20"/>
+              </w:rPr>
+              <w:t xml:space="preserve">Alojamiento permanente; foco en los subgéneros más coherentes (gótico, black y power metal); contenido de parejas en redes; alianzas con creadores</w:t>
+            </w:r>
+          </w:p>
+        </w:tc>
+        <w:tc>
+          <w:tcPr>
+            <w:tcW w:w="2200" w:type="dxa"/>
+            <w:tcMar>
+              <w:top w:w="80" w:type="dxa"/>
+              <w:left w:w="100" w:type="dxa"/>
+              <w:bottom w:w="80" w:type="dxa"/>
+              <w:right w:w="100" w:type="dxa"/>
+            </w:tcMar>
+          </w:tcPr>
+          <w:p>
+            <w:pPr>
+              <w:keepNext/>
+            </w:pPr>
+            <w:r>
+              <w:rPr>
+                <w:color w:val="000000"/>
+                <w:sz w:val="20"/>
+                <w:szCs w:val="20"/>
+              </w:rPr>
+              <w:t xml:space="preserve">Usuarios que regresan; parejas compartidas</w:t>
+            </w:r>
+          </w:p>
+        </w:tc>
+      </w:tr>
+      <w:tr>
+        <w:tblPrEx>
+          <w:tblCellMar>
+            <w:top w:w="0" w:type="dxa"/>
+            <w:bottom w:w="0" w:type="dxa"/>
+          </w:tblCellMar>
+        </w:tblPrEx>
+        <w:trPr>
+          <w:cantSplit/>
+          <w:jc w:val="center"/>
+        </w:trPr>
+        <w:tc>
+          <w:tcPr>
+            <w:tcW w:w="1800" w:type="dxa"/>
+            <w:tcMar>
+              <w:top w:w="80" w:type="dxa"/>
+              <w:left w:w="100" w:type="dxa"/>
+              <w:bottom w:w="80" w:type="dxa"/>
+              <w:right w:w="100" w:type="dxa"/>
+            </w:tcMar>
+          </w:tcPr>
+          <w:p>
+            <w:pPr>
+              <w:keepNext/>
+            </w:pPr>
+            <w:r>
+              <w:rPr>
+                <w:color w:val="000000"/>
+                <w:sz w:val="20"/>
+                <w:szCs w:val="20"/>
+              </w:rPr>
+              <w:t xml:space="preserve">3. Monetización</w:t>
+            </w:r>
+          </w:p>
+        </w:tc>
+        <w:tc>
+          <w:tcPr>
+            <w:tcW w:w="2200" w:type="dxa"/>
+            <w:tcMar>
+              <w:top w:w="80" w:type="dxa"/>
+              <w:left w:w="100" w:type="dxa"/>
+              <w:bottom w:w="80" w:type="dxa"/>
+              <w:right w:w="100" w:type="dxa"/>
+            </w:tcMar>
+          </w:tcPr>
+          <w:p>
+            <w:pPr>
+              <w:keepNext/>
+            </w:pPr>
+            <w:r>
+              <w:rPr>
+                <w:color w:val="000000"/>
+                <w:sz w:val="20"/>
+                <w:szCs w:val="20"/>
+              </w:rPr>
+              <w:t xml:space="preserve">Primeros ingresos</w:t>
+            </w:r>
+          </w:p>
+        </w:tc>
+        <w:tc>
+          <w:tcPr>
+            <w:tcW w:w="3800" w:type="dxa"/>
+            <w:tcMar>
+              <w:top w:w="80" w:type="dxa"/>
+              <w:left w:w="100" w:type="dxa"/>
+              <w:bottom w:w="80" w:type="dxa"/>
+              <w:right w:w="100" w:type="dxa"/>
+            </w:tcMar>
+          </w:tcPr>
+          <w:p>
+            <w:pPr>
+              <w:keepNext/>
+            </w:pPr>
+            <w:r>
+              <w:rPr>
+                <w:color w:val="000000"/>
+                <w:sz w:val="20"/>
+                <w:szCs w:val="20"/>
+              </w:rPr>
+              <w:t xml:space="preserve">Afiliación formal con tiendas; parejas patrocinadas etiquetadas</w:t>
+            </w:r>
+          </w:p>
+        </w:tc>
+        <w:tc>
+          <w:tcPr>
+            <w:tcW w:w="2200" w:type="dxa"/>
+            <w:tcMar>
+              <w:top w:w="80" w:type="dxa"/>
+              <w:left w:w="100" w:type="dxa"/>
+              <w:bottom w:w="80" w:type="dxa"/>
+              <w:right w:w="100" w:type="dxa"/>
+            </w:tcMar>
+          </w:tcPr>
+          <w:p>
+            <w:pPr>
+              <w:keepNext/>
+            </w:pPr>
+            <w:r>
+              <w:rPr>
+                <w:color w:val="000000"/>
+                <w:sz w:val="20"/>
+                <w:szCs w:val="20"/>
+              </w:rPr>
+              <w:t xml:space="preserve">Ventas por afiliación; campañas vendidas</w:t>
+            </w:r>
+          </w:p>
+        </w:tc>
+      </w:tr>
+      <w:tr>
+        <w:tblPrEx>
+          <w:tblCellMar>
+            <w:top w:w="0" w:type="dxa"/>
+            <w:bottom w:w="0" w:type="dxa"/>
+          </w:tblCellMar>
+        </w:tblPrEx>
+        <w:trPr>
+          <w:cantSplit/>
+          <w:jc w:val="center"/>
+        </w:trPr>
+        <w:tc>
+          <w:tcPr>
+            <w:tcW w:w="1800" w:type="dxa"/>
+            <w:tcMar>
+              <w:top w:w="80" w:type="dxa"/>
+              <w:left w:w="100" w:type="dxa"/>
+              <w:bottom w:w="80" w:type="dxa"/>
+              <w:right w:w="100" w:type="dxa"/>
+            </w:tcMar>
+          </w:tcPr>
+          <w:p>
+            <w:pPr>
+              <w:keepNext/>
+            </w:pPr>
+            <w:r>
+              <w:rPr>
+                <w:color w:val="000000"/>
+                <w:sz w:val="20"/>
+                <w:szCs w:val="20"/>
+              </w:rPr>
+              <w:t xml:space="preserve">4. Escala</w:t>
+            </w:r>
+          </w:p>
+        </w:tc>
+        <w:tc>
+          <w:tcPr>
+            <w:tcW w:w="2200" w:type="dxa"/>
+            <w:tcMar>
+              <w:top w:w="80" w:type="dxa"/>
+              <w:left w:w="100" w:type="dxa"/>
+              <w:bottom w:w="80" w:type="dxa"/>
+              <w:right w:w="100" w:type="dxa"/>
+            </w:tcMar>
+          </w:tcPr>
+          <w:p>
+            <w:pPr>
+              <w:keepNext/>
+            </w:pPr>
+            <w:r>
+              <w:rPr>
+                <w:color w:val="000000"/>
+                <w:sz w:val="20"/>
+                <w:szCs w:val="20"/>
+              </w:rPr>
+              <w:t xml:space="preserve">Más catálogo y más públicos</w:t>
+            </w:r>
+          </w:p>
+        </w:tc>
+        <w:tc>
+          <w:tcPr>
+            <w:tcW w:w="3800" w:type="dxa"/>
+            <w:tcMar>
+              <w:top w:w="80" w:type="dxa"/>
+              <w:left w:w="100" w:type="dxa"/>
+              <w:bottom w:w="80" w:type="dxa"/>
+              <w:right w:w="100" w:type="dxa"/>
+            </w:tcMar>
+          </w:tcPr>
+          <w:p>
+            <w:pPr>
+              <w:keepNext/>
+            </w:pPr>
+            <w:r>
+              <w:rPr>
+                <w:color w:val="000000"/>
+                <w:sz w:val="20"/>
+                <w:szCs w:val="20"/>
+              </w:rPr>
+              <w:t xml:space="preserve">Catálogo ampliado con sugerencias; nuevos pares de evaluación; otros géneros e idiomas</w:t>
+            </w:r>
+          </w:p>
+        </w:tc>
+        <w:tc>
+          <w:tcPr>
+            <w:tcW w:w="2200" w:type="dxa"/>
+            <w:tcMar>
+              <w:top w:w="80" w:type="dxa"/>
+              <w:left w:w="100" w:type="dxa"/>
+              <w:bottom w:w="80" w:type="dxa"/>
+              <w:right w:w="100" w:type="dxa"/>
+            </w:tcMar>
+          </w:tcPr>
+          <w:p>
+            <w:pPr>
+              <w:keepNext/>
+            </w:pPr>
+            <w:r>
+              <w:rPr>
+                <w:color w:val="000000"/>
+                <w:sz w:val="20"/>
+                <w:szCs w:val="20"/>
+              </w:rPr>
+              <w:t xml:space="preserve">Tamaño del catálogo; Recall@10 y concentración de hubs</w:t>
+            </w:r>
+          </w:p>
+        </w:tc>
+      </w:tr>
+    </w:tbl>
+    <w:p>
+      <w:pPr>
+        <w:spacing w:after="240"/>
+      </w:pPr>
+      <w:r>
+        <w:rPr>
+          <w:i/>
+          <w:iCs/>
+          <w:color w:val="555555"/>
+          <w:sz w:val="18"/>
+          <w:szCs w:val="18"/>
+        </w:rPr>
+        <w:t xml:space="preserve">Tabla 4. Plan de lanzamiento por fases.</w:t>
+      </w:r>
+    </w:p>
+    <w:p>
+      <w:pPr>
+        <w:spacing w:after="160"/>
+        <w:jc w:val="both"/>
+      </w:pPr>
+      <w:r>
+        <w:rPr>
+          <w:b/>
+          <w:bCs/>
+        </w:rPr>
+        <w:t xml:space="preserve">Costos.</w:t>
+      </w:r>
+      <w:r>
+        <w:t xml:space="preserve"> La operación es ligera: los datos vienen de APIs públicas gratuitas, el modelo de embeddings corre sin costo por consulta y las recomendaciones del catálogo están precalculadas. El costo variable principal es el LLM, que se cobra por mensaje; lo amortiguan el respaldo gratuito (Groq) y la respuesta sin LLM. A eso se suma el alojamiento a partir de la fase 2.</w:t>
+      </w:r>
+    </w:p>
+    <w:p>
+      <w:pPr>
+        <w:spacing w:after="160"/>
+        <w:jc w:val="both"/>
+      </w:pPr>
+      <w:r>
+        <w:rPr>
+          <w:b/>
+          <w:bCs/>
+        </w:rPr>
+        <w:t xml:space="preserve">Ventaja competitiva.</w:t>
+      </w:r>
+      <w:r>
+        <w:t xml:space="preserve"> El código se puede imitar; lo difícil de copiar es el catálogo curado con sus 105 pares de evaluación, la corrección de hubness que evita que dominen siempre los mismos títulos, la explicación de cada recomendación y, con el tiempo, la comunidad: cada sugerencia validada mejora el catálogo y la evaluación del modelo.</w:t>
+      </w:r>
+    </w:p>
+    <w:p>
+      <w:pPr>
+        <w:keepNext/>
+        <w:spacing w:after="160"/>
+        <w:jc w:val="both"/>
+      </w:pPr>
+      <w:r>
+        <w:rPr>
+          <w:b/>
+          <w:bCs/>
+        </w:rPr>
+        <w:t xml:space="preserve">Riesgos y cómo se mitigan:</w:t>
+      </w:r>
+    </w:p>
+    <w:p>
+      <w:pPr>
+        <w:pStyle w:val="ListParagraph"/>
+        <w:numPr>
+          <w:ilvl w:val="0"/>
+          <w:numId w:val="2"/>
+        </w:numPr>
+        <w:spacing w:after="80"/>
+        <w:jc w:val="both"/>
+      </w:pPr>
+      <w:r>
+        <w:rPr>
+          <w:b/>
+          <w:bCs/>
+        </w:rPr>
+        <w:t xml:space="preserve">Dependencia de APIs de terceros:</w:t>
+      </w:r>
+      <w:r>
+        <w:t xml:space="preserve"> el catálogo está precalculado, así que las recomendaciones del catálogo no dependen de que MusicBrainz u Open Library respondan.</w:t>
+      </w:r>
+    </w:p>
+    <w:p>
+      <w:pPr>
+        <w:pStyle w:val="ListParagraph"/>
+        <w:numPr>
+          <w:ilvl w:val="0"/>
+          <w:numId w:val="2"/>
+        </w:numPr>
+        <w:spacing w:after="80"/>
+        <w:jc w:val="both"/>
+      </w:pPr>
+      <w:r>
+        <w:rPr>
+          <w:b/>
+          <w:bCs/>
+        </w:rPr>
+        <w:t xml:space="preserve">Costo o caída del LLM:</w:t>
+      </w:r>
+      <w:r>
+        <w:t xml:space="preserve"> respaldo automático con Groq y respuesta sin LLM.</w:t>
+      </w:r>
+    </w:p>
+    <w:p>
+      <w:pPr>
+        <w:pStyle w:val="ListParagraph"/>
+        <w:numPr>
+          <w:ilvl w:val="0"/>
+          <w:numId w:val="2"/>
+        </w:numPr>
+        <w:spacing w:after="80"/>
+        <w:jc w:val="both"/>
+      </w:pPr>
+      <w:r>
+        <w:rPr>
+          <w:b/>
+          <w:bCs/>
+        </w:rPr>
+        <w:t xml:space="preserve">Derechos de contenido:</w:t>
+      </w:r>
+      <w:r>
+        <w:t xml:space="preserve"> no se usan letras de canciones; solo reproductores oficiales de Spotify y enlaces de búsqueda a tiendas.</w:t>
+      </w:r>
+    </w:p>
+    <w:p>
+      <w:pPr>
+        <w:pStyle w:val="ListParagraph"/>
+        <w:numPr>
+          <w:ilvl w:val="0"/>
+          <w:numId w:val="2"/>
+        </w:numPr>
+        <w:spacing w:after="80"/>
+        <w:jc w:val="both"/>
+      </w:pPr>
+      <w:r>
+        <w:rPr>
+          <w:b/>
+          <w:bCs/>
+        </w:rPr>
+        <w:t xml:space="preserve">Confianza en las recomendaciones:</w:t>
+      </w:r>
+      <w:r>
+        <w:t xml:space="preserve"> el contenido patrocinado siempre se etiqueta y nunca entra al ranking; el orden lo decide el modelo.</w:t>
+      </w:r>
+    </w:p>
+    <w:p>
+      <w:pPr>
+        <w:pStyle w:val="ListParagraph"/>
+        <w:numPr>
+          <w:ilvl w:val="0"/>
+          <w:numId w:val="2"/>
+        </w:numPr>
+        <w:spacing w:after="80"/>
+        <w:jc w:val="both"/>
+      </w:pPr>
+      <w:r>
+        <w:rPr>
+          <w:b/>
+          <w:bCs/>
+        </w:rPr>
+        <w:t xml:space="preserve">Comisiones bajas:</w:t>
+      </w:r>
+      <w:r>
+        <w:t xml:space="preserve"> la estrategia no depende de una sola fuente de ingreso.</w:t>
+      </w:r>
+    </w:p>
+    <w:p>
+      <w:pPr>
         <w:pStyle w:val="Heading1"/>
       </w:pPr>
       <w:r>
@@ -1647,7 +3761,7 @@
           <w:sz w:val="18"/>
           <w:szCs w:val="18"/>
         </w:rPr>
-        <w:t>Tabla 2. Universo semilla final usado en la extracción completa.</w:t>
+        <w:t>Tabla 5. Universo semilla final usado en la extracción completa.</w:t>
       </w:r>
     </w:p>
     <w:p>
@@ -2583,7 +4697,7 @@
           <w:sz w:val="18"/>
           <w:szCs w:val="18"/>
         </w:rPr>
-        <w:t>Tabla 3. Archivos de datos finales del proyecto.</w:t>
+        <w:t>Tabla 6. Archivos de datos finales del proyecto.</w:t>
       </w:r>
     </w:p>
     <w:p>
@@ -2593,23 +4707,7 @@
       </w:pPr>
       <w:r>
         <w:lastRenderedPageBreak/>
-        <w:t>No existe un conjunto de datos público que relacione libros con música, así que los datos se construyeron a partir de dos catálogos independientes y de fuentes reconocidas por sus comunidades (</w:t>
-      </w:r>
-      <w:proofErr w:type="spellStart"/>
-      <w:r>
-        <w:t>MetaBrainz</w:t>
-      </w:r>
-      <w:proofErr w:type="spellEnd"/>
-      <w:r>
-        <w:t xml:space="preserve"> </w:t>
-      </w:r>
-      <w:proofErr w:type="spellStart"/>
-      <w:r>
-        <w:t>Foundation</w:t>
-      </w:r>
-      <w:proofErr w:type="spellEnd"/>
-      <w:r>
-        <w:t>, s.f.; Genius, s.f.; Internet Archive, s.f.; Google, s.f.), más un conjunto de pares curados a mano que funciona como referencia. En cuanto a calidad (sección 4.3): el 12.3% de las coincidencias de Genius resultó poco confiable y se marcó, el 99.1% de los libros encontró ficha bibliográfica y el 86.6% obtuvo sinopsis utilizable.</w:t>
+        <w:t xml:space="preserve">No existe un conjunto de datos público que relacione libros con música, así que los datos se construyeron a partir de dos catálogos independientes y de fuentes reconocidas por sus comunidades (MetaBrainz Foundation, s.f.; Genius, s.f.; Internet Archive, s.f.; Google, s.f.), más un conjunto de pares curados a mano que funciona como referencia. En cuanto a calidad (sección 4.3): el 12.3% de las coincidencias de Genius resultó poco confiable y se marcó, el 99.1% de los libros encontró ficha bibliográfica y el 86.6% obtuvo sinopsis utilizable.</w:t>
       </w:r>
     </w:p>
     <w:p>
@@ -3490,7 +5588,7 @@
           <w:sz w:val="18"/>
           <w:szCs w:val="18"/>
         </w:rPr>
-        <w:t>Tabla 4. Tags de MusicBrainz más frecuentes sobre las 81 bandas del universo.</w:t>
+        <w:t>Tabla 7. Tags de MusicBrainz más frecuentes sobre las 81 bandas del universo.</w:t>
       </w:r>
     </w:p>
     <w:p>
@@ -4175,7 +6273,7 @@
           <w:sz w:val="18"/>
           <w:szCs w:val="18"/>
         </w:rPr>
-        <w:t>Tabla 5. Tablas de características generadas en la fase de ingeniería de variables.</w:t>
+        <w:t>Tabla 8. Tablas de características generadas en la fase de ingeniería de variables.</w:t>
       </w:r>
     </w:p>
     <w:p>
@@ -4715,25 +6813,7 @@
                 <w:sz w:val="20"/>
                 <w:szCs w:val="20"/>
               </w:rPr>
-              <w:t xml:space="preserve">Popularidad = </w:t>
-            </w:r>
-            <w:proofErr w:type="gramStart"/>
-            <w:r>
-              <w:rPr>
-                <w:color w:val="000000"/>
-                <w:sz w:val="20"/>
-                <w:szCs w:val="20"/>
-              </w:rPr>
-              <w:t>log(</w:t>
-            </w:r>
-            <w:proofErr w:type="gramEnd"/>
-            <w:r>
-              <w:rPr>
-                <w:color w:val="000000"/>
-                <w:sz w:val="20"/>
-                <w:szCs w:val="20"/>
-              </w:rPr>
-              <w:t>1 + pageviews)</w:t>
+              <w:t xml:space="preserve">Popularidad = log(1 + pageviews)</w:t>
             </w:r>
           </w:p>
         </w:tc>
@@ -5133,7 +7213,7 @@
           <w:sz w:val="18"/>
           <w:szCs w:val="18"/>
         </w:rPr>
-        <w:t>Tabla 6. Transformaciones aplicadas a los datos y su justificación.</w:t>
+        <w:t>Tabla 9. Transformaciones aplicadas a los datos y su justificación.</w:t>
       </w:r>
     </w:p>
     <w:p>
@@ -5669,7 +7749,7 @@
           <w:sz w:val="18"/>
           <w:szCs w:val="18"/>
         </w:rPr>
-        <w:t>Tabla 7. Resultados del enfoque TF-IDF sobre los 105 pares conocidos.</w:t>
+        <w:t>Tabla 10. Resultados del enfoque TF-IDF sobre los 105 pares conocidos.</w:t>
       </w:r>
     </w:p>
     <w:p>
@@ -5696,8 +7776,6 @@
       </w:pPr>
       <w:r>
         <w:t xml:space="preserve">Para capturar similitud semántica y no solo léxica, se codificó el mismo texto con un modelo de embeddings de oración pre-entrenado y multilingüe (paraphrase-multilingual-MiniLM-L12-v2, vía la librería sentence-transformers, corrido en Google Colab por requerir descargar el modelo). No se entrena nada: el modelo ya </w:t>
-      </w:r>
-      <w:r>
         <w:lastRenderedPageBreak/>
         <w:t>viene ajustado, solo se usa para codificar texto, por lo que la decisión de no entrenar una red desde cero (7.1) se mantiene.</w:t>
       </w:r>
@@ -6147,7 +8225,7 @@
           <w:sz w:val="18"/>
           <w:szCs w:val="18"/>
         </w:rPr>
-        <w:t>Tabla 8. Resultados del enfoque de embeddings multilingües sobre los 105 pares conocidos.</w:t>
+        <w:t>Tabla 11. Resultados del enfoque de embeddings multilingües sobre los 105 pares conocidos.</w:t>
       </w:r>
     </w:p>
     <w:p>
@@ -7061,7 +9139,7 @@
           <w:sz w:val="18"/>
           <w:szCs w:val="18"/>
         </w:rPr>
-        <w:t>Tabla 9. Comparación final: embeddings sin corregir vs. con corrección de hubness, sobre los 105 pares conocidos.</w:t>
+        <w:t>Tabla 12. Comparación final: embeddings sin corregir vs. con corrección de hubness, sobre los 105 pares conocidos.</w:t>
       </w:r>
     </w:p>
     <w:p>
@@ -7447,7 +9525,7 @@
           <w:sz w:val="18"/>
           <w:szCs w:val="18"/>
         </w:rPr>
-        <w:t>Tabla 10. Ejemplos de recomendaciones finales, tras la corrección de hubness.</w:t>
+        <w:t>Tabla 13. Ejemplos de recomendaciones finales, tras la corrección de hubness.</w:t>
       </w:r>
     </w:p>
     <w:p>
@@ -8061,7 +10139,7 @@
           <w:sz w:val="18"/>
           <w:szCs w:val="18"/>
         </w:rPr>
-        <w:t>Tabla 11. Pestañas de la interfaz de Inkriff.</w:t>
+        <w:t>Tabla 14. Pestañas de la interfaz de Inkriff.</w:t>
       </w:r>
     </w:p>
     <w:p>
@@ -8209,7 +10287,7 @@
         <w:jc w:val="both"/>
       </w:pPr>
       <w:r>
-        <w:t>Una persona que escucha a Chelsea Wolfe (metal gótico) pregunta qué leer. El chat reconoce la banda en el catálogo y devuelve El castillo de Otranto, Carmilla, Drácula, El retrato de Dorian Gray y El vampiro Lestat (Tabla 10): cinco clásicos del gótico y de vampiros, cada uno con su explicación, portada y enlaces de compra. En sentido inverso, quien acaba de leer El Señor de los Anillos recibe Sabaton, Jinjer, DragonForce, Avenged Sevenfold y Judas Priest, con el reproductor de cada banda listo para escuchar.</w:t>
+        <w:t>Una persona que escucha a Chelsea Wolfe (metal gótico) pregunta qué leer. El chat reconoce la banda en el catálogo y devuelve El castillo de Otranto, Carmilla, Drácula, El retrato de Dorian Gray y El vampiro Lestat (Tabla 13): cinco clásicos del gótico y de vampiros, cada uno con su explicación, portada y enlaces de compra. En sentido inverso, quien acaba de leer El Señor de los Anillos recibe Sabaton, Jinjer, DragonForce, Avenged Sevenfold y Judas Priest, con el reproductor de cada banda listo para escuchar.</w:t>
       </w:r>
     </w:p>
     <w:p>
@@ -8324,19 +10402,7 @@
       </w:pPr>
       <w:r>
         <w:lastRenderedPageBreak/>
-        <w:t>8</w:t>
-      </w:r>
-      <w:r>
-        <w:t>.</w:t>
-      </w:r>
-      <w:r>
-        <w:t>5</w:t>
-      </w:r>
-      <w:r>
-        <w:t xml:space="preserve"> </w:t>
-      </w:r>
-      <w:r>
-        <w:t>Resultados en la interfaz</w:t>
+        <w:t xml:space="preserve">8.5 Resultados en la interfaz</w:t>
       </w:r>
     </w:p>
     <w:p>
@@ -8406,8 +10472,6 @@
             </a:graphic>
           </wp:inline>
         </w:drawing>
-      </w:r>
-      <w:r>
         <w:br/>
       </w:r>
       <w:r>
@@ -8499,8 +10563,6 @@
             </a:graphic>
           </wp:inline>
         </w:drawing>
-      </w:r>
-      <w:r>
         <w:br/>
       </w:r>
       <w:r>
@@ -8572,8 +10634,6 @@
             </a:graphic>
           </wp:inline>
         </w:drawing>
-      </w:r>
-      <w:r>
         <w:br/>
       </w:r>
       <w:r>
@@ -8645,8 +10705,6 @@
             </a:graphic>
           </wp:inline>
         </w:drawing>
-      </w:r>
-      <w:r>
         <w:br/>
       </w:r>
       <w:r>
@@ -8718,8 +10776,6 @@
             </a:graphic>
           </wp:inline>
         </w:drawing>
-      </w:r>
-      <w:r>
         <w:br/>
       </w:r>
       <w:r>
@@ -8791,8 +10847,6 @@
             </a:graphic>
           </wp:inline>
         </w:drawing>
-      </w:r>
-      <w:r>
         <w:br/>
       </w:r>
       <w:r>
@@ -9086,7 +11140,7 @@
         <w:t>Las recomendaciones finales son coherentes por subgénero</w:t>
       </w:r>
       <w:r>
-        <w:t xml:space="preserve"> (Tabla 10), que es lo que percibe el usuario.</w:t>
+        <w:t xml:space="preserve"> (Tabla 13), que es lo que percibe el usuario.</w:t>
       </w:r>
     </w:p>
     <w:p>
@@ -9105,8 +11159,6 @@
       </w:pPr>
       <w:r>
         <w:t xml:space="preserve">Al mismo tiempo, las cifras absolutas son modestas: un Recall@10 de entre 15% y 18%, medido sobre solo 105 pares, indica un modelo mejor que el azar pero lejos de uno ideal. El valor del trabajo está en la mejora </w:t>
-      </w:r>
-      <w:r>
         <w:lastRenderedPageBreak/>
         <w:t>relativa, en la coherencia cualitativa y en la transparencia de cada decisión. Para la toma de decisiones, lo prioritario es ampliar los pares de evaluación y completar las sinopsis faltantes (sección 3.4); como mejora técnica a futuro, un espacio aprendido con aprendizaje contrastivo podría acercar más los dos dominios una vez que existan suficientes pares para entrenarlo sin memorizar.</w:t>
       </w:r>
@@ -9130,80 +11182,79 @@
       <w:r>
         <w:t xml:space="preserve">Abid, A., Abdalla, A., Abid, A., Khan, D., Alfozan, A., &amp; Zou, J. (2019). </w:t>
       </w:r>
-      <w:proofErr w:type="spellStart"/>
       <w:r>
         <w:rPr>
           <w:i/>
           <w:iCs/>
           <w:lang w:val="en-US"/>
         </w:rPr>
-        <w:t>Gradio</w:t>
-      </w:r>
-      <w:proofErr w:type="spellEnd"/>
+        <w:t>Gradio: Hassle-free sharing and testing of ML models in the wild</w:t>
+      </w:r>
+      <w:r>
+        <w:rPr>
+          <w:lang w:val="en-US"/>
+        </w:rPr>
+        <w:t xml:space="preserve"> [Preprint]. arXiv. https://doi.org/10.48550/arXiv.1906.02569</w:t>
+      </w:r>
+    </w:p>
+    <w:p>
+      <w:pPr>
+        <w:spacing w:after="120"/>
+        <w:ind w:left="720" w:hanging="720"/>
+        <w:rPr>
+          <w:lang w:val="en-US"/>
+        </w:rPr>
+      </w:pPr>
+      <w:r>
+        <w:rPr>
+          <w:lang w:val="en-US"/>
+        </w:rPr>
+        <w:t xml:space="preserve">Conneau, A., Lample, G., Ranzato, M., Denoyer, L., &amp; Jégou, H. (2018). Word translation without parallel data. En </w:t>
+      </w:r>
       <w:r>
         <w:rPr>
           <w:i/>
           <w:iCs/>
           <w:lang w:val="en-US"/>
         </w:rPr>
-        <w:t>: Hassle-free sharing and testing of ML models in the wild</w:t>
+        <w:t>International Conference on Learning Representations (ICLR 2018)</w:t>
       </w:r>
       <w:r>
         <w:rPr>
           <w:lang w:val="en-US"/>
         </w:rPr>
-        <w:t xml:space="preserve"> [Preprint]. </w:t>
-      </w:r>
-      <w:proofErr w:type="spellStart"/>
-      <w:r>
-        <w:rPr>
-          <w:lang w:val="en-US"/>
-        </w:rPr>
-        <w:t>arXiv</w:t>
-      </w:r>
-      <w:proofErr w:type="spellEnd"/>
-      <w:r>
-        <w:rPr>
-          <w:lang w:val="en-US"/>
-        </w:rPr>
-        <w:t>. https://doi.org/10.48550/arXiv.1906.02569</w:t>
+        <w:t>. https://arxiv.org/abs/1710.04087</w:t>
       </w:r>
     </w:p>
     <w:p>
       <w:pPr>
         <w:spacing w:after="120"/>
         <w:ind w:left="720" w:hanging="720"/>
+      </w:pPr>
+      <w:r>
+        <w:t xml:space="preserve">Genius. (s.f.). </w:t>
+      </w:r>
+      <w:r>
+        <w:rPr>
+          <w:i/>
+          <w:iCs/>
+        </w:rPr>
+        <w:t>Genius API documentation</w:t>
+      </w:r>
+      <w:r>
+        <w:t xml:space="preserve">. Recuperado el 2 de septiembre de 2026, de https://docs.genius.com/</w:t>
+      </w:r>
+    </w:p>
+    <w:p>
+      <w:pPr>
+        <w:spacing w:after="120"/>
+        <w:ind w:left="720" w:hanging="720"/>
+      </w:pPr>
+      <w:r>
         <w:rPr>
           <w:lang w:val="en-US"/>
         </w:rPr>
-      </w:pPr>
-      <w:proofErr w:type="spellStart"/>
-      <w:r>
-        <w:rPr>
-          <w:lang w:val="en-US"/>
-        </w:rPr>
-        <w:t>Conneau</w:t>
-      </w:r>
-      <w:proofErr w:type="spellEnd"/>
-      <w:r>
-        <w:rPr>
-          <w:lang w:val="en-US"/>
-        </w:rPr>
-        <w:t xml:space="preserve">, A., Lample, G., </w:t>
-      </w:r>
-      <w:proofErr w:type="spellStart"/>
-      <w:r>
-        <w:rPr>
-          <w:lang w:val="en-US"/>
-        </w:rPr>
-        <w:t>Ranzato</w:t>
-      </w:r>
-      <w:proofErr w:type="spellEnd"/>
-      <w:r>
-        <w:rPr>
-          <w:lang w:val="en-US"/>
-        </w:rPr>
-        <w:t xml:space="preserve">, M., Denoyer, L., &amp; Jégou, H. (2018). Word translation without parallel data. En </w:t>
+        <w:t xml:space="preserve">Google. (s.f.). </w:t>
       </w:r>
       <w:r>
         <w:rPr>
@@ -9211,13 +11262,16 @@
           <w:iCs/>
           <w:lang w:val="en-US"/>
         </w:rPr>
-        <w:t>International Conference on Learning Representations (ICLR 2018)</w:t>
+        <w:t>Google Books APIs</w:t>
       </w:r>
       <w:r>
         <w:rPr>
           <w:lang w:val="en-US"/>
         </w:rPr>
-        <w:t>. https://arxiv.org/abs/1710.04087</w:t>
+        <w:t xml:space="preserve">. </w:t>
+      </w:r>
+      <w:r>
+        <w:t xml:space="preserve">Recuperado el 2 de septiembre de 2026, de https://developers.google.com/books</w:t>
       </w:r>
     </w:p>
     <w:p>
@@ -9226,55 +11280,10 @@
         <w:ind w:left="720" w:hanging="720"/>
       </w:pPr>
       <w:r>
-        <w:t xml:space="preserve">Genius. (s.f.). </w:t>
-      </w:r>
-      <w:r>
-        <w:rPr>
-          <w:i/>
-          <w:iCs/>
-        </w:rPr>
-        <w:t>Genius API documentation</w:t>
-      </w:r>
-      <w:r>
-        <w:t xml:space="preserve">. Recuperado el </w:t>
-      </w:r>
-      <w:r>
-        <w:t>2</w:t>
-      </w:r>
-      <w:r>
-        <w:t xml:space="preserve"> de </w:t>
-      </w:r>
-      <w:r>
-        <w:t xml:space="preserve">septiembre </w:t>
-      </w:r>
-      <w:r>
-        <w:t>de 2026, de https://docs.genius.com/</w:t>
-      </w:r>
-    </w:p>
-    <w:p>
-      <w:pPr>
-        <w:spacing w:after="120"/>
-        <w:ind w:left="720" w:hanging="720"/>
-      </w:pPr>
-      <w:r>
         <w:rPr>
           <w:lang w:val="en-US"/>
         </w:rPr>
-        <w:t>Google. (</w:t>
-      </w:r>
-      <w:proofErr w:type="spellStart"/>
-      <w:r>
-        <w:rPr>
-          <w:lang w:val="en-US"/>
-        </w:rPr>
-        <w:t>s.f.</w:t>
-      </w:r>
-      <w:proofErr w:type="spellEnd"/>
-      <w:r>
-        <w:rPr>
-          <w:lang w:val="en-US"/>
-        </w:rPr>
-        <w:t xml:space="preserve">). </w:t>
+        <w:t xml:space="preserve">Groq. (s.f.). </w:t>
       </w:r>
       <w:r>
         <w:rPr>
@@ -9282,7 +11291,7 @@
           <w:iCs/>
           <w:lang w:val="en-US"/>
         </w:rPr>
-        <w:t>Google Books APIs</w:t>
+        <w:t xml:space="preserve">GroqCloud documentation</w:t>
       </w:r>
       <w:r>
         <w:rPr>
@@ -9291,19 +11300,7 @@
         <w:t xml:space="preserve">. </w:t>
       </w:r>
       <w:r>
-        <w:t xml:space="preserve">Recuperado el </w:t>
-      </w:r>
-      <w:r>
-        <w:t>2</w:t>
-      </w:r>
-      <w:r>
-        <w:t xml:space="preserve"> de </w:t>
-      </w:r>
-      <w:r>
-        <w:t xml:space="preserve">septiembre </w:t>
-      </w:r>
-      <w:r>
-        <w:t>de 2026, de https://developers.google.com/books</w:t>
+        <w:t xml:space="preserve">Recuperado el 2 de septiembre de 2026, de https://console.groq.com/docs</w:t>
       </w:r>
     </w:p>
     <w:p>
@@ -9311,66 +11308,60 @@
         <w:spacing w:after="120"/>
         <w:ind w:left="720" w:hanging="720"/>
       </w:pPr>
-      <w:proofErr w:type="spellStart"/>
       <w:r>
         <w:rPr>
           <w:lang w:val="en-US"/>
         </w:rPr>
-        <w:t>Groq</w:t>
-      </w:r>
-      <w:proofErr w:type="spellEnd"/>
-      <w:r>
-        <w:rPr>
-          <w:lang w:val="en-US"/>
-        </w:rPr>
-        <w:t>. (</w:t>
-      </w:r>
-      <w:proofErr w:type="spellStart"/>
-      <w:r>
-        <w:rPr>
-          <w:lang w:val="en-US"/>
-        </w:rPr>
-        <w:t>s.f.</w:t>
-      </w:r>
-      <w:proofErr w:type="spellEnd"/>
-      <w:r>
-        <w:rPr>
-          <w:lang w:val="en-US"/>
-        </w:rPr>
-        <w:t xml:space="preserve">). </w:t>
-      </w:r>
-      <w:proofErr w:type="spellStart"/>
+        <w:t xml:space="preserve">Internet Archive. (s.f.). </w:t>
+      </w:r>
       <w:r>
         <w:rPr>
           <w:i/>
           <w:iCs/>
           <w:lang w:val="en-US"/>
         </w:rPr>
-        <w:t>GroqCloud</w:t>
-      </w:r>
-      <w:proofErr w:type="spellEnd"/>
+        <w:t>Open Library developer APIs</w:t>
+      </w:r>
+      <w:r>
+        <w:rPr>
+          <w:lang w:val="en-US"/>
+        </w:rPr>
+        <w:t xml:space="preserve">. </w:t>
+      </w:r>
+      <w:r>
+        <w:t xml:space="preserve">Recuperado el 2 de septiembre de 2026, de https://openlibrary.org/developers/api</w:t>
+      </w:r>
+    </w:p>
+    <w:p>
+      <w:pPr>
+        <w:spacing w:after="120"/>
+        <w:ind w:left="720" w:hanging="720"/>
+        <w:rPr>
+          <w:lang w:val="en-US"/>
+        </w:rPr>
+      </w:pPr>
+      <w:r>
+        <w:t xml:space="preserve">Lops, P., de Gemmis, M., &amp; Semeraro, G. (2011). </w:t>
+      </w:r>
+      <w:r>
+        <w:rPr>
+          <w:lang w:val="en-US"/>
+        </w:rPr>
+        <w:t xml:space="preserve">Content-based recommender systems: State of the art and trends. En F. Ricci, L. Rokach, B. Shapira, &amp; P. B. Kantor (Eds.), </w:t>
+      </w:r>
       <w:r>
         <w:rPr>
           <w:i/>
           <w:iCs/>
           <w:lang w:val="en-US"/>
         </w:rPr>
-        <w:t xml:space="preserve"> documentation</w:t>
+        <w:t>Recommender systems handbook</w:t>
       </w:r>
       <w:r>
         <w:rPr>
           <w:lang w:val="en-US"/>
         </w:rPr>
-        <w:t xml:space="preserve">. </w:t>
-      </w:r>
-      <w:r>
-        <w:t xml:space="preserve">Recuperado el 2 de </w:t>
-      </w:r>
-      <w:r>
-        <w:t>septiembre</w:t>
-      </w:r>
-      <w:r>
-        <w:t xml:space="preserve"> de 2026, de https://console.groq.com/docs</w:t>
+        <w:t xml:space="preserve"> (pp. 73–105). Springer. https://doi.org/10.1007/978-0-387-85820-3_3</w:t>
       </w:r>
     </w:p>
     <w:p>
@@ -9382,21 +11373,7 @@
         <w:rPr>
           <w:lang w:val="en-US"/>
         </w:rPr>
-        <w:t>Internet Archive. (</w:t>
-      </w:r>
-      <w:proofErr w:type="spellStart"/>
-      <w:r>
-        <w:rPr>
-          <w:lang w:val="en-US"/>
-        </w:rPr>
-        <w:t>s.f.</w:t>
-      </w:r>
-      <w:proofErr w:type="spellEnd"/>
-      <w:r>
-        <w:rPr>
-          <w:lang w:val="en-US"/>
-        </w:rPr>
-        <w:t xml:space="preserve">). </w:t>
+        <w:t xml:space="preserve">MetaBrainz Foundation. (s.f.). </w:t>
       </w:r>
       <w:r>
         <w:rPr>
@@ -9404,7 +11381,7 @@
           <w:iCs/>
           <w:lang w:val="en-US"/>
         </w:rPr>
-        <w:t>Open Library developer APIs</w:t>
+        <w:t xml:space="preserve">MusicBrainz API</w:t>
       </w:r>
       <w:r>
         <w:rPr>
@@ -9413,31 +11390,19 @@
         <w:t xml:space="preserve">. </w:t>
       </w:r>
       <w:r>
-        <w:t xml:space="preserve">Recuperado el 2 de </w:t>
-      </w:r>
-      <w:r>
-        <w:t>septiembre</w:t>
-      </w:r>
-      <w:r>
-        <w:t xml:space="preserve"> de 2026, de https://openlibrary.org/developers/api</w:t>
+        <w:t xml:space="preserve">Recuperado el 5 de septiembre de 2026, de https://musicbrainz.org/doc/MusicBrainz_API</w:t>
       </w:r>
     </w:p>
     <w:p>
       <w:pPr>
         <w:spacing w:after="120"/>
         <w:ind w:left="720" w:hanging="720"/>
+      </w:pPr>
+      <w:r>
         <w:rPr>
           <w:lang w:val="en-US"/>
         </w:rPr>
-      </w:pPr>
-      <w:r>
-        <w:t xml:space="preserve">Lops, P., de Gemmis, M., &amp; Semeraro, G. (2011). </w:t>
-      </w:r>
-      <w:r>
-        <w:rPr>
-          <w:lang w:val="en-US"/>
-        </w:rPr>
-        <w:t xml:space="preserve">Content-based recommender systems: State of the art and trends. En F. Ricci, L. Rokach, B. Shapira, &amp; P. B. Kantor (Eds.), </w:t>
+        <w:t xml:space="preserve">OpenAI. (s.f.). </w:t>
       </w:r>
       <w:r>
         <w:rPr>
@@ -9445,112 +11410,92 @@
           <w:iCs/>
           <w:lang w:val="en-US"/>
         </w:rPr>
-        <w:t>Recommender systems handbook</w:t>
+        <w:t>API reference</w:t>
       </w:r>
       <w:r>
         <w:rPr>
           <w:lang w:val="en-US"/>
         </w:rPr>
-        <w:t xml:space="preserve"> (pp. 73–105). Springer. https://doi.org/10.1007/978-0-387-85820-3_3</w:t>
+        <w:t xml:space="preserve">. </w:t>
+      </w:r>
+      <w:r>
+        <w:t xml:space="preserve">Recuperado el 5 de septiembre de 2026, de https://platform.openai.com/docs/api-reference</w:t>
       </w:r>
     </w:p>
     <w:p>
       <w:pPr>
         <w:spacing w:after="120"/>
         <w:ind w:left="720" w:hanging="720"/>
-      </w:pPr>
-      <w:proofErr w:type="spellStart"/>
-      <w:r>
         <w:rPr>
           <w:lang w:val="en-US"/>
         </w:rPr>
-        <w:t>MetaBrainz</w:t>
-      </w:r>
-      <w:proofErr w:type="spellEnd"/>
+      </w:pPr>
       <w:r>
         <w:rPr>
           <w:lang w:val="en-US"/>
         </w:rPr>
-        <w:t xml:space="preserve"> Foundation. (</w:t>
-      </w:r>
-      <w:proofErr w:type="spellStart"/>
-      <w:r>
-        <w:rPr>
-          <w:lang w:val="en-US"/>
-        </w:rPr>
-        <w:t>s.f.</w:t>
-      </w:r>
-      <w:proofErr w:type="spellEnd"/>
-      <w:r>
-        <w:rPr>
-          <w:lang w:val="en-US"/>
-        </w:rPr>
-        <w:t xml:space="preserve">). </w:t>
-      </w:r>
-      <w:proofErr w:type="spellStart"/>
+        <w:t xml:space="preserve">Pedregosa, F., Varoquaux, G., Gramfort, A., Michel, V., Thirion, B., Grisel, O., Blondel, M., Prettenhofer, P., Weiss, R., Dubourg, V., Vanderplas, J., Passos, A., Cournapeau, D., Brucher, M., Perrot, M., &amp; Duchesnay, É. (2011). Scikit-learn: Machine learning in Python. </w:t>
+      </w:r>
       <w:r>
         <w:rPr>
           <w:i/>
           <w:iCs/>
           <w:lang w:val="en-US"/>
         </w:rPr>
-        <w:t>MusicBrainz</w:t>
-      </w:r>
-      <w:proofErr w:type="spellEnd"/>
+        <w:t>Journal of Machine Learning Research, 12</w:t>
+      </w:r>
+      <w:r>
+        <w:rPr>
+          <w:lang w:val="en-US"/>
+        </w:rPr>
+        <w:t>, 2825–2830.</w:t>
+      </w:r>
+    </w:p>
+    <w:p>
+      <w:pPr>
+        <w:spacing w:after="120"/>
+        <w:ind w:left="720" w:hanging="720"/>
+        <w:rPr>
+          <w:lang w:val="en-US"/>
+        </w:rPr>
+      </w:pPr>
+      <w:r>
+        <w:t xml:space="preserve">Radovanović, M., Nanopoulos, A., &amp; Ivanović, M. (2010). </w:t>
+      </w:r>
+      <w:r>
+        <w:rPr>
+          <w:lang w:val="en-US"/>
+        </w:rPr>
+        <w:t xml:space="preserve">Hubs in space: Popular nearest neighbors in high-dimensional data. </w:t>
+      </w:r>
       <w:r>
         <w:rPr>
           <w:i/>
           <w:iCs/>
           <w:lang w:val="en-US"/>
         </w:rPr>
-        <w:t xml:space="preserve"> API</w:t>
+        <w:t>Journal of Machine Learning Research, 11</w:t>
       </w:r>
       <w:r>
         <w:rPr>
           <w:lang w:val="en-US"/>
         </w:rPr>
-        <w:t xml:space="preserve">. </w:t>
-      </w:r>
-      <w:r>
-        <w:t xml:space="preserve">Recuperado el </w:t>
-      </w:r>
-      <w:r>
-        <w:t>5</w:t>
-      </w:r>
-      <w:r>
-        <w:t xml:space="preserve"> de </w:t>
-      </w:r>
-      <w:r>
-        <w:t>septiembre</w:t>
-      </w:r>
-      <w:r>
-        <w:t xml:space="preserve"> de 2026, de https://musicbrainz.org/doc/MusicBrainz_API</w:t>
+        <w:t>, 2487–2531.</w:t>
       </w:r>
     </w:p>
     <w:p>
       <w:pPr>
         <w:spacing w:after="120"/>
         <w:ind w:left="720" w:hanging="720"/>
-      </w:pPr>
-      <w:r>
         <w:rPr>
           <w:lang w:val="en-US"/>
         </w:rPr>
-        <w:t>OpenAI. (</w:t>
-      </w:r>
-      <w:proofErr w:type="spellStart"/>
+      </w:pPr>
       <w:r>
         <w:rPr>
           <w:lang w:val="en-US"/>
         </w:rPr>
-        <w:t>s.f.</w:t>
-      </w:r>
-      <w:proofErr w:type="spellEnd"/>
-      <w:r>
-        <w:rPr>
-          <w:lang w:val="en-US"/>
-        </w:rPr>
-        <w:t xml:space="preserve">). </w:t>
+        <w:t xml:space="preserve">Reimers, N., &amp; Gurevych, I. (2019). Sentence-BERT: Sentence embeddings using Siamese BERT-networks. En </w:t>
       </w:r>
       <w:r>
         <w:rPr>
@@ -9558,28 +11503,13 @@
           <w:iCs/>
           <w:lang w:val="en-US"/>
         </w:rPr>
-        <w:t>API reference</w:t>
+        <w:t>Proceedings of the 2019 Conference on Empirical Methods in Natural Language Processing and the 9th International Joint Conference on Natural Language Processing (EMNLP-IJCNLP)</w:t>
       </w:r>
       <w:r>
         <w:rPr>
           <w:lang w:val="en-US"/>
         </w:rPr>
-        <w:t xml:space="preserve">. </w:t>
-      </w:r>
-      <w:r>
-        <w:t xml:space="preserve">Recuperado el </w:t>
-      </w:r>
-      <w:r>
-        <w:t>5</w:t>
-      </w:r>
-      <w:r>
-        <w:t xml:space="preserve"> de </w:t>
-      </w:r>
-      <w:r>
-        <w:t xml:space="preserve">septiembre </w:t>
-      </w:r>
-      <w:r>
-        <w:t>de 2026, de https://platform.openai.com/docs/api-reference</w:t>
+        <w:t xml:space="preserve"> (pp. 3982–3992). Association for Computational Linguistics. https://doi.org/10.18653/v1/D19-1410</w:t>
       </w:r>
     </w:p>
     <w:p>
@@ -9594,63 +11524,7 @@
         <w:rPr>
           <w:lang w:val="en-US"/>
         </w:rPr>
-        <w:t xml:space="preserve">Pedregosa, F., </w:t>
-      </w:r>
-      <w:proofErr w:type="spellStart"/>
-      <w:r>
-        <w:rPr>
-          <w:lang w:val="en-US"/>
-        </w:rPr>
-        <w:t>Varoquaux</w:t>
-      </w:r>
-      <w:proofErr w:type="spellEnd"/>
-      <w:r>
-        <w:rPr>
-          <w:lang w:val="en-US"/>
-        </w:rPr>
-        <w:t xml:space="preserve">, G., </w:t>
-      </w:r>
-      <w:proofErr w:type="spellStart"/>
-      <w:r>
-        <w:rPr>
-          <w:lang w:val="en-US"/>
-        </w:rPr>
-        <w:t>Gramfort</w:t>
-      </w:r>
-      <w:proofErr w:type="spellEnd"/>
-      <w:r>
-        <w:rPr>
-          <w:lang w:val="en-US"/>
-        </w:rPr>
-        <w:t xml:space="preserve">, A., Michel, V., Thirion, B., Grisel, O., Blondel, M., </w:t>
-      </w:r>
-      <w:proofErr w:type="spellStart"/>
-      <w:r>
-        <w:rPr>
-          <w:lang w:val="en-US"/>
-        </w:rPr>
-        <w:t>Prettenhofer</w:t>
-      </w:r>
-      <w:proofErr w:type="spellEnd"/>
-      <w:r>
-        <w:rPr>
-          <w:lang w:val="en-US"/>
-        </w:rPr>
-        <w:t xml:space="preserve">, P., Weiss, R., Dubourg, V., Vanderplas, J., Passos, A., </w:t>
-      </w:r>
-      <w:proofErr w:type="spellStart"/>
-      <w:r>
-        <w:rPr>
-          <w:lang w:val="en-US"/>
-        </w:rPr>
-        <w:t>Cournapeau</w:t>
-      </w:r>
-      <w:proofErr w:type="spellEnd"/>
-      <w:r>
-        <w:rPr>
-          <w:lang w:val="en-US"/>
-        </w:rPr>
-        <w:t xml:space="preserve">, D., Brucher, M., Perrot, M., &amp; Duchesnay, É. (2011). Scikit-learn: Machine learning in Python. </w:t>
+        <w:t xml:space="preserve">Reimers, N., &amp; Gurevych, I. (2020). Making monolingual sentence embeddings multilingual using knowledge distillation. En </w:t>
       </w:r>
       <w:r>
         <w:rPr>
@@ -9658,13 +11532,13 @@
           <w:iCs/>
           <w:lang w:val="en-US"/>
         </w:rPr>
-        <w:t>Journal of Machine Learning Research, 12</w:t>
+        <w:t>Proceedings of the 2020 Conference on Empirical Methods in Natural Language Processing (EMNLP)</w:t>
       </w:r>
       <w:r>
         <w:rPr>
           <w:lang w:val="en-US"/>
         </w:rPr>
-        <w:t>, 2825–2830.</w:t>
+        <w:t xml:space="preserve"> (pp. 4512–4525). Association for Computational Linguistics. https://doi.org/10.18653/v1/2020.emnlp-main.365</w:t>
       </w:r>
     </w:p>
     <w:p>
@@ -9676,13 +11550,10 @@
         </w:rPr>
       </w:pPr>
       <w:r>
-        <w:t xml:space="preserve">Radovanović, M., Nanopoulos, A., &amp; Ivanović, M. (2010). </w:t>
-      </w:r>
-      <w:r>
         <w:rPr>
           <w:lang w:val="en-US"/>
         </w:rPr>
-        <w:t xml:space="preserve">Hubs in space: Popular nearest neighbors in high-dimensional data. </w:t>
+        <w:t xml:space="preserve">Salton, G., &amp; Buckley, C. (1988). Term-weighting approaches in automatic text retrieval. </w:t>
       </w:r>
       <w:r>
         <w:rPr>
@@ -9690,42 +11561,26 @@
           <w:iCs/>
           <w:lang w:val="en-US"/>
         </w:rPr>
-        <w:t>Journal of Machine Learning Research, 11</w:t>
+        <w:t>Information Processing &amp; Management, 24</w:t>
       </w:r>
       <w:r>
         <w:rPr>
           <w:lang w:val="en-US"/>
         </w:rPr>
-        <w:t>, 2487–2531.</w:t>
+        <w:t>(5), 513–523. https://doi.org/10.1016/0306-4573(88)90021-0</w:t>
       </w:r>
     </w:p>
     <w:p>
       <w:pPr>
         <w:spacing w:after="120"/>
         <w:ind w:left="720" w:hanging="720"/>
+      </w:pPr>
+      <w:r>
         <w:rPr>
           <w:lang w:val="en-US"/>
         </w:rPr>
-      </w:pPr>
-      <w:r>
-        <w:rPr>
-          <w:lang w:val="en-US"/>
-        </w:rPr>
-        <w:t xml:space="preserve">Reimers, N., &amp; </w:t>
-      </w:r>
-      <w:proofErr w:type="spellStart"/>
-      <w:r>
-        <w:rPr>
-          <w:lang w:val="en-US"/>
-        </w:rPr>
-        <w:t>Gurevych</w:t>
-      </w:r>
-      <w:proofErr w:type="spellEnd"/>
-      <w:r>
-        <w:rPr>
-          <w:lang w:val="en-US"/>
-        </w:rPr>
-        <w:t xml:space="preserve">, I. (2019). Sentence-BERT: Sentence embeddings using Siamese BERT-networks. En </w:t>
+        <w:lastRenderedPageBreak/>
+        <w:t xml:space="preserve">Spotify. (s.f.). </w:t>
       </w:r>
       <w:r>
         <w:rPr>
@@ -9733,13 +11588,16 @@
           <w:iCs/>
           <w:lang w:val="en-US"/>
         </w:rPr>
-        <w:t>Proceedings of the 2019 Conference on Empirical Methods in Natural Language Processing and the 9th International Joint Conference on Natural Language Processing (EMNLP-IJCNLP)</w:t>
+        <w:t xml:space="preserve">oEmbed API</w:t>
       </w:r>
       <w:r>
         <w:rPr>
           <w:lang w:val="en-US"/>
         </w:rPr>
-        <w:t xml:space="preserve"> (pp. 3982–3992). Association for Computational Linguistics. https://doi.org/10.18653/v1/D19-1410</w:t>
+        <w:t xml:space="preserve">. </w:t>
+      </w:r>
+      <w:r>
+        <w:t xml:space="preserve">Spotify for Developers. Recuperado el 2 de octubre de 2026, de https://developer.spotify.com/documentation/embeds/reference/oembed</w:t>
       </w:r>
     </w:p>
     <w:p>
@@ -9754,21 +11612,7 @@
         <w:rPr>
           <w:lang w:val="en-US"/>
         </w:rPr>
-        <w:t xml:space="preserve">Reimers, N., &amp; </w:t>
-      </w:r>
-      <w:proofErr w:type="spellStart"/>
-      <w:r>
-        <w:rPr>
-          <w:lang w:val="en-US"/>
-        </w:rPr>
-        <w:t>Gurevych</w:t>
-      </w:r>
-      <w:proofErr w:type="spellEnd"/>
-      <w:r>
-        <w:rPr>
-          <w:lang w:val="en-US"/>
-        </w:rPr>
-        <w:t xml:space="preserve">, I. (2020). Making monolingual sentence embeddings multilingual using knowledge distillation. En </w:t>
+        <w:t xml:space="preserve">Voorhees, E. M. (1999). The TREC-8 question answering track report. En </w:t>
       </w:r>
       <w:r>
         <w:rPr>
@@ -9776,13 +11620,13 @@
           <w:iCs/>
           <w:lang w:val="en-US"/>
         </w:rPr>
-        <w:t>Proceedings of the 2020 Conference on Empirical Methods in Natural Language Processing (EMNLP)</w:t>
+        <w:t xml:space="preserve">Proceedings of the Eighth Text REtrieval Conference (TREC-8)</w:t>
       </w:r>
       <w:r>
         <w:rPr>
           <w:lang w:val="en-US"/>
         </w:rPr>
-        <w:t xml:space="preserve"> (pp. 4512–4525). Association for Computational Linguistics. https://doi.org/10.18653/v1/2020.emnlp-main.365</w:t>
+        <w:t xml:space="preserve"> (NIST Special Publication 500-246). National Institute of Standards and Technology. https://www.nist.gov/publications/trec-8-question-answering-track-report</w:t>
       </w:r>
     </w:p>
     <w:p>
@@ -9797,181 +11641,7 @@
         <w:rPr>
           <w:lang w:val="en-US"/>
         </w:rPr>
-        <w:t xml:space="preserve">Salton, G., &amp; Buckley, C. (1988). Term-weighting approaches in automatic text retrieval. </w:t>
-      </w:r>
-      <w:r>
-        <w:rPr>
-          <w:i/>
-          <w:iCs/>
-          <w:lang w:val="en-US"/>
-        </w:rPr>
-        <w:t>Information Processing &amp; Management, 24</w:t>
-      </w:r>
-      <w:r>
-        <w:rPr>
-          <w:lang w:val="en-US"/>
-        </w:rPr>
-        <w:t>(5), 513–523. https://doi.org/10.1016/0306-4573(88)90021-0</w:t>
-      </w:r>
-    </w:p>
-    <w:p>
-      <w:pPr>
-        <w:spacing w:after="120"/>
-        <w:ind w:left="720" w:hanging="720"/>
-      </w:pPr>
-      <w:r>
-        <w:rPr>
-          <w:lang w:val="en-US"/>
-        </w:rPr>
-        <w:lastRenderedPageBreak/>
-        <w:t>Spotify. (</w:t>
-      </w:r>
-      <w:proofErr w:type="spellStart"/>
-      <w:r>
-        <w:rPr>
-          <w:lang w:val="en-US"/>
-        </w:rPr>
-        <w:t>s.f.</w:t>
-      </w:r>
-      <w:proofErr w:type="spellEnd"/>
-      <w:r>
-        <w:rPr>
-          <w:lang w:val="en-US"/>
-        </w:rPr>
-        <w:t xml:space="preserve">). </w:t>
-      </w:r>
-      <w:proofErr w:type="spellStart"/>
-      <w:r>
-        <w:rPr>
-          <w:i/>
-          <w:iCs/>
-          <w:lang w:val="en-US"/>
-        </w:rPr>
-        <w:t>oEmbed</w:t>
-      </w:r>
-      <w:proofErr w:type="spellEnd"/>
-      <w:r>
-        <w:rPr>
-          <w:i/>
-          <w:iCs/>
-          <w:lang w:val="en-US"/>
-        </w:rPr>
-        <w:t xml:space="preserve"> API</w:t>
-      </w:r>
-      <w:r>
-        <w:rPr>
-          <w:lang w:val="en-US"/>
-        </w:rPr>
-        <w:t xml:space="preserve">. </w:t>
-      </w:r>
-      <w:r>
-        <w:t xml:space="preserve">Spotify </w:t>
-      </w:r>
-      <w:proofErr w:type="spellStart"/>
-      <w:r>
-        <w:t>for</w:t>
-      </w:r>
-      <w:proofErr w:type="spellEnd"/>
-      <w:r>
-        <w:t xml:space="preserve"> </w:t>
-      </w:r>
-      <w:proofErr w:type="spellStart"/>
-      <w:r>
-        <w:t>Developers</w:t>
-      </w:r>
-      <w:proofErr w:type="spellEnd"/>
-      <w:r>
-        <w:t>. Recuperado el 2 de octubre de 2026, de https://developer.spotify.com/documentation/embeds/reference/oembed</w:t>
-      </w:r>
-    </w:p>
-    <w:p>
-      <w:pPr>
-        <w:spacing w:after="120"/>
-        <w:ind w:left="720" w:hanging="720"/>
-        <w:rPr>
-          <w:lang w:val="en-US"/>
-        </w:rPr>
-      </w:pPr>
-      <w:r>
-        <w:rPr>
-          <w:lang w:val="en-US"/>
-        </w:rPr>
-        <w:t>Voorhees, E. M. (1999). The TREC-</w:t>
-      </w:r>
-      <w:proofErr w:type="gramStart"/>
-      <w:r>
-        <w:rPr>
-          <w:lang w:val="en-US"/>
-        </w:rPr>
-        <w:t>8 question</w:t>
-      </w:r>
-      <w:proofErr w:type="gramEnd"/>
-      <w:r>
-        <w:rPr>
-          <w:lang w:val="en-US"/>
-        </w:rPr>
-        <w:t xml:space="preserve"> answering track report. En </w:t>
-      </w:r>
-      <w:r>
-        <w:rPr>
-          <w:i/>
-          <w:iCs/>
-          <w:lang w:val="en-US"/>
-        </w:rPr>
-        <w:t xml:space="preserve">Proceedings of the Eighth Text </w:t>
-      </w:r>
-      <w:proofErr w:type="spellStart"/>
-      <w:r>
-        <w:rPr>
-          <w:i/>
-          <w:iCs/>
-          <w:lang w:val="en-US"/>
-        </w:rPr>
-        <w:t>REtrieval</w:t>
-      </w:r>
-      <w:proofErr w:type="spellEnd"/>
-      <w:r>
-        <w:rPr>
-          <w:i/>
-          <w:iCs/>
-          <w:lang w:val="en-US"/>
-        </w:rPr>
-        <w:t xml:space="preserve"> Conference (TREC-8)</w:t>
-      </w:r>
-      <w:r>
-        <w:rPr>
-          <w:lang w:val="en-US"/>
-        </w:rPr>
-        <w:t xml:space="preserve"> (NIST Special Publication 500-246). National Institute of Standards and Technology. https://www.nist.gov/publications/trec-8-question-answering-track-report</w:t>
-      </w:r>
-    </w:p>
-    <w:p>
-      <w:pPr>
-        <w:spacing w:after="120"/>
-        <w:ind w:left="720" w:hanging="720"/>
-        <w:rPr>
-          <w:lang w:val="en-US"/>
-        </w:rPr>
-      </w:pPr>
-      <w:r>
-        <w:rPr>
-          <w:lang w:val="en-US"/>
-        </w:rPr>
-        <w:t xml:space="preserve">Wang, W., Wei, F., Dong, L., Bao, H., Yang, N., &amp; Zhou, M. (2020). </w:t>
-      </w:r>
-      <w:proofErr w:type="spellStart"/>
-      <w:r>
-        <w:rPr>
-          <w:lang w:val="en-US"/>
-        </w:rPr>
-        <w:t>MiniLM</w:t>
-      </w:r>
-      <w:proofErr w:type="spellEnd"/>
-      <w:r>
-        <w:rPr>
-          <w:lang w:val="en-US"/>
-        </w:rPr>
-        <w:t xml:space="preserve">: Deep self-attention distillation for task-agnostic compression of pre-trained transformers. En </w:t>
+        <w:t xml:space="preserve">Wang, W., Wei, F., Dong, L., Bao, H., Yang, N., &amp; Zhou, M. (2020). MiniLM: Deep self-attention distillation for task-agnostic compression of pre-trained transformers. En </w:t>
       </w:r>
       <w:r>
         <w:rPr>
@@ -10136,20 +11806,8 @@
                 <w:sz w:val="20"/>
                 <w:szCs w:val="20"/>
               </w:rPr>
-              <w:t>inkriff_pilot_</w:t>
-            </w:r>
-            <w:proofErr w:type="gramStart"/>
-            <w:r>
-              <w:rPr>
-                <w:b/>
-                <w:bCs/>
-                <w:color w:val="000000"/>
-                <w:sz w:val="20"/>
-                <w:szCs w:val="20"/>
-              </w:rPr>
-              <w:t>extraccion.ipynb</w:t>
-            </w:r>
-            <w:proofErr w:type="gramEnd"/>
+              <w:t>inkriff_pilot_extraccion.ipynb</w:t>
+            </w:r>
           </w:p>
         </w:tc>
         <w:tc>
@@ -10204,20 +11862,8 @@
                 <w:sz w:val="20"/>
                 <w:szCs w:val="20"/>
               </w:rPr>
-              <w:t>inkriff_extraccion_</w:t>
-            </w:r>
-            <w:proofErr w:type="gramStart"/>
-            <w:r>
-              <w:rPr>
-                <w:b/>
-                <w:bCs/>
-                <w:color w:val="000000"/>
-                <w:sz w:val="20"/>
-                <w:szCs w:val="20"/>
-              </w:rPr>
-              <w:t>completa.ipynb</w:t>
-            </w:r>
-            <w:proofErr w:type="gramEnd"/>
+              <w:t>inkriff_extraccion_completa.ipynb</w:t>
+            </w:r>
           </w:p>
         </w:tc>
         <w:tc>
@@ -10272,20 +11918,8 @@
                 <w:sz w:val="20"/>
                 <w:szCs w:val="20"/>
               </w:rPr>
-              <w:t>inkriff_eda_</w:t>
-            </w:r>
-            <w:proofErr w:type="gramStart"/>
-            <w:r>
-              <w:rPr>
-                <w:b/>
-                <w:bCs/>
-                <w:color w:val="000000"/>
-                <w:sz w:val="20"/>
-                <w:szCs w:val="20"/>
-              </w:rPr>
-              <w:t>ingenieria.ipynb</w:t>
-            </w:r>
-            <w:proofErr w:type="gramEnd"/>
+              <w:t>inkriff_eda_ingenieria.ipynb</w:t>
+            </w:r>
           </w:p>
         </w:tc>
         <w:tc>
@@ -10340,20 +11974,8 @@
                 <w:sz w:val="20"/>
                 <w:szCs w:val="20"/>
               </w:rPr>
-              <w:t>inkriff_modelado_</w:t>
-            </w:r>
-            <w:proofErr w:type="gramStart"/>
-            <w:r>
-              <w:rPr>
-                <w:b/>
-                <w:bCs/>
-                <w:color w:val="000000"/>
-                <w:sz w:val="20"/>
-                <w:szCs w:val="20"/>
-              </w:rPr>
-              <w:t>similitud.ipynb</w:t>
-            </w:r>
-            <w:proofErr w:type="gramEnd"/>
+              <w:t>inkriff_modelado_similitud.ipynb</w:t>
+            </w:r>
           </w:p>
         </w:tc>
         <w:tc>

</xml_diff>